<commit_message>
Revisión U03: direccionamiento IP corregido, lab dual stack, CEs alineados e informe de la sesión
</commit_message>
<xml_diff>
--- a/docx/03-direccionamiento-ip/03-direccionamiento-ip.docx
+++ b/docx/03-direccionamiento-ip/03-direccionamiento-ip.docx
@@ -1356,7 +1356,42 @@
               <w:pStyle w:val="Compact"/>
             </w:pPr>
             <w:r>
-              <w:t xml:space="preserve">✅ Puntos 8 y 12-13</w:t>
+              <w:t xml:space="preserve">✅ Puntos 8 y 12-13 + ⚡ Laboratorio (punto 18)</w:t>
+            </w:r>
+          </w:p>
+        </w:tc>
+      </w:tr>
+      <w:tr>
+        <w:tc>
+          <w:tcPr/>
+          <w:p>
+            <w:pPr>
+              <w:pStyle w:val="Compact"/>
+            </w:pPr>
+            <w:r>
+              <w:t xml:space="preserve">RA4·d)</w:t>
+            </w:r>
+          </w:p>
+        </w:tc>
+        <w:tc>
+          <w:tcPr/>
+          <w:p>
+            <w:pPr>
+              <w:pStyle w:val="Compact"/>
+            </w:pPr>
+            <w:r>
+              <w:t xml:space="preserve">Comandos de configuración</w:t>
+            </w:r>
+          </w:p>
+        </w:tc>
+        <w:tc>
+          <w:tcPr/>
+          <w:p>
+            <w:pPr>
+              <w:pStyle w:val="Compact"/>
+            </w:pPr>
+            <w:r>
+              <w:t xml:space="preserve">✅ Punto 16 (interfaces IPv6) + ⚡ Laboratorio (punto 18)</w:t>
             </w:r>
           </w:p>
         </w:tc>
@@ -3173,7 +3208,7 @@
         <w:rPr>
           <w:rStyle w:val="VerbatimChar"/>
         </w:rPr>
-        <w:t xml:space="preserve">Paquete de 4000 B  →  MTU del enlace = 1500 B</w:t>
+        <w:t xml:space="preserve">Paquete con 4000 B de payload  →  MTU del enlace = 1500 B</w:t>
       </w:r>
       <w:r>
         <w:br/>
@@ -3515,7 +3550,7 @@
           <wp:inline>
             <wp:extent cx="5334000" cy="3752681"/>
             <wp:effectExtent b="0" l="0" r="0" t="0"/>
-            <wp:docPr descr="Fragmentación de un paquete de 4000 B en tres fragmentos con MTU 1500" title="" id="45" name="Picture"/>
+            <wp:docPr descr="Fragmentación de un paquete con 4000 B de payload en tres fragmentos con MTU 1500" title="" id="45" name="Picture"/>
             <a:graphic>
               <a:graphicData uri="http://schemas.openxmlformats.org/drawingml/2006/picture">
                 <pic:pic>
@@ -3567,7 +3602,7 @@
         <w:pStyle w:val="ImageCaption"/>
       </w:pPr>
       <w:r>
-        <w:t xml:space="preserve">Fragmentación de un paquete de 4000 B en tres fragmentos con MTU 1500</w:t>
+        <w:t xml:space="preserve">Fragmentación de un paquete con 4000 B de payload en tres fragmentos con MTU 1500</w:t>
       </w:r>
     </w:p>
     <w:p>
@@ -4814,7 +4849,23 @@
         </w:numPr>
       </w:pPr>
       <w:r>
-        <w:t xml:space="preserve">Un paquete de 3000 B llega a un enlace con MTU 1500. ¿Cuántos fragmentos IPv4 salen como mínimo y qué bit indica al destino que aún faltan?</w:t>
+        <w:t xml:space="preserve">Un datagrama con</w:t>
+      </w:r>
+      <w:r>
+        <w:t xml:space="preserve"> </w:t>
+      </w:r>
+      <w:r>
+        <w:rPr>
+          <w:b/>
+          <w:bCs/>
+        </w:rPr>
+        <w:t xml:space="preserve">3000 B de payload</w:t>
+      </w:r>
+      <w:r>
+        <w:t xml:space="preserve"> </w:t>
+      </w:r>
+      <w:r>
+        <w:t xml:space="preserve">llega a un enlace con MTU 1500. ¿Cuántos fragmentos IPv4 salen como mínimo y qué bit indica al destino que aún faltan?</w:t>
       </w:r>
     </w:p>
     <w:p>
@@ -8088,7 +8139,7 @@
               <w:pStyle w:val="Compact"/>
             </w:pPr>
             <w:r>
-              <w:t xml:space="preserve">Grandes redes (16.777.216 hosts)</w:t>
+              <w:t xml:space="preserve">Grandes redes (16.777.214 hosts)</w:t>
             </w:r>
           </w:p>
         </w:tc>
@@ -8149,7 +8200,7 @@
               <w:pStyle w:val="Compact"/>
             </w:pPr>
             <w:r>
-              <w:t xml:space="preserve">Redes medianas (65K hosts)</w:t>
+              <w:t xml:space="preserve">Redes medianas (65.534 hosts)</w:t>
             </w:r>
           </w:p>
         </w:tc>
@@ -13310,7 +13361,7 @@
                 <w:b/>
                 <w:bCs/>
               </w:rPr>
-              <w:t xml:space="preserve">~16M</w:t>
+              <w:t xml:space="preserve">16.777.214</w:t>
             </w:r>
           </w:p>
         </w:tc>
@@ -15330,39 +15381,23 @@
         <w:t xml:space="preserve">“Necesito 4 subredes con 50 hosts cada una en 192.168.1.0/24”</w:t>
       </w:r>
       <w:r>
-        <w:t xml:space="preserve">. Meten la pregunta de</w:t>
-      </w:r>
-      <w:r>
-        <w:t xml:space="preserve"> </w:t>
-      </w:r>
-      <w:r>
-        <w:rPr>
-          <w:i/>
-          <w:iCs/>
-        </w:rPr>
-        <w:t xml:space="preserve">subredes iguales</w:t>
-      </w:r>
-      <w:r>
-        <w:t xml:space="preserve"> </w:t>
-      </w:r>
-      <w:r>
-        <w:t xml:space="preserve">cuando la respuesta correcta exige</w:t>
-      </w:r>
-      <w:r>
-        <w:t xml:space="preserve"> </w:t>
-      </w:r>
-      <w:r>
-        <w:rPr>
-          <w:b/>
-          <w:bCs/>
-        </w:rPr>
-        <w:t xml:space="preserve">VLSM</w:t>
-      </w:r>
-      <w:r>
-        <w:t xml:space="preserve"> </w:t>
-      </w:r>
-      <w:r>
-        <w:t xml:space="preserve">(el</w:t>
+        <w:t xml:space="preserve">. Ojo: aquí</w:t>
+      </w:r>
+      <w:r>
+        <w:t xml:space="preserve"> </w:t>
+      </w:r>
+      <w:r>
+        <w:rPr>
+          <w:b/>
+          <w:bCs/>
+        </w:rPr>
+        <w:t xml:space="preserve">no</w:t>
+      </w:r>
+      <w:r>
+        <w:t xml:space="preserve"> </w:t>
+      </w:r>
+      <w:r>
+        <w:t xml:space="preserve">hace falta VLSM — al ser subredes iguales, una /26 lo cumple de sobra (4 subredes de 62 hosts, y hasta te sobra una). La trampa real está en los tamaños distintos: si dijeran 200, 50 y 10 hosts, ahí cada subred pide su máscara y toca VLSM (el</w:t>
       </w:r>
       <w:r>
         <w:t xml:space="preserve"> </w:t>
@@ -15376,7 +15411,7 @@
         </w:r>
       </w:hyperlink>
       <w:r>
-        <w:t xml:space="preserve">). Fíjate bien: con /26 tienes 4 subredes de 62 hosts… y si pidieran tamaños distintos, /26 ya no vale.</w:t>
+        <w:t xml:space="preserve">).</w:t>
       </w:r>
     </w:p>
     <w:p>
@@ -18923,7 +18958,7 @@
           <w:i/>
           <w:iCs/>
         </w:rPr>
-        <w:t xml:space="preserve">Config → DHCP</w:t>
+        <w:t xml:space="preserve">Services → DHCP</w:t>
       </w:r>
       <w:r>
         <w:t xml:space="preserve">: seleccionas el servicio, defines la red, la IP por defecto (gateway), el DNS y el rango máximo de usuarios.</w:t>
@@ -21462,7 +21497,7 @@
         <w:pStyle w:val="BlockText"/>
       </w:pPr>
       <w:r>
-        <w:t xml:space="preserve">Escribir 32 caracteres hexadecimales es un coñazo, así que IPv6 define</w:t>
+        <w:t xml:space="preserve">Escribir los 32 caracteres hexadecimales completos es un rollo, así que IPv6 define</w:t>
       </w:r>
       <w:r>
         <w:t xml:space="preserve"> </w:t>
@@ -22066,19 +22101,13 @@
         <w:br/>
       </w:r>
       <w:r>
-        <w:rPr>
-          <w:rStyle w:val="VerbatimChar"/>
-        </w:rPr>
-        <w:t xml:space="preserve">         │         └──2 ceros──┘   la cadena más larga ya</w:t>
-      </w:r>
-      <w:r>
         <w:br/>
       </w:r>
       <w:r>
         <w:rPr>
           <w:rStyle w:val="VerbatimChar"/>
         </w:rPr>
-        <w:t xml:space="preserve">         │                          se llevó el :: (el par</w:t>
+        <w:t xml:space="preserve">  Hay dos cadenas de 2 ceros (empate): el :: se lleva la</w:t>
       </w:r>
       <w:r>
         <w:br/>
@@ -22087,7 +22116,16 @@
         <w:rPr>
           <w:rStyle w:val="VerbatimChar"/>
         </w:rPr>
-        <w:t xml:space="preserve">         └── cadena mayor ya usada   de ceros se queda '0:0')</w:t>
+        <w:t xml:space="preserve">  primera, y la segunda cadena queda escrita como 0:0.</w:t>
+      </w:r>
+      <w:r>
+        <w:br/>
+      </w:r>
+      <w:r>
+        <w:rPr>
+          <w:rStyle w:val="VerbatimChar"/>
+        </w:rPr>
+        <w:t xml:space="preserve">  Un segundo :: sería ilegal.</w:t>
       </w:r>
     </w:p>
     <w:bookmarkStart w:id="146" w:name="ejemplos-famosos"/>
@@ -24368,19 +24406,16 @@
         <w:t xml:space="preserve"> </w:t>
       </w:r>
       <w:r>
-        <w:t xml:space="preserve">una dirección Link-Local, la generes o no. Son los</w:t>
-      </w:r>
-      <w:r>
-        <w:t xml:space="preserve"> </w:t>
-      </w:r>
-      <w:r>
-        <w:t xml:space="preserve">“DNS”</w:t>
-      </w:r>
-      <w:r>
-        <w:t xml:space="preserve"> </w:t>
-      </w:r>
-      <w:r>
-        <w:t xml:space="preserve">internos: los routers las usan para NDP y SLAAC (un RA viene de</w:t>
+        <w:t xml:space="preserve">una dirección Link-Local, la generes o no. Son las direcciones</w:t>
+      </w:r>
+      <w:r>
+        <w:t xml:space="preserve"> </w:t>
+      </w:r>
+      <w:r>
+        <w:t xml:space="preserve">“de casa”</w:t>
+      </w:r>
+      <w:r>
+        <w:t xml:space="preserve">: los routers las usan para NDP y SLAAC (un RA viene de</w:t>
       </w:r>
       <w:r>
         <w:t xml:space="preserve"> </w:t>
@@ -26431,7 +26466,7 @@
           <w:b/>
           <w:bCs/>
         </w:rPr>
-        <w:t xml:space="preserve">la primera cifra del IID suele ser</w:t>
+        <w:t xml:space="preserve">el IID suele empezar por algo como</w:t>
       </w:r>
       <w:r>
         <w:rPr>
@@ -26793,7 +26828,7 @@
         <w:rPr>
           <w:rStyle w:val="VerbatimChar"/>
         </w:rPr>
-        <w:t xml:space="preserve">  IPv6 Address....: 2001:DB8:1:2:6dfa:79ff:fe5b:21c4  ← temporal (cambia)</w:t>
+        <w:t xml:space="preserve">  IPv6 Address....: 2001:DB8:1:2:6dfa:c41a:9b3e:7721 ← temporal (cambia)</w:t>
       </w:r>
       <w:r>
         <w:br/>
@@ -30877,7 +30912,7 @@
         <w:t xml:space="preserve">menos interrupciones</w:t>
       </w:r>
       <w:r>
-        <w:t xml:space="preserve">, menos CPU gastada, menos tráfico de fondo en redes grandes (los switches no inundan el grupo pretendido).</w:t>
+        <w:t xml:space="preserve">, menos CPU gastada, menos tráfico de fondo en redes grandes (las NICs solo despiertan para su grupo; y con MLD snooping, el switch ni siquiera reparte el multicast a puertos sin oyentes).</w:t>
       </w:r>
     </w:p>
     <w:p>
@@ -30921,7 +30956,7 @@
         <w:t xml:space="preserve"> </w:t>
       </w:r>
       <w:r>
-        <w:t xml:space="preserve">el multicast de IPv6 no es un lujo, es la razón de que redes con miles de equipos no se ahoguen en tráfico de descubrimiento. En el plano de redes es lo que hace escalable al</w:t>
+        <w:t xml:space="preserve">el multicast de IPv6 no es un lujo: es la razón de que redes con miles de equipos no se ahoguen en tráfico de descubrimiento. Siguiente parada: los mecanismos de</w:t>
       </w:r>
       <w:r>
         <w:t xml:space="preserve"> </w:t>
@@ -30931,7 +30966,7 @@
           <w:rPr>
             <w:rStyle w:val="Hyperlink"/>
           </w:rPr>
-          <w:t xml:space="preserve">punto de transición</w:t>
+          <w:t xml:space="preserve">transición</w:t>
         </w:r>
       </w:hyperlink>
       <w:r>
@@ -31614,7 +31649,7 @@
     </w:p>
     <w:bookmarkEnd w:id="192"/>
     <w:bookmarkEnd w:id="193"/>
-    <w:bookmarkStart w:id="201" w:name="mecanismos-de-transición"/>
+    <w:bookmarkStart w:id="202" w:name="mecanismos-de-transición"/>
     <w:p>
       <w:pPr>
         <w:pStyle w:val="Heading1"/>
@@ -31759,7 +31794,7 @@
       </w:r>
     </w:p>
     <w:bookmarkEnd w:id="194"/>
-    <w:bookmarkStart w:id="195" w:name="X2cba674a07035b2edd1988ff52869d9c7bbd986"/>
+    <w:bookmarkStart w:id="196" w:name="X2cba674a07035b2edd1988ff52869d9c7bbd986"/>
     <w:p>
       <w:pPr>
         <w:pStyle w:val="Heading2"/>
@@ -31979,7 +32014,7 @@
         <w:t xml:space="preserve"> </w:t>
       </w:r>
       <w:r>
-        <w:t xml:space="preserve">hay que configurar y mantener el doble (routing, DNS, firewalls); más overhead en el plano de control.</w:t>
+        <w:t xml:space="preserve">hay que configurar y mantener el doble (routing, DNS, firewalls); más sobrecarga en el plano de control.</w:t>
       </w:r>
     </w:p>
     <w:p>
@@ -32015,7 +32050,24 @@
         <w:t xml:space="preserve"> </w:t>
       </w:r>
       <w:r>
-        <w:t xml:space="preserve">es la respuesta que espera el entrevistador (lo verás en el cierre).</w:t>
+        <w:t xml:space="preserve">es la respuesta que espera el entrevistador (el</w:t>
+      </w:r>
+      <w:r>
+        <w:t xml:space="preserve"> </w:t>
+      </w:r>
+      <w:hyperlink r:id="rId195">
+        <w:r>
+          <w:rPr>
+            <w:rStyle w:val="Hyperlink"/>
+          </w:rPr>
+          <w:t xml:space="preserve">boletín avanzado de IPv6</w:t>
+        </w:r>
+      </w:hyperlink>
+      <w:r>
+        <w:t xml:space="preserve"> </w:t>
+      </w:r>
+      <w:r>
+        <w:t xml:space="preserve">te monta un diseño completo).</w:t>
       </w:r>
     </w:p>
     <w:p>
@@ -32025,8 +32077,8 @@
         </w:pict>
       </w:r>
     </w:p>
-    <w:bookmarkEnd w:id="195"/>
-    <w:bookmarkStart w:id="196" w:name="túneles-ipv6-dentro-de-ipv4"/>
+    <w:bookmarkEnd w:id="196"/>
+    <w:bookmarkStart w:id="197" w:name="túneles-ipv6-dentro-de-ipv4"/>
     <w:p>
       <w:pPr>
         <w:pStyle w:val="Heading2"/>
@@ -32355,7 +32407,7 @@
         <w:t xml:space="preserve"> </w:t>
       </w:r>
       <w:r>
-        <w:t xml:space="preserve">los túneles automáticos (6to4, Teredo) están de capa caída por problemas de seguridad y fiabilidad; hoy se prefiere Dual Stack o túneles GRE/manuales si no hay alternativa.</w:t>
+        <w:t xml:space="preserve">los túneles automáticos (6to4, Teredo) han caído en desuso por problemas de seguridad y fiabilidad; hoy se prefiere Dual Stack o túneles GRE/manuales si no hay alternativa.</w:t>
       </w:r>
     </w:p>
     <w:p>
@@ -32365,8 +32417,8 @@
         </w:pict>
       </w:r>
     </w:p>
-    <w:bookmarkEnd w:id="196"/>
-    <w:bookmarkStart w:id="197" w:name="nat64-dns64-el-puente-para-solo-ipv6"/>
+    <w:bookmarkEnd w:id="197"/>
+    <w:bookmarkStart w:id="198" w:name="nat64-dns64-el-puente-para-solo-ipv6"/>
     <w:p>
       <w:pPr>
         <w:pStyle w:val="Heading2"/>
@@ -32495,17 +32547,13 @@
         <w:t xml:space="preserve"> </w:t>
       </w:r>
       <w:r>
-        <w:rPr>
-          <w:i/>
-          <w:iCs/>
-        </w:rPr>
-        <w:t xml:space="preserve">NAT inverso</w:t>
-      </w:r>
-      <w:r>
-        <w:t xml:space="preserve"> </w:t>
-      </w:r>
-      <w:r>
-        <w:t xml:space="preserve">de la unidad de NAT.</w:t>
+        <w:t xml:space="preserve">“NAT”</w:t>
+      </w:r>
+      <w:r>
+        <w:t xml:space="preserve"> </w:t>
+      </w:r>
+      <w:r>
+        <w:t xml:space="preserve">de la transición: traduce entre familias de direcciones, no entre rangos privados y públicos (eso, a fondo, en la unidad de NAT).</w:t>
       </w:r>
     </w:p>
     <w:p>
@@ -32617,8 +32665,8 @@
         </w:pict>
       </w:r>
     </w:p>
-    <w:bookmarkEnd w:id="197"/>
-    <w:bookmarkStart w:id="198" w:name="mini-chequeo-14"/>
+    <w:bookmarkEnd w:id="198"/>
+    <w:bookmarkStart w:id="199" w:name="mini-chequeo-14"/>
     <w:p>
       <w:pPr>
         <w:pStyle w:val="Heading2"/>
@@ -32804,8 +32852,8 @@
         </w:pict>
       </w:r>
     </w:p>
-    <w:bookmarkEnd w:id="198"/>
-    <w:bookmarkStart w:id="199" w:name="resumen-en-3-frases-14"/>
+    <w:bookmarkEnd w:id="199"/>
+    <w:bookmarkStart w:id="200" w:name="resumen-en-3-frases-14"/>
     <w:p>
       <w:pPr>
         <w:pStyle w:val="Heading2"/>
@@ -32886,8 +32934,8 @@
         <w:t xml:space="preserve">permiten que una red solo-IPv6 acceda a servicios solo-IPv4 traduciendo el tráfico.</w:t>
       </w:r>
     </w:p>
-    <w:bookmarkEnd w:id="199"/>
-    <w:bookmarkStart w:id="200" w:name="vocabulario-rápido-14"/>
+    <w:bookmarkEnd w:id="200"/>
+    <w:bookmarkStart w:id="201" w:name="vocabulario-rápido-14"/>
     <w:p>
       <w:pPr>
         <w:pStyle w:val="Heading2"/>
@@ -33159,9 +33207,9 @@
         </w:r>
       </w:hyperlink>
     </w:p>
-    <w:bookmarkEnd w:id="200"/>
     <w:bookmarkEnd w:id="201"/>
-    <w:bookmarkStart w:id="210" w:name="configuración-ipv6"/>
+    <w:bookmarkEnd w:id="202"/>
+    <w:bookmarkStart w:id="211" w:name="configuración-ipv6"/>
     <w:p>
       <w:pPr>
         <w:pStyle w:val="Heading1"/>
@@ -33225,7 +33273,7 @@
         </w:pict>
       </w:r>
     </w:p>
-    <w:bookmarkStart w:id="202" w:name="la-idea-en-una-frase-15"/>
+    <w:bookmarkStart w:id="203" w:name="la-idea-en-una-frase-15"/>
     <w:p>
       <w:pPr>
         <w:pStyle w:val="Heading2"/>
@@ -33343,8 +33391,8 @@
         </w:pict>
       </w:r>
     </w:p>
-    <w:bookmarkEnd w:id="202"/>
-    <w:bookmarkStart w:id="203" w:name="configurar-un-pc-con-ipv6-estático"/>
+    <w:bookmarkEnd w:id="203"/>
+    <w:bookmarkStart w:id="204" w:name="configurar-un-pc-con-ipv6-estático"/>
     <w:p>
       <w:pPr>
         <w:pStyle w:val="Heading2"/>
@@ -33602,8 +33650,8 @@
         </w:pict>
       </w:r>
     </w:p>
-    <w:bookmarkEnd w:id="203"/>
-    <w:bookmarkStart w:id="204" w:name="configurar-un-router-cisco-con-ipv6"/>
+    <w:bookmarkEnd w:id="204"/>
+    <w:bookmarkStart w:id="205" w:name="configurar-un-router-cisco-con-ipv6"/>
     <w:p>
       <w:pPr>
         <w:pStyle w:val="Heading2"/>
@@ -33851,8 +33899,8 @@
         </w:pict>
       </w:r>
     </w:p>
-    <w:bookmarkEnd w:id="204"/>
-    <w:bookmarkStart w:id="205" w:name="verificación-los-comandos-que-dan-vida"/>
+    <w:bookmarkEnd w:id="205"/>
+    <w:bookmarkStart w:id="206" w:name="verificación-los-comandos-que-dan-vida"/>
     <w:p>
       <w:pPr>
         <w:pStyle w:val="Heading2"/>
@@ -34142,8 +34190,8 @@
         </w:pict>
       </w:r>
     </w:p>
-    <w:bookmarkEnd w:id="205"/>
-    <w:bookmarkStart w:id="206" w:name="y-en-packet-tracer"/>
+    <w:bookmarkEnd w:id="206"/>
+    <w:bookmarkStart w:id="207" w:name="y-en-packet-tracer"/>
     <w:p>
       <w:pPr>
         <w:pStyle w:val="Heading2"/>
@@ -34351,8 +34399,8 @@
         </w:pict>
       </w:r>
     </w:p>
-    <w:bookmarkEnd w:id="206"/>
-    <w:bookmarkStart w:id="207" w:name="mini-chequeo-15"/>
+    <w:bookmarkEnd w:id="207"/>
+    <w:bookmarkStart w:id="208" w:name="mini-chequeo-15"/>
     <w:p>
       <w:pPr>
         <w:pStyle w:val="Heading2"/>
@@ -34563,8 +34611,8 @@
         </w:pict>
       </w:r>
     </w:p>
-    <w:bookmarkEnd w:id="207"/>
-    <w:bookmarkStart w:id="208" w:name="resumen-en-3-frases-15"/>
+    <w:bookmarkEnd w:id="208"/>
+    <w:bookmarkStart w:id="209" w:name="resumen-en-3-frases-15"/>
     <w:p>
       <w:pPr>
         <w:pStyle w:val="Heading2"/>
@@ -34737,8 +34785,8 @@
         <w:t xml:space="preserve">; en Packet Tracer el flujo es idéntico.</w:t>
       </w:r>
     </w:p>
-    <w:bookmarkEnd w:id="208"/>
-    <w:bookmarkStart w:id="209" w:name="vocabulario-rápido-15"/>
+    <w:bookmarkEnd w:id="209"/>
+    <w:bookmarkStart w:id="210" w:name="vocabulario-rápido-15"/>
     <w:p>
       <w:pPr>
         <w:pStyle w:val="Heading2"/>
@@ -35013,9 +35061,9 @@
         </w:r>
       </w:hyperlink>
     </w:p>
-    <w:bookmarkEnd w:id="209"/>
     <w:bookmarkEnd w:id="210"/>
-    <w:bookmarkStart w:id="221" w:name="ipv8-la-propuesta-sin-rfc"/>
+    <w:bookmarkEnd w:id="211"/>
+    <w:bookmarkStart w:id="222" w:name="ipv8-la-propuesta-sin-rfc"/>
     <w:p>
       <w:pPr>
         <w:pStyle w:val="Heading1"/>
@@ -35079,7 +35127,7 @@
         </w:pict>
       </w:r>
     </w:p>
-    <w:bookmarkStart w:id="211" w:name="la-idea-en-una-frase-16"/>
+    <w:bookmarkStart w:id="212" w:name="la-idea-en-una-frase-16"/>
     <w:p>
       <w:pPr>
         <w:pStyle w:val="Heading2"/>
@@ -35274,8 +35322,8 @@
         </w:pict>
       </w:r>
     </w:p>
-    <w:bookmarkEnd w:id="211"/>
-    <w:bookmarkStart w:id="214" w:name="X02d22b18de6f52a5159db65d11a30636d2ee054"/>
+    <w:bookmarkEnd w:id="212"/>
+    <w:bookmarkStart w:id="215" w:name="X02d22b18de6f52a5159db65d11a30636d2ee054"/>
     <w:p>
       <w:pPr>
         <w:pStyle w:val="Heading2"/>
@@ -35578,7 +35626,7 @@
               <w:pStyle w:val="Compact"/>
             </w:pPr>
             <w:r>
-              <w:t xml:space="preserve">~18 billones (2⁶⁴)</w:t>
+              <w:t xml:space="preserve">~18 trillones (2⁶⁴)</w:t>
             </w:r>
           </w:p>
         </w:tc>
@@ -35922,7 +35970,7 @@
       <w:r>
         <w:t xml:space="preserve"> </w:t>
       </w:r>
-      <w:hyperlink r:id="rId212">
+      <w:hyperlink r:id="rId213">
         <w:r>
           <w:rPr>
             <w:rStyle w:val="Hyperlink"/>
@@ -35939,7 +35987,7 @@
       <w:r>
         <w:t xml:space="preserve"> </w:t>
       </w:r>
-      <w:hyperlink r:id="rId213">
+      <w:hyperlink r:id="rId214">
         <w:r>
           <w:rPr>
             <w:rStyle w:val="Hyperlink"/>
@@ -35958,8 +36006,8 @@
         </w:pict>
       </w:r>
     </w:p>
-    <w:bookmarkEnd w:id="214"/>
-    <w:bookmarkStart w:id="215" w:name="cómo-se-construye-una-dirección-ipv8"/>
+    <w:bookmarkEnd w:id="215"/>
+    <w:bookmarkStart w:id="216" w:name="cómo-se-construye-una-dirección-ipv8"/>
     <w:p>
       <w:pPr>
         <w:pStyle w:val="Heading2"/>
@@ -36278,8 +36326,8 @@
         </w:pict>
       </w:r>
     </w:p>
-    <w:bookmarkEnd w:id="215"/>
-    <w:bookmarkStart w:id="216" w:name="la-transición-que-propone-arp8-y-el-8to4"/>
+    <w:bookmarkEnd w:id="216"/>
+    <w:bookmarkStart w:id="217" w:name="la-transición-que-propone-arp8-y-el-8to4"/>
     <w:p>
       <w:pPr>
         <w:pStyle w:val="Heading2"/>
@@ -36593,8 +36641,8 @@
         </w:pict>
       </w:r>
     </w:p>
-    <w:bookmarkEnd w:id="216"/>
-    <w:bookmarkStart w:id="217" w:name="Xb1bc8e2ca78b3633ae315ab370b1f1ec88cb01f"/>
+    <w:bookmarkEnd w:id="217"/>
+    <w:bookmarkStart w:id="218" w:name="Xb1bc8e2ca78b3633ae315ab370b1f1ec88cb01f"/>
     <w:p>
       <w:pPr>
         <w:pStyle w:val="Heading2"/>
@@ -36869,8 +36917,8 @@
         </w:pict>
       </w:r>
     </w:p>
-    <w:bookmarkEnd w:id="217"/>
-    <w:bookmarkStart w:id="218" w:name="mini-chequeo-16"/>
+    <w:bookmarkEnd w:id="218"/>
+    <w:bookmarkStart w:id="219" w:name="mini-chequeo-16"/>
     <w:p>
       <w:pPr>
         <w:pStyle w:val="Heading2"/>
@@ -37066,8 +37114,8 @@
         </w:pict>
       </w:r>
     </w:p>
-    <w:bookmarkEnd w:id="218"/>
-    <w:bookmarkStart w:id="219" w:name="resumen-en-3-frases-16"/>
+    <w:bookmarkEnd w:id="219"/>
+    <w:bookmarkStart w:id="220" w:name="resumen-en-3-frases-16"/>
     <w:p>
       <w:pPr>
         <w:pStyle w:val="Heading2"/>
@@ -37157,8 +37205,8 @@
         <w:t xml:space="preserve">, individual y caducable; leerlo con criterio es parte del oficio.</w:t>
       </w:r>
     </w:p>
-    <w:bookmarkEnd w:id="219"/>
-    <w:bookmarkStart w:id="220" w:name="vocabulario-rápido-16"/>
+    <w:bookmarkEnd w:id="220"/>
+    <w:bookmarkStart w:id="221" w:name="vocabulario-rápido-16"/>
     <w:p>
       <w:pPr>
         <w:pStyle w:val="Heading2"/>
@@ -37447,9 +37495,9 @@
         </w:r>
       </w:hyperlink>
     </w:p>
-    <w:bookmarkEnd w:id="220"/>
     <w:bookmarkEnd w:id="221"/>
-    <w:bookmarkStart w:id="234" w:name="cierre-consolida-lo-aprendido"/>
+    <w:bookmarkEnd w:id="222"/>
+    <w:bookmarkStart w:id="235" w:name="cierre-consolida-lo-aprendido"/>
     <w:p>
       <w:pPr>
         <w:pStyle w:val="Heading1"/>
@@ -37545,7 +37593,7 @@
         </w:pict>
       </w:r>
     </w:p>
-    <w:bookmarkStart w:id="222" w:name="sé-el-paquete"/>
+    <w:bookmarkStart w:id="223" w:name="sé-el-paquete"/>
     <w:p>
       <w:pPr>
         <w:pStyle w:val="Heading2"/>
@@ -37730,13 +37778,13 @@
           <w:b/>
           <w:bCs/>
         </w:rPr>
-        <w:t xml:space="preserve">Lo ignoras y sigues con tu vida</w:t>
-      </w:r>
-      <w:r>
-        <w:t xml:space="preserve"> </w:t>
-      </w:r>
-      <w:r>
-        <w:t xml:space="preserve">→ También, porque la NIC filtra por MAC y ni siquiera ves ese paquete. Pero conceptualmente, el SO sabe que debe ir al gateway.</w:t>
+        <w:t xml:space="preserve">Lo devuelves al emisor</w:t>
+      </w:r>
+      <w:r>
+        <w:t xml:space="preserve"> </w:t>
+      </w:r>
+      <w:r>
+        <w:t xml:space="preserve">→ ❌ Tampoco: devolver paquetes es cosa de routers, no de hosts. Tu SO no tiene por dónde: o va al gateway o se queda en casa.</w:t>
       </w:r>
     </w:p>
     <w:p>
@@ -37770,8 +37818,8 @@
         </w:pict>
       </w:r>
     </w:p>
-    <w:bookmarkEnd w:id="222"/>
-    <w:bookmarkStart w:id="223" w:name="fireside-chat-ip-pública-vs-ip-privada"/>
+    <w:bookmarkEnd w:id="223"/>
+    <w:bookmarkStart w:id="224" w:name="fireside-chat-ip-pública-vs-ip-privada"/>
     <w:p>
       <w:pPr>
         <w:pStyle w:val="Heading2"/>
@@ -38018,8 +38066,8 @@
         </w:pict>
       </w:r>
     </w:p>
-    <w:bookmarkEnd w:id="223"/>
-    <w:bookmarkStart w:id="224" w:name="quién-soy"/>
+    <w:bookmarkEnd w:id="224"/>
+    <w:bookmarkStart w:id="225" w:name="quién-soy"/>
     <w:p>
       <w:pPr>
         <w:pStyle w:val="Heading2"/>
@@ -38256,8 +38304,8 @@
         </w:pict>
       </w:r>
     </w:p>
-    <w:bookmarkEnd w:id="224"/>
-    <w:bookmarkStart w:id="225" w:name="conrad-vs-el-mundo-subnetting"/>
+    <w:bookmarkEnd w:id="225"/>
+    <w:bookmarkStart w:id="226" w:name="conrad-vs-el-mundo-subnetting"/>
     <w:p>
       <w:pPr>
         <w:pStyle w:val="Heading2"/>
@@ -38303,7 +38351,7 @@
         <w:t xml:space="preserve"> </w:t>
       </w:r>
       <w:r>
-        <w:t xml:space="preserve">Pues mira, porque si pones 500 PCs en una sola red /24, te quedas sin IPs (#NoAlcancen). Y si los pones todos en la misma red, el tráfico broadcast es como un megáfono en una biblioteca: todo el mundo se entera de todo y nadie trabaja.”</w:t>
+        <w:t xml:space="preserve">Pues mira, porque si pones 500 PCs en una sola red /24, te quedas sin IPs (#NoAlcanzan). Y si los pones todos en la misma red, el tráfico broadcast es como un megáfono en una biblioteca: todo el mundo se entera de todo y nadie trabaja.”</w:t>
       </w:r>
     </w:p>
     <w:p>
@@ -38340,7 +38388,7 @@
         <w:t xml:space="preserve">es que subnetting es difícil</w:t>
       </w:r>
       <w:r>
-        <w:t xml:space="preserve">. ¡Claro! Porque te empeñas en hacerlo decimal. Hazlo en binario. 192.168.1.0/24 → /26 es agarrar 2 bits de host. ¡2 BITS! No es magia, es AND lógico. La calculadora de Windows también sirve, pero entiende lo que haces, no solo aprietes botones.”</w:t>
+        <w:t xml:space="preserve">. ¡Claro! Porque te empeñas en hacerlo decimal. Hazlo en binario. 192.168.1.0/24 → /26 es prestar 2 bits de host. ¡2 BITS! No es magia, es AND lógico. La calculadora de Windows también sirve, pero entiende lo que haces, no solo aprietes botones.”</w:t>
       </w:r>
     </w:p>
     <w:p>
@@ -38408,8 +38456,8 @@
         </w:pict>
       </w:r>
     </w:p>
-    <w:bookmarkEnd w:id="225"/>
-    <w:bookmarkStart w:id="226" w:name="X6dec93b1bd1cbbdc10676eb2e26d811f01544ae"/>
+    <w:bookmarkEnd w:id="226"/>
+    <w:bookmarkStart w:id="227" w:name="X6dec93b1bd1cbbdc10676eb2e26d811f01544ae"/>
     <w:p>
       <w:pPr>
         <w:pStyle w:val="Heading2"/>
@@ -38611,7 +38659,23 @@
         <w:t xml:space="preserve">Sí, justo</w:t>
       </w:r>
       <w:r>
-        <w:t xml:space="preserve">: Ventas 100 → /25 (128), RRHH 30 → /27 (32), IT 20 → /27 (32), Dirección 5 → /29 (8) y 3 enlaces /30 (12) suman 212 de 256. Pero no queda margen de crecimiento. Te dan</w:t>
+        <w:t xml:space="preserve">: Ventas 100 → /25 (128), RRHH 30 → /27 (32), IT 20 → /27 (32), Dirección 5 → /29 (8) y 3 enlaces /30 (12) suman 212 de 256: solo quedan</w:t>
+      </w:r>
+      <w:r>
+        <w:t xml:space="preserve"> </w:t>
+      </w:r>
+      <w:r>
+        <w:rPr>
+          <w:b/>
+          <w:bCs/>
+        </w:rPr>
+        <w:t xml:space="preserve">44 direcciones libres</w:t>
+      </w:r>
+      <w:r>
+        <w:t xml:space="preserve"> </w:t>
+      </w:r>
+      <w:r>
+        <w:t xml:space="preserve">(de la 212 a la 255) para crecer. Te dan</w:t>
       </w:r>
       <w:r>
         <w:t xml:space="preserve"> </w:t>
@@ -38660,127 +38724,7 @@
         <w:t xml:space="preserve"> </w:t>
       </w:r>
       <w:r>
-        <w:t xml:space="preserve">4. Configura rutas estáticas para que todas las subredes se vean entre sí.</w:t>
-      </w:r>
-    </w:p>
-    <w:p>
-      <w:pPr>
-        <w:pStyle w:val="BodyText"/>
-      </w:pPr>
-      <w:r>
-        <w:rPr>
-          <w:b/>
-          <w:bCs/>
-        </w:rPr>
-        <w:t xml:space="preserve">Fallo intencionado 1 (segmentación):</w:t>
-      </w:r>
-      <w:r>
-        <w:t xml:space="preserve"> </w:t>
-      </w:r>
-      <w:r>
-        <w:t xml:space="preserve">Pon</w:t>
-      </w:r>
-      <w:r>
-        <w:t xml:space="preserve"> </w:t>
-      </w:r>
-      <w:r>
-        <w:rPr>
-          <w:b/>
-          <w:bCs/>
-        </w:rPr>
-        <w:t xml:space="preserve">dos departamentos en la MISMA subred</w:t>
-      </w:r>
-      <w:r>
-        <w:t xml:space="preserve"> </w:t>
-      </w:r>
-      <w:r>
-        <w:t xml:space="preserve">(por ejemplo, IT y Dirección compartiendo el mismo rango).</w:t>
-      </w:r>
-    </w:p>
-    <w:p>
-      <w:pPr>
-        <w:pStyle w:val="BodyText"/>
-      </w:pPr>
-      <w:r>
-        <w:rPr>
-          <w:b/>
-          <w:bCs/>
-        </w:rPr>
-        <w:t xml:space="preserve">Pistas para diagnosticar el fallo 1:</w:t>
-      </w:r>
-      <w:r>
-        <w:t xml:space="preserve"> </w:t>
-      </w:r>
-      <w:r>
-        <w:t xml:space="preserve">- Si han ocupado el mismo rango IP, los</w:t>
-      </w:r>
-      <w:r>
-        <w:t xml:space="preserve"> </w:t>
-      </w:r>
-      <w:r>
-        <w:rPr>
-          <w:b/>
-          <w:bCs/>
-        </w:rPr>
-        <w:t xml:space="preserve">paquetes ARP</w:t>
-      </w:r>
-      <w:r>
-        <w:t xml:space="preserve"> </w:t>
-      </w:r>
-      <w:r>
-        <w:t xml:space="preserve">se pisan: los dispositivos de un departamento</w:t>
-      </w:r>
-      <w:r>
-        <w:t xml:space="preserve"> </w:t>
-      </w:r>
-      <w:r>
-        <w:t xml:space="preserve">“ven”</w:t>
-      </w:r>
-      <w:r>
-        <w:t xml:space="preserve"> </w:t>
-      </w:r>
-      <w:r>
-        <w:t xml:space="preserve">los del otro en la misma VLAN/capa 2.</w:t>
-      </w:r>
-      <w:r>
-        <w:t xml:space="preserve"> </w:t>
-      </w:r>
-      <w:r>
-        <w:t xml:space="preserve">- Revisa las</w:t>
-      </w:r>
-      <w:r>
-        <w:t xml:space="preserve"> </w:t>
-      </w:r>
-      <w:r>
-        <w:rPr>
-          <w:b/>
-          <w:bCs/>
-        </w:rPr>
-        <w:t xml:space="preserve">tablas de enrutamiento</w:t>
-      </w:r>
-      <w:r>
-        <w:t xml:space="preserve"> </w:t>
-      </w:r>
-      <w:r>
-        <w:t xml:space="preserve">de cada router: si en las rutas aparecen solo 3 subredes en vez de 4, dos departamentos están</w:t>
-      </w:r>
-      <w:r>
-        <w:t xml:space="preserve"> </w:t>
-      </w:r>
-      <w:r>
-        <w:t xml:space="preserve">“fusionados”</w:t>
-      </w:r>
-      <w:r>
-        <w:t xml:space="preserve"> </w:t>
-      </w:r>
-      <w:r>
-        <w:t xml:space="preserve">sin querer.</w:t>
-      </w:r>
-      <w:r>
-        <w:t xml:space="preserve"> </w:t>
-      </w:r>
-      <w:r>
-        <w:t xml:space="preserve">- Calcula de nuevo el VLSM en papel: el patrón</w:t>
+        <w:t xml:space="preserve">4. Conecta las subredes entre sí para que todas se vean entre sí (rutas estáticas en los routers: el</w:t>
       </w:r>
       <w:r>
         <w:t xml:space="preserve"> </w:t>
@@ -38790,6 +38734,230 @@
           <w:i/>
           <w:iCs/>
         </w:rPr>
+        <w:t xml:space="preserve">cómo</w:t>
+      </w:r>
+      <w:r>
+        <w:t xml:space="preserve"> </w:t>
+      </w:r>
+      <w:r>
+        <w:t xml:space="preserve">se configuran lo verás a fondo en la unidad de enrutamiento estático; aquí lo que importa es que el diseño funcione).</w:t>
+      </w:r>
+      <w:r>
+        <w:t xml:space="preserve"> </w:t>
+      </w:r>
+      <w:r>
+        <w:t xml:space="preserve">5. Deja la red</w:t>
+      </w:r>
+      <w:r>
+        <w:t xml:space="preserve"> </w:t>
+      </w:r>
+      <w:r>
+        <w:rPr>
+          <w:b/>
+          <w:bCs/>
+        </w:rPr>
+        <w:t xml:space="preserve">dual stack</w:t>
+      </w:r>
+      <w:r>
+        <w:t xml:space="preserve">: en el router de Ventas,</w:t>
+      </w:r>
+      <w:r>
+        <w:t xml:space="preserve"> </w:t>
+      </w:r>
+      <w:r>
+        <w:rPr>
+          <w:rStyle w:val="VerbatimChar"/>
+        </w:rPr>
+        <w:t xml:space="preserve">ipv6 unicast-routing</w:t>
+      </w:r>
+      <w:r>
+        <w:t xml:space="preserve"> </w:t>
+      </w:r>
+      <w:r>
+        <w:t xml:space="preserve">+</w:t>
+      </w:r>
+      <w:r>
+        <w:t xml:space="preserve"> </w:t>
+      </w:r>
+      <w:r>
+        <w:rPr>
+          <w:rStyle w:val="VerbatimChar"/>
+        </w:rPr>
+        <w:t xml:space="preserve">ipv6 address 2001:DB8:10::1/64</w:t>
+      </w:r>
+      <w:r>
+        <w:t xml:space="preserve"> </w:t>
+      </w:r>
+      <w:r>
+        <w:t xml:space="preserve">en la interfaz de la LAN, y en sus PCs una IPv6 estática (</w:t>
+      </w:r>
+      <w:r>
+        <w:rPr>
+          <w:rStyle w:val="VerbatimChar"/>
+        </w:rPr>
+        <w:t xml:space="preserve">2001:DB8:10::10/64</w:t>
+      </w:r>
+      <w:r>
+        <w:t xml:space="preserve"> </w:t>
+      </w:r>
+      <w:r>
+        <w:t xml:space="preserve">con su gateway) o SLAAC. Verifica con</w:t>
+      </w:r>
+      <w:r>
+        <w:t xml:space="preserve"> </w:t>
+      </w:r>
+      <w:r>
+        <w:rPr>
+          <w:rStyle w:val="VerbatimChar"/>
+        </w:rPr>
+        <w:t xml:space="preserve">show ipv6 interface brief</w:t>
+      </w:r>
+      <w:r>
+        <w:t xml:space="preserve"> </w:t>
+      </w:r>
+      <w:r>
+        <w:t xml:space="preserve">y un</w:t>
+      </w:r>
+      <w:r>
+        <w:t xml:space="preserve"> </w:t>
+      </w:r>
+      <w:r>
+        <w:rPr>
+          <w:rStyle w:val="VerbatimChar"/>
+        </w:rPr>
+        <w:t xml:space="preserve">ping -6</w:t>
+      </w:r>
+      <w:r>
+        <w:t xml:space="preserve">.</w:t>
+      </w:r>
+    </w:p>
+    <w:p>
+      <w:pPr>
+        <w:pStyle w:val="BodyText"/>
+      </w:pPr>
+      <w:r>
+        <w:rPr>
+          <w:b/>
+          <w:bCs/>
+        </w:rPr>
+        <w:t xml:space="preserve">Fallo intencionado 1 (segmentación):</w:t>
+      </w:r>
+      <w:r>
+        <w:t xml:space="preserve"> </w:t>
+      </w:r>
+      <w:r>
+        <w:t xml:space="preserve">Pon</w:t>
+      </w:r>
+      <w:r>
+        <w:t xml:space="preserve"> </w:t>
+      </w:r>
+      <w:r>
+        <w:rPr>
+          <w:b/>
+          <w:bCs/>
+        </w:rPr>
+        <w:t xml:space="preserve">dos departamentos en la MISMA subred</w:t>
+      </w:r>
+      <w:r>
+        <w:t xml:space="preserve"> </w:t>
+      </w:r>
+      <w:r>
+        <w:t xml:space="preserve">(por ejemplo, IT y Dirección compartiendo el mismo rango).</w:t>
+      </w:r>
+    </w:p>
+    <w:p>
+      <w:pPr>
+        <w:pStyle w:val="BodyText"/>
+      </w:pPr>
+      <w:r>
+        <w:rPr>
+          <w:b/>
+          <w:bCs/>
+        </w:rPr>
+        <w:t xml:space="preserve">Pistas para diagnosticar el fallo 1:</w:t>
+      </w:r>
+      <w:r>
+        <w:t xml:space="preserve"> </w:t>
+      </w:r>
+      <w:r>
+        <w:t xml:space="preserve">- Si han ocupado el mismo rango IP, los</w:t>
+      </w:r>
+      <w:r>
+        <w:t xml:space="preserve"> </w:t>
+      </w:r>
+      <w:r>
+        <w:rPr>
+          <w:b/>
+          <w:bCs/>
+        </w:rPr>
+        <w:t xml:space="preserve">paquetes ARP</w:t>
+      </w:r>
+      <w:r>
+        <w:t xml:space="preserve"> </w:t>
+      </w:r>
+      <w:r>
+        <w:t xml:space="preserve">se pisan: los dispositivos de un departamento</w:t>
+      </w:r>
+      <w:r>
+        <w:t xml:space="preserve"> </w:t>
+      </w:r>
+      <w:r>
+        <w:t xml:space="preserve">“ven”</w:t>
+      </w:r>
+      <w:r>
+        <w:t xml:space="preserve"> </w:t>
+      </w:r>
+      <w:r>
+        <w:t xml:space="preserve">los del otro en la misma VLAN/capa 2.</w:t>
+      </w:r>
+      <w:r>
+        <w:t xml:space="preserve"> </w:t>
+      </w:r>
+      <w:r>
+        <w:t xml:space="preserve">- Revisa las</w:t>
+      </w:r>
+      <w:r>
+        <w:t xml:space="preserve"> </w:t>
+      </w:r>
+      <w:r>
+        <w:rPr>
+          <w:b/>
+          <w:bCs/>
+        </w:rPr>
+        <w:t xml:space="preserve">tablas de enrutamiento</w:t>
+      </w:r>
+      <w:r>
+        <w:t xml:space="preserve"> </w:t>
+      </w:r>
+      <w:r>
+        <w:t xml:space="preserve">de cada router: si en las rutas aparecen solo 3 subredes en vez de 4, dos departamentos están</w:t>
+      </w:r>
+      <w:r>
+        <w:t xml:space="preserve"> </w:t>
+      </w:r>
+      <w:r>
+        <w:t xml:space="preserve">“fusionados”</w:t>
+      </w:r>
+      <w:r>
+        <w:t xml:space="preserve"> </w:t>
+      </w:r>
+      <w:r>
+        <w:t xml:space="preserve">sin querer.</w:t>
+      </w:r>
+      <w:r>
+        <w:t xml:space="preserve"> </w:t>
+      </w:r>
+      <w:r>
+        <w:t xml:space="preserve">- Calcula de nuevo el VLSM en papel: el patrón</w:t>
+      </w:r>
+      <w:r>
+        <w:t xml:space="preserve"> </w:t>
+      </w:r>
+      <w:r>
+        <w:rPr>
+          <w:i/>
+          <w:iCs/>
+        </w:rPr>
         <w:t xml:space="preserve">encadenado</w:t>
       </w:r>
       <w:r>
@@ -38808,39 +38976,41 @@
           <w:b/>
           <w:bCs/>
         </w:rPr>
-        <w:t xml:space="preserve">Fallo intencionado 2 (seguridad):</w:t>
-      </w:r>
-      <w:r>
-        <w:t xml:space="preserve"> </w:t>
-      </w:r>
-      <w:r>
-        <w:t xml:space="preserve">Configura un</w:t>
-      </w:r>
-      <w:r>
-        <w:t xml:space="preserve"> </w:t>
-      </w:r>
-      <w:r>
-        <w:rPr>
-          <w:b/>
-          <w:bCs/>
-        </w:rPr>
-        <w:t xml:space="preserve">ACL que bloquee el tráfico de Ventas a Dirección</w:t>
-      </w:r>
-      <w:r>
-        <w:t xml:space="preserve">, pero</w:t>
-      </w:r>
-      <w:r>
-        <w:t xml:space="preserve"> </w:t>
-      </w:r>
-      <w:r>
-        <w:rPr>
-          <w:b/>
-          <w:bCs/>
-        </w:rPr>
-        <w:t xml:space="preserve">mal escrito: permites todo sin querer</w:t>
-      </w:r>
-      <w:r>
-        <w:t xml:space="preserve">.</w:t>
+        <w:t xml:space="preserve">Fallo intencionado 2 (DHCP sin excluir):</w:t>
+      </w:r>
+      <w:r>
+        <w:t xml:space="preserve"> </w:t>
+      </w:r>
+      <w:r>
+        <w:t xml:space="preserve">En el pool de Ventas</w:t>
+      </w:r>
+      <w:r>
+        <w:t xml:space="preserve"> </w:t>
+      </w:r>
+      <w:r>
+        <w:rPr>
+          <w:b/>
+          <w:bCs/>
+        </w:rPr>
+        <w:t xml:space="preserve">olvida el</w:t>
+      </w:r>
+      <w:r>
+        <w:rPr>
+          <w:b/>
+          <w:bCs/>
+        </w:rPr>
+        <w:t xml:space="preserve"> </w:t>
+      </w:r>
+      <w:r>
+        <w:rPr>
+          <w:rStyle w:val="VerbatimChar"/>
+          <w:b/>
+          <w:bCs/>
+        </w:rPr>
+        <w:t xml:space="preserve">ip dhcp excluded-address</w:t>
+      </w:r>
+      <w:r>
+        <w:t xml:space="preserve">: el rango de reparto incluye la IP del propio router, y el primer cliente DHCP que llega se queda con la dirección del gateway.</w:t>
       </w:r>
     </w:p>
     <w:p>
@@ -38858,76 +39028,295 @@
         <w:t xml:space="preserve"> </w:t>
       </w:r>
       <w:r>
-        <w:t xml:space="preserve">- La ACL clásica del</w:t>
-      </w:r>
-      <w:r>
-        <w:t xml:space="preserve"> </w:t>
-      </w:r>
-      <w:r>
-        <w:t xml:space="preserve">“permit all”</w:t>
-      </w:r>
-      <w:r>
-        <w:t xml:space="preserve">: una línea</w:t>
-      </w:r>
-      <w:r>
-        <w:t xml:space="preserve"> </w:t>
-      </w:r>
-      <w:r>
-        <w:rPr>
-          <w:rStyle w:val="VerbatimChar"/>
-        </w:rPr>
-        <w:t xml:space="preserve">permit ip any any</w:t>
-      </w:r>
-      <w:r>
-        <w:t xml:space="preserve"> </w:t>
-      </w:r>
-      <w:r>
-        <w:t xml:space="preserve">colocada antes de la regla que querías hace que todo pase. Comprueba el</w:t>
-      </w:r>
-      <w:r>
-        <w:t xml:space="preserve"> </w:t>
-      </w:r>
-      <w:r>
-        <w:rPr>
-          <w:b/>
-          <w:bCs/>
-        </w:rPr>
-        <w:t xml:space="preserve">orden</w:t>
-      </w:r>
-      <w:r>
-        <w:t xml:space="preserve"> </w:t>
-      </w:r>
-      <w:r>
-        <w:t xml:space="preserve">de las líneas: las ACL se evalúan en cascada, de arriba abajo, y la primera coincidencia gana.</w:t>
-      </w:r>
-      <w:r>
-        <w:t xml:space="preserve"> </w:t>
-      </w:r>
-      <w:r>
-        <w:t xml:space="preserve">- Verifica con</w:t>
-      </w:r>
-      <w:r>
-        <w:t xml:space="preserve"> </w:t>
-      </w:r>
-      <w:r>
-        <w:rPr>
-          <w:rStyle w:val="VerbatimChar"/>
-          <w:b/>
-          <w:bCs/>
-        </w:rPr>
-        <w:t xml:space="preserve">show access-lists</w:t>
-      </w:r>
-      <w:r>
-        <w:t xml:space="preserve"> </w:t>
-      </w:r>
-      <w:r>
-        <w:t xml:space="preserve">si la regla de bloqueo tiene contadores de coincidencias (todos en cero = nunca se aplica).</w:t>
-      </w:r>
-      <w:r>
-        <w:t xml:space="preserve"> </w:t>
-      </w:r>
-      <w:r>
-        <w:t xml:space="preserve">- Haz un ping desde Ventas a la IP de Dirección: si responde, esa regla no está bloqueando nada. El filtro no funciona y nadie lo nota… hasta el día de la auditoría.</w:t>
+        <w:t xml:space="preserve">- En el cliente,</w:t>
+      </w:r>
+      <w:r>
+        <w:t xml:space="preserve"> </w:t>
+      </w:r>
+      <w:r>
+        <w:rPr>
+          <w:rStyle w:val="VerbatimChar"/>
+        </w:rPr>
+        <w:t xml:space="preserve">ipconfig</w:t>
+      </w:r>
+      <w:r>
+        <w:t xml:space="preserve">: si la IP del equipo coincide con la del gateway (o con la de otro equipo), has repartido una dirección ya ocupada — el</w:t>
+      </w:r>
+      <w:r>
+        <w:t xml:space="preserve"> </w:t>
+      </w:r>
+      <w:r>
+        <w:t xml:space="preserve">“conflicto de IP”</w:t>
+      </w:r>
+      <w:r>
+        <w:t xml:space="preserve"> </w:t>
+      </w:r>
+      <w:r>
+        <w:t xml:space="preserve">del que te advirtió CONRAD.</w:t>
+      </w:r>
+      <w:r>
+        <w:t xml:space="preserve"> </w:t>
+      </w:r>
+      <w:r>
+        <w:t xml:space="preserve">- En el router,</w:t>
+      </w:r>
+      <w:r>
+        <w:t xml:space="preserve"> </w:t>
+      </w:r>
+      <w:r>
+        <w:rPr>
+          <w:rStyle w:val="VerbatimChar"/>
+          <w:b/>
+          <w:bCs/>
+        </w:rPr>
+        <w:t xml:space="preserve">show ip dhcp binding</w:t>
+      </w:r>
+      <w:r>
+        <w:t xml:space="preserve"> </w:t>
+      </w:r>
+      <w:r>
+        <w:t xml:space="preserve">y</w:t>
+      </w:r>
+      <w:r>
+        <w:t xml:space="preserve"> </w:t>
+      </w:r>
+      <w:r>
+        <w:rPr>
+          <w:rStyle w:val="VerbatimChar"/>
+          <w:b/>
+          <w:bCs/>
+        </w:rPr>
+        <w:t xml:space="preserve">show ip dhcp conflict</w:t>
+      </w:r>
+      <w:r>
+        <w:t xml:space="preserve">: una asignación donde no toca, o una entrada en la tabla de conflictos.</w:t>
+      </w:r>
+      <w:r>
+        <w:t xml:space="preserve"> </w:t>
+      </w:r>
+      <w:r>
+        <w:t xml:space="preserve">- Revisa</w:t>
+      </w:r>
+      <w:r>
+        <w:t xml:space="preserve"> </w:t>
+      </w:r>
+      <w:r>
+        <w:rPr>
+          <w:rStyle w:val="VerbatimChar"/>
+        </w:rPr>
+        <w:t xml:space="preserve">show run</w:t>
+      </w:r>
+      <w:r>
+        <w:t xml:space="preserve">: falta la línea</w:t>
+      </w:r>
+      <w:r>
+        <w:t xml:space="preserve"> </w:t>
+      </w:r>
+      <w:r>
+        <w:rPr>
+          <w:rStyle w:val="VerbatimChar"/>
+          <w:b/>
+          <w:bCs/>
+        </w:rPr>
+        <w:t xml:space="preserve">ip dhcp excluded-address</w:t>
+      </w:r>
+      <w:r>
+        <w:t xml:space="preserve">, que aparta el gateway y las IPs estáticas antes de empezar a repartir. Excluye, excluye y excluye.</w:t>
+      </w:r>
+    </w:p>
+    <w:p>
+      <w:pPr>
+        <w:pStyle w:val="BodyText"/>
+      </w:pPr>
+      <w:r>
+        <w:rPr>
+          <w:b/>
+          <w:bCs/>
+        </w:rPr>
+        <w:t xml:space="preserve">Fallo intencionado 3 (IPv6 silencioso):</w:t>
+      </w:r>
+      <w:r>
+        <w:t xml:space="preserve"> </w:t>
+      </w:r>
+      <w:r>
+        <w:t xml:space="preserve">En el router de Ventas, configura la dirección IPv6</w:t>
+      </w:r>
+      <w:r>
+        <w:t xml:space="preserve"> </w:t>
+      </w:r>
+      <w:r>
+        <w:rPr>
+          <w:rStyle w:val="VerbatimChar"/>
+        </w:rPr>
+        <w:t xml:space="preserve">2001:DB8:10::1/64</w:t>
+      </w:r>
+      <w:r>
+        <w:t xml:space="preserve"> </w:t>
+      </w:r>
+      <w:r>
+        <w:t xml:space="preserve">en la</w:t>
+      </w:r>
+      <w:r>
+        <w:t xml:space="preserve"> </w:t>
+      </w:r>
+      <w:r>
+        <w:rPr>
+          <w:b/>
+          <w:bCs/>
+        </w:rPr>
+        <w:t xml:space="preserve">interfaz del enlace</w:t>
+      </w:r>
+      <w:r>
+        <w:t xml:space="preserve"> </w:t>
+      </w:r>
+      <w:r>
+        <w:t xml:space="preserve">(hacia el router vecino) en vez de en la de la</w:t>
+      </w:r>
+      <w:r>
+        <w:t xml:space="preserve"> </w:t>
+      </w:r>
+      <w:r>
+        <w:rPr>
+          <w:b/>
+          <w:bCs/>
+        </w:rPr>
+        <w:t xml:space="preserve">LAN</w:t>
+      </w:r>
+      <w:r>
+        <w:t xml:space="preserve">. El IPv4 va perfecto, pero el</w:t>
+      </w:r>
+      <w:r>
+        <w:t xml:space="preserve"> </w:t>
+      </w:r>
+      <w:r>
+        <w:rPr>
+          <w:rStyle w:val="VerbatimChar"/>
+        </w:rPr>
+        <w:t xml:space="preserve">ping -6</w:t>
+      </w:r>
+      <w:r>
+        <w:t xml:space="preserve"> </w:t>
+      </w:r>
+      <w:r>
+        <w:t xml:space="preserve">desde las PCs de Ventas no responde.</w:t>
+      </w:r>
+    </w:p>
+    <w:p>
+      <w:pPr>
+        <w:pStyle w:val="BodyText"/>
+      </w:pPr>
+      <w:r>
+        <w:rPr>
+          <w:b/>
+          <w:bCs/>
+        </w:rPr>
+        <w:t xml:space="preserve">Pistas para diagnosticar el fallo 3:</w:t>
+      </w:r>
+      <w:r>
+        <w:t xml:space="preserve"> </w:t>
+      </w:r>
+      <w:r>
+        <w:t xml:space="preserve">-</w:t>
+      </w:r>
+      <w:r>
+        <w:t xml:space="preserve"> </w:t>
+      </w:r>
+      <w:r>
+        <w:rPr>
+          <w:rStyle w:val="VerbatimChar"/>
+        </w:rPr>
+        <w:t xml:space="preserve">show ipv6 interface brief</w:t>
+      </w:r>
+      <w:r>
+        <w:t xml:space="preserve"> </w:t>
+      </w:r>
+      <w:r>
+        <w:t xml:space="preserve">en la interfaz de la LAN: no muestra la dirección que configuraste (o aparece</w:t>
+      </w:r>
+      <w:r>
+        <w:t xml:space="preserve"> </w:t>
+      </w:r>
+      <w:r>
+        <w:rPr>
+          <w:rStyle w:val="VerbatimChar"/>
+        </w:rPr>
+        <w:t xml:space="preserve">shutdown</w:t>
+      </w:r>
+      <w:r>
+        <w:t xml:space="preserve">). La config no</w:t>
+      </w:r>
+      <w:r>
+        <w:t xml:space="preserve"> </w:t>
+      </w:r>
+      <w:r>
+        <w:t xml:space="preserve">“entró”</w:t>
+      </w:r>
+      <w:r>
+        <w:t xml:space="preserve"> </w:t>
+      </w:r>
+      <w:r>
+        <w:t xml:space="preserve">donde debía.</w:t>
+      </w:r>
+      <w:r>
+        <w:t xml:space="preserve"> </w:t>
+      </w:r>
+      <w:r>
+        <w:t xml:space="preserve">-</w:t>
+      </w:r>
+      <w:r>
+        <w:t xml:space="preserve"> </w:t>
+      </w:r>
+      <w:r>
+        <w:rPr>
+          <w:rStyle w:val="VerbatimChar"/>
+        </w:rPr>
+        <w:t xml:space="preserve">show ipv6 route</w:t>
+      </w:r>
+      <w:r>
+        <w:t xml:space="preserve">: te falta la ruta</w:t>
+      </w:r>
+      <w:r>
+        <w:t xml:space="preserve"> </w:t>
+      </w:r>
+      <w:r>
+        <w:rPr>
+          <w:i/>
+          <w:iCs/>
+        </w:rPr>
+        <w:t xml:space="preserve">connected</w:t>
+      </w:r>
+      <w:r>
+        <w:t xml:space="preserve"> </w:t>
+      </w:r>
+      <w:r>
+        <w:rPr>
+          <w:rStyle w:val="VerbatimChar"/>
+        </w:rPr>
+        <w:t xml:space="preserve">2001:DB8:10::/64</w:t>
+      </w:r>
+      <w:r>
+        <w:t xml:space="preserve"> </w:t>
+      </w:r>
+      <w:r>
+        <w:t xml:space="preserve">apuntando a la interfaz de la LAN.</w:t>
+      </w:r>
+      <w:r>
+        <w:t xml:space="preserve"> </w:t>
+      </w:r>
+      <w:r>
+        <w:t xml:space="preserve">- Recuerda además</w:t>
+      </w:r>
+      <w:r>
+        <w:t xml:space="preserve"> </w:t>
+      </w:r>
+      <w:r>
+        <w:rPr>
+          <w:rStyle w:val="VerbatimChar"/>
+        </w:rPr>
+        <w:t xml:space="preserve">ipv6 unicast-routing</w:t>
+      </w:r>
+      <w:r>
+        <w:t xml:space="preserve">: sin él el router ni reenvía ni anuncia nada, aunque las direcciones estén bien puestas.</w:t>
       </w:r>
     </w:p>
     <w:p>
@@ -38937,8 +39326,8 @@
         </w:pict>
       </w:r>
     </w:p>
-    <w:bookmarkEnd w:id="226"/>
-    <w:bookmarkStart w:id="227" w:name="logros-de-esta-unidad"/>
+    <w:bookmarkEnd w:id="227"/>
+    <w:bookmarkStart w:id="228" w:name="logros-de-esta-unidad"/>
     <w:p>
       <w:pPr>
         <w:pStyle w:val="Heading2"/>
@@ -39129,8 +39518,8 @@
         </w:pict>
       </w:r>
     </w:p>
-    <w:bookmarkEnd w:id="227"/>
-    <w:bookmarkStart w:id="228" w:name="atrévete-a-pensar"/>
+    <w:bookmarkEnd w:id="228"/>
+    <w:bookmarkStart w:id="229" w:name="atrévete-a-pensar"/>
     <w:p>
       <w:pPr>
         <w:pStyle w:val="Heading2"/>
@@ -39458,7 +39847,7 @@
         <w:t xml:space="preserve">“duplicate IP”</w:t>
       </w:r>
       <w:r>
-        <w:t xml:space="preserve">. DHCP evita esto, pero con IPs estáticas puedes causarlo accidentalmente (y sin exclusiones, el propio DHCP se lo crea él solito).</w:t>
+        <w:t xml:space="preserve">. DHCP evita esto, pero con IPs estáticas puedes causarlo accidentalmente (y sin exclusiones, el propio DHCP se lo reparte él solito).</w:t>
       </w:r>
     </w:p>
     <w:p>
@@ -39468,8 +39857,8 @@
         </w:pict>
       </w:r>
     </w:p>
-    <w:bookmarkEnd w:id="228"/>
-    <w:bookmarkStart w:id="229" w:name="crucigrama-de-bits"/>
+    <w:bookmarkEnd w:id="229"/>
+    <w:bookmarkStart w:id="230" w:name="crucigrama-de-bits"/>
     <w:p>
       <w:pPr>
         <w:pStyle w:val="Heading2"/>
@@ -39622,8 +40011,8 @@
         </w:pict>
       </w:r>
     </w:p>
-    <w:bookmarkEnd w:id="229"/>
-    <w:bookmarkStart w:id="230" w:name="preguntas-de-entrevista-de-trabajo"/>
+    <w:bookmarkEnd w:id="230"/>
+    <w:bookmarkStart w:id="231" w:name="preguntas-de-entrevista-de-trabajo"/>
     <w:p>
       <w:pPr>
         <w:pStyle w:val="Heading2"/>
@@ -39761,23 +40150,7 @@
         <w:t xml:space="preserve">2ʰ − 2 ≥ hosts</w:t>
       </w:r>
       <w:r>
-        <w:t xml:space="preserve">) y acompáñala de un mini-ejemplo mental (100→/25, 30→/27, 2→/30). Y en la 1, cuidado con la trampa: 3 subredes de 50 hosts</w:t>
-      </w:r>
-      <w:r>
-        <w:t xml:space="preserve"> </w:t>
-      </w:r>
-      <w:r>
-        <w:rPr>
-          <w:b/>
-          <w:bCs/>
-        </w:rPr>
-        <w:t xml:space="preserve">no</w:t>
-      </w:r>
-      <w:r>
-        <w:t xml:space="preserve"> </w:t>
-      </w:r>
-      <w:r>
-        <w:t xml:space="preserve">se resuelven con /25 a lo loco; busca la máscara justa para cada una y menciona que se puede afinar con VLSM.</w:t>
+        <w:t xml:space="preserve">) y acompáñala de un mini-ejemplo mental (100→/25, 30→/27, 2→/30). Y en la 1, cuidado con la trampa: con /25 solo caben 2 subredes y necesitas 3, así que pide 2 bits (4 subredes de 62 hosts en /26) y la cuarta sobra. Si encima los tamaños son distintos, ahí sí hay que afinar con VLSM.</w:t>
       </w:r>
     </w:p>
     <w:p>
@@ -39787,8 +40160,8 @@
         </w:pict>
       </w:r>
     </w:p>
-    <w:bookmarkEnd w:id="230"/>
-    <w:bookmarkStart w:id="231" w:name="no-hay-preguntas-tontas"/>
+    <w:bookmarkEnd w:id="231"/>
+    <w:bookmarkStart w:id="232" w:name="no-hay-preguntas-tontas"/>
     <w:p>
       <w:pPr>
         <w:pStyle w:val="Heading2"/>
@@ -39812,7 +40185,7 @@
           <w:b/>
           <w:bCs/>
         </w:rPr>
-        <w:t xml:space="preserve">¿Si dos dispositivos en redes diferentes usan la misma IP privada, ¿cómo evitan conflictos?</w:t>
+        <w:t xml:space="preserve">Si dos dispositivos en redes diferentes usan la misma IP privada, ¿cómo evitan conflictos?</w:t>
       </w:r>
     </w:p>
     <w:p>
@@ -39952,8 +40325,8 @@
         </w:pict>
       </w:r>
     </w:p>
-    <w:bookmarkEnd w:id="231"/>
-    <w:bookmarkStart w:id="232" w:name="poscréditos"/>
+    <w:bookmarkEnd w:id="232"/>
+    <w:bookmarkStart w:id="233" w:name="poscréditos"/>
     <w:p>
       <w:pPr>
         <w:pStyle w:val="Heading2"/>
@@ -40011,14 +40384,14 @@
         </w:pict>
       </w:r>
     </w:p>
-    <w:bookmarkEnd w:id="232"/>
-    <w:bookmarkStart w:id="233" w:name="criterios-de-evaluación-cubiertos-ra2"/>
+    <w:bookmarkEnd w:id="233"/>
+    <w:bookmarkStart w:id="234" w:name="X13c4304ac1b63119c8abde198862dc2c71c987c"/>
     <w:p>
       <w:pPr>
         <w:pStyle w:val="Heading2"/>
       </w:pPr>
       <w:r>
-        <w:t xml:space="preserve">✅ Criterios de evaluación cubiertos (RA2)</w:t>
+        <w:t xml:space="preserve">✅ Criterios de evaluación cubiertos (RA1/RA2/RA4/RA6)</w:t>
       </w:r>
     </w:p>
     <w:p>
@@ -40091,29 +40464,29 @@
               <w:pStyle w:val="Compact"/>
             </w:pPr>
             <w:r>
-              <w:t xml:space="preserve">d)</w:t>
-            </w:r>
-          </w:p>
-        </w:tc>
-        <w:tc>
-          <w:tcPr/>
-          <w:p>
-            <w:pPr>
-              <w:pStyle w:val="Compact"/>
-            </w:pPr>
-            <w:r>
-              <w:t xml:space="preserve">Direccionamiento lógico IP</w:t>
-            </w:r>
-          </w:p>
-        </w:tc>
-        <w:tc>
-          <w:tcPr/>
-          <w:p>
-            <w:pPr>
-              <w:pStyle w:val="Compact"/>
-            </w:pPr>
-            <w:r>
-              <w:t xml:space="preserve">✅ IPv4 e IPv6, subredes, CIDR, máscaras, VLSM (puntos 1-7 y 9-12)</w:t>
+              <w:t xml:space="preserve">RA2·d)</w:t>
+            </w:r>
+          </w:p>
+        </w:tc>
+        <w:tc>
+          <w:tcPr/>
+          <w:p>
+            <w:pPr>
+              <w:pStyle w:val="Compact"/>
+            </w:pPr>
+            <w:r>
+              <w:t xml:space="preserve">Direccionamiento lógico IPv4/IPv6</w:t>
+            </w:r>
+          </w:p>
+        </w:tc>
+        <w:tc>
+          <w:tcPr/>
+          <w:p>
+            <w:pPr>
+              <w:pStyle w:val="Compact"/>
+            </w:pPr>
+            <w:r>
+              <w:t xml:space="preserve">✅ Puntos 1-5 y 9-12 + ⚡ Laboratorio (punto 18)</w:t>
             </w:r>
           </w:p>
         </w:tc>
@@ -40126,29 +40499,29 @@
               <w:pStyle w:val="Compact"/>
             </w:pPr>
             <w:r>
-              <w:t xml:space="preserve">g)</w:t>
-            </w:r>
-          </w:p>
-        </w:tc>
-        <w:tc>
-          <w:tcPr/>
-          <w:p>
-            <w:pPr>
-              <w:pStyle w:val="Compact"/>
-            </w:pPr>
-            <w:r>
-              <w:t xml:space="preserve">Conectividad entre dispositivos</w:t>
-            </w:r>
-          </w:p>
-        </w:tc>
-        <w:tc>
-          <w:tcPr/>
-          <w:p>
-            <w:pPr>
-              <w:pStyle w:val="Compact"/>
-            </w:pPr>
-            <w:r>
-              <w:t xml:space="preserve">✅ DHCP/DORA (8), SLAAC/DHCPv6 (12-13) + ⚡ Laboratorio Packet Tracer</w:t>
+              <w:t xml:space="preserve">RA1·c)</w:t>
+            </w:r>
+          </w:p>
+        </w:tc>
+        <w:tc>
+          <w:tcPr/>
+          <w:p>
+            <w:pPr>
+              <w:pStyle w:val="Compact"/>
+            </w:pPr>
+            <w:r>
+              <w:t xml:space="preserve">Subredes y diseño lógico</w:t>
+            </w:r>
+          </w:p>
+        </w:tc>
+        <w:tc>
+          <w:tcPr/>
+          <w:p>
+            <w:pPr>
+              <w:pStyle w:val="Compact"/>
+            </w:pPr>
+            <w:r>
+              <w:t xml:space="preserve">✅ Puntos 5-7 (CIDR/VLSM)</w:t>
             </w:r>
           </w:p>
         </w:tc>
@@ -40161,29 +40534,29 @@
               <w:pStyle w:val="Compact"/>
             </w:pPr>
             <w:r>
-              <w:t xml:space="preserve">c)</w:t>
-            </w:r>
-          </w:p>
-        </w:tc>
-        <w:tc>
-          <w:tcPr/>
-          <w:p>
-            <w:pPr>
-              <w:pStyle w:val="Compact"/>
-            </w:pPr>
-            <w:r>
-              <w:t xml:space="preserve">Subredes y diseño lógico (RA1)</w:t>
-            </w:r>
-          </w:p>
-        </w:tc>
-        <w:tc>
-          <w:tcPr/>
-          <w:p>
-            <w:pPr>
-              <w:pStyle w:val="Compact"/>
-            </w:pPr>
-            <w:r>
-              <w:t xml:space="preserve">✅ CIDR y VLSM (puntos 5-7)</w:t>
+              <w:t xml:space="preserve">RA2·g)</w:t>
+            </w:r>
+          </w:p>
+        </w:tc>
+        <w:tc>
+          <w:tcPr/>
+          <w:p>
+            <w:pPr>
+              <w:pStyle w:val="Compact"/>
+            </w:pPr>
+            <w:r>
+              <w:t xml:space="preserve">Servicios de configuración automática</w:t>
+            </w:r>
+          </w:p>
+        </w:tc>
+        <w:tc>
+          <w:tcPr/>
+          <w:p>
+            <w:pPr>
+              <w:pStyle w:val="Compact"/>
+            </w:pPr>
+            <w:r>
+              <w:t xml:space="preserve">✅ Puntos 8 y 12-13 + ⚡ Laboratorio (punto 18)</w:t>
             </w:r>
           </w:p>
         </w:tc>
@@ -40196,29 +40569,64 @@
               <w:pStyle w:val="Compact"/>
             </w:pPr>
             <w:r>
-              <w:t xml:space="preserve">—</w:t>
-            </w:r>
-          </w:p>
-        </w:tc>
-        <w:tc>
-          <w:tcPr/>
-          <w:p>
-            <w:pPr>
-              <w:pStyle w:val="Compact"/>
-            </w:pPr>
-            <w:r>
-              <w:t xml:space="preserve">Fundamentos de encaminamiento (RA6)</w:t>
-            </w:r>
-          </w:p>
-        </w:tc>
-        <w:tc>
-          <w:tcPr/>
-          <w:p>
-            <w:pPr>
-              <w:pStyle w:val="Compact"/>
-            </w:pPr>
-            <w:r>
-              <w:t xml:space="preserve">✅ Cabecera, ARP y máscaras/redes (puntos 1-2 y 5)</w:t>
+              <w:t xml:space="preserve">RA4·d)</w:t>
+            </w:r>
+          </w:p>
+        </w:tc>
+        <w:tc>
+          <w:tcPr/>
+          <w:p>
+            <w:pPr>
+              <w:pStyle w:val="Compact"/>
+            </w:pPr>
+            <w:r>
+              <w:t xml:space="preserve">Comandos de configuración</w:t>
+            </w:r>
+          </w:p>
+        </w:tc>
+        <w:tc>
+          <w:tcPr/>
+          <w:p>
+            <w:pPr>
+              <w:pStyle w:val="Compact"/>
+            </w:pPr>
+            <w:r>
+              <w:t xml:space="preserve">✅ Punto 16 (interfaces IPv6) + ⚡ Laboratorio (punto 18)</w:t>
+            </w:r>
+          </w:p>
+        </w:tc>
+      </w:tr>
+      <w:tr>
+        <w:tc>
+          <w:tcPr/>
+          <w:p>
+            <w:pPr>
+              <w:pStyle w:val="Compact"/>
+            </w:pPr>
+            <w:r>
+              <w:t xml:space="preserve">RA6</w:t>
+            </w:r>
+          </w:p>
+        </w:tc>
+        <w:tc>
+          <w:tcPr/>
+          <w:p>
+            <w:pPr>
+              <w:pStyle w:val="Compact"/>
+            </w:pPr>
+            <w:r>
+              <w:t xml:space="preserve">Fundamentos para el encaminamiento</w:t>
+            </w:r>
+          </w:p>
+        </w:tc>
+        <w:tc>
+          <w:tcPr/>
+          <w:p>
+            <w:pPr>
+              <w:pStyle w:val="Compact"/>
+            </w:pPr>
+            <w:r>
+              <w:t xml:space="preserve">✅ Puntos 1-2 y 5 (cabecera, ARP, máscaras/redes)</w:t>
             </w:r>
           </w:p>
         </w:tc>
@@ -40304,8 +40712,8 @@
         </w:r>
       </w:hyperlink>
     </w:p>
-    <w:bookmarkEnd w:id="233"/>
     <w:bookmarkEnd w:id="234"/>
+    <w:bookmarkEnd w:id="235"/>
     <w:sectPr>
       <w:footnotePr>
         <w:numRestart w:val="eachSect"/>

</xml_diff>

<commit_message>
Revisión U03/U04: 10 diagramas nuevos (NDP y switching), ASCII→SVG y checklist de revisión en AGENTS.md
</commit_message>
<xml_diff>
--- a/docx/03-direccionamiento-ip/03-direccionamiento-ip.docx
+++ b/docx/03-direccionamiento-ip/03-direccionamiento-ip.docx
@@ -148,6 +148,59 @@
         <w:pStyle w:val="BodyText"/>
       </w:pPr>
       <w:r>
+        <w:t xml:space="preserve">¿Y dónde encaja esto en el modelo OSI? En la</w:t>
+      </w:r>
+      <w:r>
+        <w:t xml:space="preserve"> </w:t>
+      </w:r>
+      <w:r>
+        <w:rPr>
+          <w:b/>
+          <w:bCs/>
+        </w:rPr>
+        <w:t xml:space="preserve">capa 3 — la capa de red</w:t>
+      </w:r>
+      <w:r>
+        <w:t xml:space="preserve">. En Ethernet te quedaste en las capas 1 y 2 (medio físico y trama MAC); aquí subes un peldaño: la capa 3 es la del</w:t>
+      </w:r>
+      <w:r>
+        <w:t xml:space="preserve"> </w:t>
+      </w:r>
+      <w:r>
+        <w:rPr>
+          <w:b/>
+          <w:bCs/>
+        </w:rPr>
+        <w:t xml:space="preserve">direccionamiento lógico</w:t>
+      </w:r>
+      <w:r>
+        <w:t xml:space="preserve"> </w:t>
+      </w:r>
+      <w:r>
+        <w:t xml:space="preserve">(las IP), la que decide</w:t>
+      </w:r>
+      <w:r>
+        <w:t xml:space="preserve"> </w:t>
+      </w:r>
+      <w:r>
+        <w:rPr>
+          <w:b/>
+          <w:bCs/>
+        </w:rPr>
+        <w:t xml:space="preserve">por dónde viaja</w:t>
+      </w:r>
+      <w:r>
+        <w:t xml:space="preserve"> </w:t>
+      </w:r>
+      <w:r>
+        <w:t xml:space="preserve">cada paquete de punta a punta cruzando redes distintas, y la que se apoya en los routers. Dentro de tu red local manda la trama Ethernet (capa 2) y su MAC; en cuanto el paquete quiere salir de casa, manda la IP. Toda la unidad vive ahí arriba.</w:t>
+      </w:r>
+    </w:p>
+    <w:p>
+      <w:pPr>
+        <w:pStyle w:val="BodyText"/>
+      </w:pPr>
+      <w:r>
         <w:t xml:space="preserve">Esta unidad se lee como un</w:t>
       </w:r>
       <w:r>
@@ -1563,7 +1616,7 @@
     </w:p>
     <w:bookmarkEnd w:id="34"/>
     <w:bookmarkEnd w:id="35"/>
-    <w:bookmarkStart w:id="54" w:name="estructura-de-ipv4"/>
+    <w:bookmarkStart w:id="57" w:name="estructura-de-ipv4"/>
     <w:p>
       <w:pPr>
         <w:pStyle w:val="Heading1"/>
@@ -2406,117 +2459,7 @@
     </w:p>
     <w:p>
       <w:pPr>
-        <w:pStyle w:val="SourceCode"/>
-      </w:pPr>
-      <w:r>
-        <w:rPr>
-          <w:rStyle w:val="VerbatimChar"/>
-        </w:rPr>
-        <w:t xml:space="preserve">┌──────────────────────────────────────────────────────────────┐</w:t>
-      </w:r>
-      <w:r>
-        <w:br/>
-      </w:r>
-      <w:r>
-        <w:rPr>
-          <w:rStyle w:val="VerbatimChar"/>
-        </w:rPr>
-        <w:t xml:space="preserve">│ Vers(4)│IHL│ TOS │ Long.total │ ID │Flags│Offset│ TTL │Proto│</w:t>
-      </w:r>
-      <w:r>
-        <w:br/>
-      </w:r>
-      <w:r>
-        <w:rPr>
-          <w:rStyle w:val="VerbatimChar"/>
-        </w:rPr>
-        <w:t xml:space="preserve">├──────────────────────────────────────────────────────────────┤</w:t>
-      </w:r>
-      <w:r>
-        <w:br/>
-      </w:r>
-      <w:r>
-        <w:rPr>
-          <w:rStyle w:val="VerbatimChar"/>
-        </w:rPr>
-        <w:t xml:space="preserve">│         Checksum cabecera (16 bits)                          │</w:t>
-      </w:r>
-      <w:r>
-        <w:br/>
-      </w:r>
-      <w:r>
-        <w:rPr>
-          <w:rStyle w:val="VerbatimChar"/>
-        </w:rPr>
-        <w:t xml:space="preserve">├──────────────────────────────────────────────────────────────┤</w:t>
-      </w:r>
-      <w:r>
-        <w:br/>
-      </w:r>
-      <w:r>
-        <w:rPr>
-          <w:rStyle w:val="VerbatimChar"/>
-        </w:rPr>
-        <w:t xml:space="preserve">│         IP ORIGEN (32 bits)     │      IP DESTINO (32 bits)  │</w:t>
-      </w:r>
-      <w:r>
-        <w:br/>
-      </w:r>
-      <w:r>
-        <w:rPr>
-          <w:rStyle w:val="VerbatimChar"/>
-        </w:rPr>
-        <w:t xml:space="preserve">├──────────────────────────────────────────────────────────────┤</w:t>
-      </w:r>
-      <w:r>
-        <w:br/>
-      </w:r>
-      <w:r>
-        <w:rPr>
-          <w:rStyle w:val="VerbatimChar"/>
-        </w:rPr>
-        <w:t xml:space="preserve">│         Opciones (0 o más, si IHL &gt; 5)                       │</w:t>
-      </w:r>
-      <w:r>
-        <w:br/>
-      </w:r>
-      <w:r>
-        <w:rPr>
-          <w:rStyle w:val="VerbatimChar"/>
-        </w:rPr>
-        <w:t xml:space="preserve">├──────────────────────────────────────────────────────────────┤</w:t>
-      </w:r>
-      <w:r>
-        <w:br/>
-      </w:r>
-      <w:r>
-        <w:rPr>
-          <w:rStyle w:val="VerbatimChar"/>
-        </w:rPr>
-        <w:t xml:space="preserve">│         Datos (payload)                                      │</w:t>
-      </w:r>
-      <w:r>
-        <w:br/>
-      </w:r>
-      <w:r>
-        <w:rPr>
-          <w:rStyle w:val="VerbatimChar"/>
-        </w:rPr>
-        <w:t xml:space="preserve">└──────────────────────────────────────────────────────────────┘</w:t>
-      </w:r>
-      <w:r>
-        <w:br/>
-      </w:r>
-      <w:r>
-        <w:rPr>
-          <w:rStyle w:val="VerbatimChar"/>
-        </w:rPr>
-        <w:t xml:space="preserve">Cabecera mínima: 20 bytes (5 words de 32 bits)</w:t>
-      </w:r>
-    </w:p>
-    <w:p>
-      <w:pPr>
-        <w:pStyle w:val="FirstParagraph"/>
+        <w:pStyle w:val="BodyText"/>
       </w:pPr>
       <w:r>
         <w:t xml:space="preserve">Campos que de verdad importan en examen y en el día a día:</w:t>
@@ -3202,89 +3145,6 @@
     </w:p>
     <w:p>
       <w:pPr>
-        <w:pStyle w:val="SourceCode"/>
-      </w:pPr>
-      <w:r>
-        <w:rPr>
-          <w:rStyle w:val="VerbatimChar"/>
-        </w:rPr>
-        <w:t xml:space="preserve">Paquete con 4000 B de payload  →  MTU del enlace = 1500 B</w:t>
-      </w:r>
-      <w:r>
-        <w:br/>
-      </w:r>
-      <w:r>
-        <w:rPr>
-          <w:rStyle w:val="VerbatimChar"/>
-        </w:rPr>
-        <w:t xml:space="preserve">        │</w:t>
-      </w:r>
-      <w:r>
-        <w:br/>
-      </w:r>
-      <w:r>
-        <w:rPr>
-          <w:rStyle w:val="VerbatimChar"/>
-        </w:rPr>
-        <w:t xml:space="preserve">        ▼</w:t>
-      </w:r>
-      <w:r>
-        <w:br/>
-      </w:r>
-      <w:r>
-        <w:rPr>
-          <w:rStyle w:val="VerbatimChar"/>
-        </w:rPr>
-        <w:t xml:space="preserve">┌─────────────┐ ┌─────────────┐ ┌─────────────┐</w:t>
-      </w:r>
-      <w:r>
-        <w:br/>
-      </w:r>
-      <w:r>
-        <w:rPr>
-          <w:rStyle w:val="VerbatimChar"/>
-        </w:rPr>
-        <w:t xml:space="preserve">│ frag 1      │ │ frag 2      │ │ frag 3      │</w:t>
-      </w:r>
-      <w:r>
-        <w:br/>
-      </w:r>
-      <w:r>
-        <w:rPr>
-          <w:rStyle w:val="VerbatimChar"/>
-        </w:rPr>
-        <w:t xml:space="preserve">│ 1480 B datos│ │ 1480 B datos│ │ 1040 B datos│</w:t>
-      </w:r>
-      <w:r>
-        <w:br/>
-      </w:r>
-      <w:r>
-        <w:rPr>
-          <w:rStyle w:val="VerbatimChar"/>
-        </w:rPr>
-        <w:t xml:space="preserve">│ MF=1, off=0 │ │ MF=1, off=… │ │ MF=0        │</w:t>
-      </w:r>
-      <w:r>
-        <w:br/>
-      </w:r>
-      <w:r>
-        <w:rPr>
-          <w:rStyle w:val="VerbatimChar"/>
-        </w:rPr>
-        <w:t xml:space="preserve">└─────────────┘ └─────────────┘ └─────────────┘</w:t>
-      </w:r>
-      <w:r>
-        <w:br/>
-      </w:r>
-      <w:r>
-        <w:rPr>
-          <w:rStyle w:val="VerbatimChar"/>
-        </w:rPr>
-        <w:t xml:space="preserve">        (20 B cabecera cada fragmento; 1480 = múltiplo de 8)</w:t>
-      </w:r>
-    </w:p>
-    <w:p>
-      <w:pPr>
         <w:pStyle w:val="Compact"/>
         <w:numPr>
           <w:ilvl w:val="0"/>
@@ -4043,7 +3903,7 @@
       </w:r>
     </w:p>
     <w:bookmarkEnd w:id="48"/>
-    <w:bookmarkStart w:id="49" w:name="X1d767fb2fd14c01a5e9d9df08ee355c975d7f0a"/>
+    <w:bookmarkStart w:id="52" w:name="X1d767fb2fd14c01a5e9d9df08ee355c975d7f0a"/>
     <w:p>
       <w:pPr>
         <w:pStyle w:val="Heading2"/>
@@ -4400,103 +4260,66 @@
     </w:p>
     <w:p>
       <w:pPr>
-        <w:pStyle w:val="SourceCode"/>
-      </w:pPr>
-      <w:r>
-        <w:rPr>
-          <w:rStyle w:val="VerbatimChar"/>
-        </w:rPr>
-        <w:t xml:space="preserve">PC .10                                PC .20</w:t>
-      </w:r>
-      <w:r>
-        <w:br/>
-      </w:r>
-      <w:r>
-        <w:rPr>
-          <w:rStyle w:val="VerbatimChar"/>
-        </w:rPr>
-        <w:t xml:space="preserve">  │  ARP Request (broadcast)            │</w:t>
-      </w:r>
-      <w:r>
-        <w:br/>
-      </w:r>
-      <w:r>
-        <w:rPr>
-          <w:rStyle w:val="VerbatimChar"/>
-        </w:rPr>
-        <w:t xml:space="preserve">  │  "¿quién tiene .20?"                │</w:t>
-      </w:r>
-      <w:r>
-        <w:br/>
-      </w:r>
-      <w:r>
-        <w:rPr>
-          <w:rStyle w:val="VerbatimChar"/>
-        </w:rPr>
-        <w:t xml:space="preserve">  │ ───────────────────────────────────►│  (todos reciben)</w:t>
-      </w:r>
-      <w:r>
-        <w:br/>
-      </w:r>
-      <w:r>
-        <w:rPr>
-          <w:rStyle w:val="VerbatimChar"/>
-        </w:rPr>
-        <w:t xml:space="preserve">  │                                     │</w:t>
-      </w:r>
-      <w:r>
-        <w:br/>
-      </w:r>
-      <w:r>
-        <w:rPr>
-          <w:rStyle w:val="VerbatimChar"/>
-        </w:rPr>
-        <w:t xml:space="preserve">  │  ARP Reply (unicast)                │</w:t>
-      </w:r>
-      <w:r>
-        <w:br/>
-      </w:r>
-      <w:r>
-        <w:rPr>
-          <w:rStyle w:val="VerbatimChar"/>
-        </w:rPr>
-        <w:t xml:space="preserve">  │  "soy .20, MAC aa:bb:…"             │</w:t>
-      </w:r>
-      <w:r>
-        <w:br/>
-      </w:r>
-      <w:r>
-        <w:rPr>
-          <w:rStyle w:val="VerbatimChar"/>
-        </w:rPr>
-        <w:t xml:space="preserve">  │◄─────────────────────────────────── │</w:t>
-      </w:r>
-      <w:r>
-        <w:br/>
-      </w:r>
-      <w:r>
-        <w:rPr>
-          <w:rStyle w:val="VerbatimChar"/>
-        </w:rPr>
-        <w:t xml:space="preserve">  │  tabla ARP: .20 → aa:bb:…           │</w:t>
-      </w:r>
-      <w:r>
-        <w:br/>
-      </w:r>
-      <w:r>
-        <w:rPr>
-          <w:rStyle w:val="VerbatimChar"/>
-        </w:rPr>
-        <w:t xml:space="preserve">  ▼                                     ▼</w:t>
-      </w:r>
-      <w:r>
-        <w:br/>
-      </w:r>
-      <w:r>
-        <w:rPr>
-          <w:rStyle w:val="VerbatimChar"/>
-        </w:rPr>
-        <w:t xml:space="preserve">  trama Ethernet con MAC destino = aa:bb:…</w:t>
+        <w:pStyle w:val="CaptionedFigure"/>
+      </w:pPr>
+      <w:r>
+        <w:drawing>
+          <wp:inline>
+            <wp:extent cx="5334000" cy="2695989"/>
+            <wp:effectExtent b="0" l="0" r="0" t="0"/>
+            <wp:docPr descr="Proceso ARP en la red local: PC-A envía un ARP Request en broadcast buscando la MAC de la IP destino y el dueño responde con un ARP Reply en unicast" title="" id="50" name="Picture"/>
+            <a:graphic>
+              <a:graphicData uri="http://schemas.openxmlformats.org/drawingml/2006/picture">
+                <pic:pic>
+                  <pic:nvPicPr>
+                    <pic:cNvPr descr="public/diagrams/u03-arp.svg" id="51" name="Picture"/>
+                    <pic:cNvPicPr>
+                      <a:picLocks noChangeArrowheads="1" noChangeAspect="1"/>
+                    </pic:cNvPicPr>
+                  </pic:nvPicPr>
+                  <pic:blipFill>
+                    <a:blip>
+                      <a:extLst>
+                        <a:ext uri="{28A0092B-C50C-407E-A947-70E740481C1C}">
+                          <a14:useLocalDpi xmlns:a14="http://schemas.microsoft.com/office/drawing/2010/main" val="0"/>
+                        </a:ext>
+                        <a:ext uri="{96DAC541-7B7A-43D3-8B79-37D633B846F1}">
+                          <asvg:svgBlip xmlns:asvg="http://schemas.microsoft.com/office/drawing/2016/SVG/main" r:embed="rId49"/>
+                        </a:ext>
+                      </a:extLst>
+                    </a:blip>
+                    <a:stretch>
+                      <a:fillRect/>
+                    </a:stretch>
+                  </pic:blipFill>
+                  <pic:spPr bwMode="auto">
+                    <a:xfrm>
+                      <a:off x="0" y="0"/>
+                      <a:ext cx="5334000" cy="2695989"/>
+                    </a:xfrm>
+                    <a:prstGeom prst="rect">
+                      <a:avLst/>
+                    </a:prstGeom>
+                    <a:noFill/>
+                    <a:ln w="9525">
+                      <a:noFill/>
+                      <a:headEnd/>
+                      <a:tailEnd/>
+                    </a:ln>
+                  </pic:spPr>
+                </pic:pic>
+              </a:graphicData>
+            </a:graphic>
+          </wp:inline>
+        </w:drawing>
+      </w:r>
+    </w:p>
+    <w:p>
+      <w:pPr>
+        <w:pStyle w:val="ImageCaption"/>
+      </w:pPr>
+      <w:r>
+        <w:t xml:space="preserve">Proceso ARP en la red local: PC-A envía un ARP Request en broadcast buscando la MAC de la IP destino y el dueño responde con un ARP Reply en unicast</w:t>
       </w:r>
     </w:p>
     <w:p>
@@ -4737,8 +4560,8 @@
         </w:pict>
       </w:r>
     </w:p>
-    <w:bookmarkEnd w:id="49"/>
-    <w:bookmarkStart w:id="50" w:name="mini-chequeo"/>
+    <w:bookmarkEnd w:id="52"/>
+    <w:bookmarkStart w:id="53" w:name="mini-chequeo"/>
     <w:p>
       <w:pPr>
         <w:pStyle w:val="Heading2"/>
@@ -5209,8 +5032,8 @@
         </w:pict>
       </w:r>
     </w:p>
-    <w:bookmarkEnd w:id="50"/>
-    <w:bookmarkStart w:id="51" w:name="resumen-en-3-frases"/>
+    <w:bookmarkEnd w:id="53"/>
+    <w:bookmarkStart w:id="54" w:name="resumen-en-3-frases"/>
     <w:p>
       <w:pPr>
         <w:pStyle w:val="Heading2"/>
@@ -5332,8 +5155,8 @@
         <w:t xml:space="preserve">traduce IP→MAC (request broadcast, reply unicast) para que la trama Ethernet vista antes llegue al equipo correcto.</w:t>
       </w:r>
     </w:p>
-    <w:bookmarkEnd w:id="51"/>
-    <w:bookmarkStart w:id="53" w:name="vocabulario-rápido"/>
+    <w:bookmarkEnd w:id="54"/>
+    <w:bookmarkStart w:id="56" w:name="vocabulario-rápido"/>
     <w:p>
       <w:pPr>
         <w:pStyle w:val="Heading2"/>
@@ -5695,7 +5518,7 @@
       <w:r>
         <w:t xml:space="preserve"> </w:t>
       </w:r>
-      <w:hyperlink r:id="rId52">
+      <w:hyperlink r:id="rId55">
         <w:r>
           <w:rPr>
             <w:rStyle w:val="Hyperlink"/>
@@ -5722,7 +5545,7 @@
       <w:r>
         <w:t xml:space="preserve"> </w:t>
       </w:r>
-      <w:hyperlink r:id="rId52">
+      <w:hyperlink r:id="rId55">
         <w:r>
           <w:rPr>
             <w:rStyle w:val="Hyperlink"/>
@@ -5758,9 +5581,9 @@
         </w:r>
       </w:hyperlink>
     </w:p>
-    <w:bookmarkEnd w:id="53"/>
-    <w:bookmarkEnd w:id="54"/>
-    <w:bookmarkStart w:id="64" w:name="binario-y-la-operación-and"/>
+    <w:bookmarkEnd w:id="56"/>
+    <w:bookmarkEnd w:id="57"/>
+    <w:bookmarkStart w:id="67" w:name="binario-y-la-operación-and"/>
     <w:p>
       <w:pPr>
         <w:pStyle w:val="Heading1"/>
@@ -5824,7 +5647,7 @@
         </w:pict>
       </w:r>
     </w:p>
-    <w:bookmarkStart w:id="55" w:name="la-idea-en-una-frase-1"/>
+    <w:bookmarkStart w:id="58" w:name="la-idea-en-una-frase-1"/>
     <w:p>
       <w:pPr>
         <w:pStyle w:val="Heading2"/>
@@ -5901,8 +5724,8 @@
         </w:pict>
       </w:r>
     </w:p>
-    <w:bookmarkEnd w:id="55"/>
-    <w:bookmarkStart w:id="56" w:name="el-peso-de-cada-bit"/>
+    <w:bookmarkEnd w:id="58"/>
+    <w:bookmarkStart w:id="59" w:name="el-peso-de-cada-bit"/>
     <w:p>
       <w:pPr>
         <w:pStyle w:val="Heading2"/>
@@ -6166,8 +5989,8 @@
         </w:pict>
       </w:r>
     </w:p>
-    <w:bookmarkEnd w:id="56"/>
-    <w:bookmarkStart w:id="58" w:name="convertir-decimal-a-binario"/>
+    <w:bookmarkEnd w:id="59"/>
+    <w:bookmarkStart w:id="61" w:name="convertir-decimal-a-binario"/>
     <w:p>
       <w:pPr>
         <w:pStyle w:val="Heading2"/>
@@ -6335,7 +6158,7 @@
         <w:t xml:space="preserve">es la operación inversa: multiplica cada bit por su peso y suma.</w:t>
       </w:r>
     </w:p>
-    <w:bookmarkStart w:id="57" w:name="tabla-de-conversión-rápida"/>
+    <w:bookmarkStart w:id="60" w:name="tabla-de-conversión-rápida"/>
     <w:p>
       <w:pPr>
         <w:pStyle w:val="Heading3"/>
@@ -6954,9 +6777,9 @@
         </w:pict>
       </w:r>
     </w:p>
-    <w:bookmarkEnd w:id="57"/>
-    <w:bookmarkEnd w:id="58"/>
-    <w:bookmarkStart w:id="60" w:name="la-operación-and"/>
+    <w:bookmarkEnd w:id="60"/>
+    <w:bookmarkEnd w:id="61"/>
+    <w:bookmarkStart w:id="63" w:name="la-operación-and"/>
     <w:p>
       <w:pPr>
         <w:pStyle w:val="Heading2"/>
@@ -7057,7 +6880,7 @@
         <w:t xml:space="preserve">: solo gana cuando ambos aportan.</w:t>
       </w:r>
     </w:p>
-    <w:bookmarkStart w:id="59" w:name="para-qué-sirve-en-redes"/>
+    <w:bookmarkStart w:id="62" w:name="para-qué-sirve-en-redes"/>
     <w:p>
       <w:pPr>
         <w:pStyle w:val="Heading3"/>
@@ -7264,9 +7087,9 @@
         </w:pict>
       </w:r>
     </w:p>
-    <w:bookmarkEnd w:id="59"/>
-    <w:bookmarkEnd w:id="60"/>
-    <w:bookmarkStart w:id="61" w:name="mini-chequeo-1"/>
+    <w:bookmarkEnd w:id="62"/>
+    <w:bookmarkEnd w:id="63"/>
+    <w:bookmarkStart w:id="64" w:name="mini-chequeo-1"/>
     <w:p>
       <w:pPr>
         <w:pStyle w:val="Heading2"/>
@@ -7519,8 +7342,8 @@
         </w:pict>
       </w:r>
     </w:p>
-    <w:bookmarkEnd w:id="61"/>
-    <w:bookmarkStart w:id="62" w:name="resumen-en-3-frases-1"/>
+    <w:bookmarkEnd w:id="64"/>
+    <w:bookmarkStart w:id="65" w:name="resumen-en-3-frases-1"/>
     <w:p>
       <w:pPr>
         <w:pStyle w:val="Heading2"/>
@@ -7597,8 +7420,8 @@
         <w:t xml:space="preserve">y decide si dos equipos son vecinos.</w:t>
       </w:r>
     </w:p>
-    <w:bookmarkEnd w:id="62"/>
-    <w:bookmarkStart w:id="63" w:name="vocabulario-rápido-1"/>
+    <w:bookmarkEnd w:id="65"/>
+    <w:bookmarkStart w:id="66" w:name="vocabulario-rápido-1"/>
     <w:p>
       <w:pPr>
         <w:pStyle w:val="Heading2"/>
@@ -7782,7 +7605,7 @@
       <w:r>
         <w:t xml:space="preserve"> </w:t>
       </w:r>
-      <w:hyperlink r:id="rId52">
+      <w:hyperlink r:id="rId55">
         <w:r>
           <w:rPr>
             <w:rStyle w:val="Hyperlink"/>
@@ -7845,9 +7668,9 @@
         </w:r>
       </w:hyperlink>
     </w:p>
-    <w:bookmarkEnd w:id="63"/>
-    <w:bookmarkEnd w:id="64"/>
-    <w:bookmarkStart w:id="74" w:name="clases-de-direcciones"/>
+    <w:bookmarkEnd w:id="66"/>
+    <w:bookmarkEnd w:id="67"/>
+    <w:bookmarkStart w:id="77" w:name="clases-de-direcciones"/>
     <w:p>
       <w:pPr>
         <w:pStyle w:val="Heading1"/>
@@ -7911,7 +7734,7 @@
         </w:pict>
       </w:r>
     </w:p>
-    <w:bookmarkStart w:id="65" w:name="la-idea-en-una-frase-2"/>
+    <w:bookmarkStart w:id="68" w:name="la-idea-en-una-frase-2"/>
     <w:p>
       <w:pPr>
         <w:pStyle w:val="Heading2"/>
@@ -7975,8 +7798,8 @@
         </w:pict>
       </w:r>
     </w:p>
-    <w:bookmarkEnd w:id="65"/>
-    <w:bookmarkStart w:id="68" w:name="el-antiguo-régimen-clases-a-e"/>
+    <w:bookmarkEnd w:id="68"/>
+    <w:bookmarkStart w:id="71" w:name="el-antiguo-régimen-clases-a-e"/>
     <w:p>
       <w:pPr>
         <w:pStyle w:val="Heading2"/>
@@ -8389,7 +8212,7 @@
         </w:tc>
       </w:tr>
     </w:tbl>
-    <w:bookmarkStart w:id="66" w:name="Xcdf44a403c126a8dcf64a9ce36b1f0dc7ec9cec"/>
+    <w:bookmarkStart w:id="69" w:name="Xcdf44a403c126a8dcf64a9ce36b1f0dc7ec9cec"/>
     <w:p>
       <w:pPr>
         <w:pStyle w:val="Heading3"/>
@@ -8691,8 +8514,8 @@
         <w:t xml:space="preserve">una clase B entera y desaprovechabas miles de IPs. Ese desperdicio aceleró el agotamiento del espacio IPv4.</w:t>
       </w:r>
     </w:p>
-    <w:bookmarkEnd w:id="66"/>
-    <w:bookmarkStart w:id="67" w:name="y-qué-pasa-con-la-clase-d-y-la-e"/>
+    <w:bookmarkEnd w:id="69"/>
+    <w:bookmarkStart w:id="70" w:name="y-qué-pasa-con-la-clase-d-y-la-e"/>
     <w:p>
       <w:pPr>
         <w:pStyle w:val="Heading3"/>
@@ -8777,9 +8600,9 @@
         </w:pict>
       </w:r>
     </w:p>
-    <w:bookmarkEnd w:id="67"/>
-    <w:bookmarkEnd w:id="68"/>
-    <w:bookmarkStart w:id="70" w:name="X92268c44475b8451a45cd8f80621ecf68bca745"/>
+    <w:bookmarkEnd w:id="70"/>
+    <w:bookmarkEnd w:id="71"/>
+    <w:bookmarkStart w:id="73" w:name="X92268c44475b8451a45cd8f80621ecf68bca745"/>
     <w:p>
       <w:pPr>
         <w:pStyle w:val="Heading2"/>
@@ -9078,7 +8901,7 @@
         <w:t xml:space="preserve">históricamente no significa que hoy se trate con reglas de clase A: su tamaño lo decide el /8.</w:t>
       </w:r>
     </w:p>
-    <w:bookmarkStart w:id="69" w:name="X287e912dca98cfc65f6ba9ced06c7520dd130d7"/>
+    <w:bookmarkStart w:id="72" w:name="X287e912dca98cfc65f6ba9ced06c7520dd130d7"/>
     <w:p>
       <w:pPr>
         <w:pStyle w:val="Heading3"/>
@@ -9269,9 +9092,9 @@
         </w:pict>
       </w:r>
     </w:p>
-    <w:bookmarkEnd w:id="69"/>
-    <w:bookmarkEnd w:id="70"/>
-    <w:bookmarkStart w:id="71" w:name="mini-chequeo-2"/>
+    <w:bookmarkEnd w:id="72"/>
+    <w:bookmarkEnd w:id="73"/>
+    <w:bookmarkStart w:id="74" w:name="mini-chequeo-2"/>
     <w:p>
       <w:pPr>
         <w:pStyle w:val="Heading2"/>
@@ -9527,8 +9350,8 @@
         </w:pict>
       </w:r>
     </w:p>
-    <w:bookmarkEnd w:id="71"/>
-    <w:bookmarkStart w:id="72" w:name="resumen-en-3-frases-2"/>
+    <w:bookmarkEnd w:id="74"/>
+    <w:bookmarkStart w:id="75" w:name="resumen-en-3-frases-2"/>
     <w:p>
       <w:pPr>
         <w:pStyle w:val="Heading2"/>
@@ -9586,8 +9409,8 @@
         <w:t xml:space="preserve">Aunque las clases son legacy, saberlas sigue siendo útil para leer rangos y aprobar exámenes.</w:t>
       </w:r>
     </w:p>
-    <w:bookmarkEnd w:id="72"/>
-    <w:bookmarkStart w:id="73" w:name="vocabulario-rápido-2"/>
+    <w:bookmarkEnd w:id="75"/>
+    <w:bookmarkStart w:id="76" w:name="vocabulario-rápido-2"/>
     <w:p>
       <w:pPr>
         <w:pStyle w:val="Heading2"/>
@@ -9790,7 +9613,7 @@
       <w:r>
         <w:t xml:space="preserve"> </w:t>
       </w:r>
-      <w:hyperlink r:id="rId52">
+      <w:hyperlink r:id="rId55">
         <w:r>
           <w:rPr>
             <w:rStyle w:val="Hyperlink"/>
@@ -9853,9 +9676,9 @@
         </w:r>
       </w:hyperlink>
     </w:p>
-    <w:bookmarkEnd w:id="73"/>
-    <w:bookmarkEnd w:id="74"/>
-    <w:bookmarkStart w:id="87" w:name="ips-privadas-y-públicas"/>
+    <w:bookmarkEnd w:id="76"/>
+    <w:bookmarkEnd w:id="77"/>
+    <w:bookmarkStart w:id="90" w:name="ips-privadas-y-públicas"/>
     <w:p>
       <w:pPr>
         <w:pStyle w:val="Heading1"/>
@@ -9919,7 +9742,7 @@
         </w:pict>
       </w:r>
     </w:p>
-    <w:bookmarkStart w:id="75" w:name="la-idea-en-una-frase-3"/>
+    <w:bookmarkStart w:id="78" w:name="la-idea-en-una-frase-3"/>
     <w:p>
       <w:pPr>
         <w:pStyle w:val="Heading2"/>
@@ -10014,8 +9837,8 @@
         </w:pict>
       </w:r>
     </w:p>
-    <w:bookmarkEnd w:id="75"/>
-    <w:bookmarkStart w:id="79" w:name="las-ips-privadas-rfc-1918"/>
+    <w:bookmarkEnd w:id="78"/>
+    <w:bookmarkStart w:id="82" w:name="las-ips-privadas-rfc-1918"/>
     <w:p>
       <w:pPr>
         <w:pStyle w:val="Heading2"/>
@@ -10356,7 +10179,7 @@
         <w:t xml:space="preserve">ya es una IP normalmente pública y válida.</w:t>
       </w:r>
     </w:p>
-    <w:bookmarkStart w:id="76" w:name="cómo-identifico-una-ip-privada-al-vuelo"/>
+    <w:bookmarkStart w:id="79" w:name="cómo-identifico-una-ip-privada-al-vuelo"/>
     <w:p>
       <w:pPr>
         <w:pStyle w:val="Heading3"/>
@@ -10629,8 +10452,8 @@
         <w:t xml:space="preserve">→ pública.</w:t>
       </w:r>
     </w:p>
-    <w:bookmarkEnd w:id="76"/>
-    <w:bookmarkStart w:id="78" w:name="por-qué-existen"/>
+    <w:bookmarkEnd w:id="79"/>
+    <w:bookmarkStart w:id="81" w:name="por-qué-existen"/>
     <w:p>
       <w:pPr>
         <w:pStyle w:val="Heading3"/>
@@ -10764,7 +10587,7 @@
       <w:r>
         <w:t xml:space="preserve"> </w:t>
       </w:r>
-      <w:hyperlink r:id="rId77">
+      <w:hyperlink r:id="rId80">
         <w:r>
           <w:rPr>
             <w:rStyle w:val="Hyperlink"/>
@@ -10783,9 +10606,9 @@
         </w:pict>
       </w:r>
     </w:p>
-    <w:bookmarkEnd w:id="78"/>
-    <w:bookmarkEnd w:id="79"/>
-    <w:bookmarkStart w:id="81" w:name="las-ips-públicas-únicas-en-el-mundo"/>
+    <w:bookmarkEnd w:id="81"/>
+    <w:bookmarkEnd w:id="82"/>
+    <w:bookmarkStart w:id="84" w:name="las-ips-públicas-únicas-en-el-mundo"/>
     <w:p>
       <w:pPr>
         <w:pStyle w:val="Heading2"/>
@@ -10923,7 +10746,7 @@
         <w:t xml:space="preserve">ese número.</w:t>
       </w:r>
     </w:p>
-    <w:bookmarkStart w:id="80" w:name="cómo-consigue-una-ip-pública-un-isp"/>
+    <w:bookmarkStart w:id="83" w:name="cómo-consigue-una-ip-pública-un-isp"/>
     <w:p>
       <w:pPr>
         <w:pStyle w:val="Heading3"/>
@@ -11017,9 +10840,9 @@
         </w:pict>
       </w:r>
     </w:p>
-    <w:bookmarkEnd w:id="80"/>
-    <w:bookmarkEnd w:id="81"/>
-    <w:bookmarkStart w:id="83" w:name="la-relación-con-nat-e-ipv6"/>
+    <w:bookmarkEnd w:id="83"/>
+    <w:bookmarkEnd w:id="84"/>
+    <w:bookmarkStart w:id="86" w:name="la-relación-con-nat-e-ipv6"/>
     <w:p>
       <w:pPr>
         <w:pStyle w:val="Heading2"/>
@@ -11222,7 +11045,7 @@
         <w:t xml:space="preserve">.</w:t>
       </w:r>
     </w:p>
-    <w:bookmarkStart w:id="82" w:name="Xbf8b0cd17cac621703b2813ae38603e5fcefba8"/>
+    <w:bookmarkStart w:id="85" w:name="Xbf8b0cd17cac621703b2813ae38603e5fcefba8"/>
     <w:p>
       <w:pPr>
         <w:pStyle w:val="Heading3"/>
@@ -11406,9 +11229,9 @@
         </w:pict>
       </w:r>
     </w:p>
-    <w:bookmarkEnd w:id="82"/>
-    <w:bookmarkEnd w:id="83"/>
-    <w:bookmarkStart w:id="84" w:name="mini-chequeo-3"/>
+    <w:bookmarkEnd w:id="85"/>
+    <w:bookmarkEnd w:id="86"/>
+    <w:bookmarkStart w:id="87" w:name="mini-chequeo-3"/>
     <w:p>
       <w:pPr>
         <w:pStyle w:val="Heading2"/>
@@ -11603,8 +11426,8 @@
         </w:pict>
       </w:r>
     </w:p>
-    <w:bookmarkEnd w:id="84"/>
-    <w:bookmarkStart w:id="85" w:name="resumen-en-3-frases-3"/>
+    <w:bookmarkEnd w:id="87"/>
+    <w:bookmarkStart w:id="88" w:name="resumen-en-3-frases-3"/>
     <w:p>
       <w:pPr>
         <w:pStyle w:val="Heading2"/>
@@ -11720,8 +11543,8 @@
         <w:t xml:space="preserve">El trío privada + NAT + IPv6 es la respuesta al agotamiento de IPv4: un apaño que funciona, hasta que IPv6 lo resuelva de verdad.</w:t>
       </w:r>
     </w:p>
-    <w:bookmarkEnd w:id="85"/>
-    <w:bookmarkStart w:id="86" w:name="vocabulario-rápido-3"/>
+    <w:bookmarkEnd w:id="88"/>
+    <w:bookmarkStart w:id="89" w:name="vocabulario-rápido-3"/>
     <w:p>
       <w:pPr>
         <w:pStyle w:val="Heading2"/>
@@ -11905,7 +11728,7 @@
       <w:r>
         <w:t xml:space="preserve"> </w:t>
       </w:r>
-      <w:hyperlink r:id="rId52">
+      <w:hyperlink r:id="rId55">
         <w:r>
           <w:rPr>
             <w:rStyle w:val="Hyperlink"/>
@@ -11968,9 +11791,9 @@
         </w:r>
       </w:hyperlink>
     </w:p>
-    <w:bookmarkEnd w:id="86"/>
-    <w:bookmarkEnd w:id="87"/>
-    <w:bookmarkStart w:id="98" w:name="máscaras-y-notación-cidr"/>
+    <w:bookmarkEnd w:id="89"/>
+    <w:bookmarkEnd w:id="90"/>
+    <w:bookmarkStart w:id="104" w:name="máscaras-y-notación-cidr"/>
     <w:p>
       <w:pPr>
         <w:pStyle w:val="Heading1"/>
@@ -12034,7 +11857,7 @@
         </w:pict>
       </w:r>
     </w:p>
-    <w:bookmarkStart w:id="88" w:name="la-idea-en-una-frase-4"/>
+    <w:bookmarkStart w:id="91" w:name="la-idea-en-una-frase-4"/>
     <w:p>
       <w:pPr>
         <w:pStyle w:val="Heading2"/>
@@ -12113,8 +11936,8 @@
         </w:pict>
       </w:r>
     </w:p>
-    <w:bookmarkEnd w:id="88"/>
-    <w:bookmarkStart w:id="92" w:name="qué-es-la-máscara-de-subred"/>
+    <w:bookmarkEnd w:id="91"/>
+    <w:bookmarkStart w:id="98" w:name="qué-es-la-máscara-de-subred"/>
     <w:p>
       <w:pPr>
         <w:pStyle w:val="Heading2"/>
@@ -12167,9 +11990,161 @@
         <w:t xml:space="preserve">host</w:t>
       </w:r>
       <w:r>
+        <w:t xml:space="preserve">. En la imagen, el ejemplo de una</w:t>
+      </w:r>
+      <w:r>
+        <w:t xml:space="preserve"> </w:t>
+      </w:r>
+      <w:r>
+        <w:rPr>
+          <w:rStyle w:val="VerbatimChar"/>
+        </w:rPr>
+        <w:t xml:space="preserve">/26</w:t>
+      </w:r>
+      <w:r>
+        <w:t xml:space="preserve">: los bits de red (azul) están fijos y los de host (verde) son los libres.</w:t>
+      </w:r>
+    </w:p>
+    <w:p>
+      <w:pPr>
+        <w:pStyle w:val="CaptionedFigure"/>
+      </w:pPr>
+      <w:r>
+        <w:drawing>
+          <wp:inline>
+            <wp:extent cx="5334000" cy="3000375"/>
+            <wp:effectExtent b="0" l="0" r="0" t="0"/>
+            <wp:docPr descr="Máscara /26 (255.255.255.192): los bits de red en azul y los de host en verde sobre la dirección en binario; 26 bits de red dejan 62 hosts útiles" title="" id="93" name="Picture"/>
+            <a:graphic>
+              <a:graphicData uri="http://schemas.openxmlformats.org/drawingml/2006/picture">
+                <pic:pic>
+                  <pic:nvPicPr>
+                    <pic:cNvPr descr="public/diagrams/u03-mascara-bits.svg" id="94" name="Picture"/>
+                    <pic:cNvPicPr>
+                      <a:picLocks noChangeArrowheads="1" noChangeAspect="1"/>
+                    </pic:cNvPicPr>
+                  </pic:nvPicPr>
+                  <pic:blipFill>
+                    <a:blip>
+                      <a:extLst>
+                        <a:ext uri="{28A0092B-C50C-407E-A947-70E740481C1C}">
+                          <a14:useLocalDpi xmlns:a14="http://schemas.microsoft.com/office/drawing/2010/main" val="0"/>
+                        </a:ext>
+                        <a:ext uri="{96DAC541-7B7A-43D3-8B79-37D633B846F1}">
+                          <asvg:svgBlip xmlns:asvg="http://schemas.microsoft.com/office/drawing/2016/SVG/main" r:embed="rId92"/>
+                        </a:ext>
+                      </a:extLst>
+                    </a:blip>
+                    <a:stretch>
+                      <a:fillRect/>
+                    </a:stretch>
+                  </pic:blipFill>
+                  <pic:spPr bwMode="auto">
+                    <a:xfrm>
+                      <a:off x="0" y="0"/>
+                      <a:ext cx="5334000" cy="3000375"/>
+                    </a:xfrm>
+                    <a:prstGeom prst="rect">
+                      <a:avLst/>
+                    </a:prstGeom>
+                    <a:noFill/>
+                    <a:ln w="9525">
+                      <a:noFill/>
+                      <a:headEnd/>
+                      <a:tailEnd/>
+                    </a:ln>
+                  </pic:spPr>
+                </pic:pic>
+              </a:graphicData>
+            </a:graphic>
+          </wp:inline>
+        </w:drawing>
+      </w:r>
+    </w:p>
+    <w:p>
+      <w:pPr>
+        <w:pStyle w:val="ImageCaption"/>
+      </w:pPr>
+      <w:r>
+        <w:t xml:space="preserve">Máscara /26 (255.255.255.192): los bits de red en azul y los de host en verde sobre la dirección en binario; 26 bits de red dejan 62 hosts útiles</w:t>
+      </w:r>
+    </w:p>
+    <w:p>
+      <w:pPr>
+        <w:pStyle w:val="BodyText"/>
+      </w:pPr>
+      <w:r>
+        <w:t xml:space="preserve">La forma decimal de la máscara sale de convertir cada octeto:</w:t>
+      </w:r>
+      <w:r>
+        <w:t xml:space="preserve"> </w:t>
+      </w:r>
+      <w:r>
+        <w:rPr>
+          <w:rStyle w:val="VerbatimChar"/>
+        </w:rPr>
+        <w:t xml:space="preserve">11111111</w:t>
+      </w:r>
+      <w:r>
+        <w:t xml:space="preserve"> </w:t>
+      </w:r>
+      <w:r>
+        <w:t xml:space="preserve">= 255,</w:t>
+      </w:r>
+      <w:r>
+        <w:t xml:space="preserve"> </w:t>
+      </w:r>
+      <w:r>
+        <w:rPr>
+          <w:rStyle w:val="VerbatimChar"/>
+        </w:rPr>
+        <w:t xml:space="preserve">00000000</w:t>
+      </w:r>
+      <w:r>
+        <w:t xml:space="preserve"> </w:t>
+      </w:r>
+      <w:r>
+        <w:t xml:space="preserve">= 0. Por eso la clásica</w:t>
+      </w:r>
+      <w:r>
+        <w:t xml:space="preserve"> </w:t>
+      </w:r>
+      <w:r>
+        <w:rPr>
+          <w:rStyle w:val="VerbatimChar"/>
+        </w:rPr>
+        <w:t xml:space="preserve">255.255.255.0</w:t>
+      </w:r>
+      <w:r>
         <w:t xml:space="preserve">.</w:t>
       </w:r>
     </w:p>
+    <w:bookmarkStart w:id="95" w:name="notación-cidr-n"/>
+    <w:p>
+      <w:pPr>
+        <w:pStyle w:val="Heading3"/>
+      </w:pPr>
+      <w:r>
+        <w:t xml:space="preserve">Notación CIDR:</w:t>
+      </w:r>
+      <w:r>
+        <w:t xml:space="preserve"> </w:t>
+      </w:r>
+      <w:r>
+        <w:rPr>
+          <w:rStyle w:val="VerbatimChar"/>
+        </w:rPr>
+        <w:t xml:space="preserve">/n</w:t>
+      </w:r>
+    </w:p>
+    <w:p>
+      <w:pPr>
+        <w:pStyle w:val="FirstParagraph"/>
+      </w:pPr>
+      <w:r>
+        <w:t xml:space="preserve">En vez de escribir los cuatro octetos, se cuenta cuántos bits a 1 tiene la máscara:</w:t>
+      </w:r>
+    </w:p>
     <w:p>
       <w:pPr>
         <w:pStyle w:val="SourceCode"/>
@@ -12178,7 +12153,7 @@
         <w:rPr>
           <w:rStyle w:val="VerbatimChar"/>
         </w:rPr>
-        <w:t xml:space="preserve">255.255.255.0  →  11111111.11111111.11111111.00000000</w:t>
+        <w:t xml:space="preserve">255.255.255.0  = /24   (24 bits a 1)</w:t>
       </w:r>
       <w:r>
         <w:br/>
@@ -12187,7 +12162,16 @@
         <w:rPr>
           <w:rStyle w:val="VerbatimChar"/>
         </w:rPr>
-        <w:t xml:space="preserve">                  │────── red (24 bits) ──────││ host │</w:t>
+        <w:t xml:space="preserve">255.255.255.192 = /26  (26 bits a 1)</w:t>
+      </w:r>
+      <w:r>
+        <w:br/>
+      </w:r>
+      <w:r>
+        <w:rPr>
+          <w:rStyle w:val="VerbatimChar"/>
+        </w:rPr>
+        <w:t xml:space="preserve">255.255.0.0    = /16   (16 bits a 1)</w:t>
       </w:r>
     </w:p>
     <w:p>
@@ -12195,37 +12179,16 @@
         <w:pStyle w:val="FirstParagraph"/>
       </w:pPr>
       <w:r>
-        <w:t xml:space="preserve">La forma decimal de la máscara sale de convertir cada octeto:</w:t>
-      </w:r>
-      <w:r>
-        <w:t xml:space="preserve"> </w:t>
-      </w:r>
-      <w:r>
-        <w:rPr>
-          <w:rStyle w:val="VerbatimChar"/>
-        </w:rPr>
-        <w:t xml:space="preserve">11111111</w:t>
-      </w:r>
-      <w:r>
-        <w:t xml:space="preserve"> </w:t>
-      </w:r>
-      <w:r>
-        <w:t xml:space="preserve">= 255,</w:t>
-      </w:r>
-      <w:r>
-        <w:t xml:space="preserve"> </w:t>
-      </w:r>
-      <w:r>
-        <w:rPr>
-          <w:rStyle w:val="VerbatimChar"/>
-        </w:rPr>
-        <w:t xml:space="preserve">00000000</w:t>
-      </w:r>
-      <w:r>
-        <w:t xml:space="preserve"> </w:t>
-      </w:r>
-      <w:r>
-        <w:t xml:space="preserve">= 0. Por eso la clásica</w:t>
+        <w:rPr>
+          <w:rStyle w:val="VerbatimChar"/>
+        </w:rPr>
+        <w:t xml:space="preserve">/24</w:t>
+      </w:r>
+      <w:r>
+        <w:t xml:space="preserve"> </w:t>
+      </w:r>
+      <w:r>
+        <w:t xml:space="preserve">y</w:t>
       </w:r>
       <w:r>
         <w:t xml:space="preserve"> </w:t>
@@ -12237,25 +12200,20 @@
         <w:t xml:space="preserve">255.255.255.0</w:t>
       </w:r>
       <w:r>
-        <w:t xml:space="preserve">.</w:t>
-      </w:r>
-    </w:p>
-    <w:bookmarkStart w:id="89" w:name="notación-cidr-n"/>
+        <w:t xml:space="preserve"> </w:t>
+      </w:r>
+      <w:r>
+        <w:t xml:space="preserve">son exactamente lo mismo, dicho de dos formas.</w:t>
+      </w:r>
+    </w:p>
+    <w:bookmarkEnd w:id="95"/>
+    <w:bookmarkStart w:id="96" w:name="de-dónde-sale-el-decimal-de-una-máscara"/>
     <w:p>
       <w:pPr>
         <w:pStyle w:val="Heading3"/>
       </w:pPr>
       <w:r>
-        <w:t xml:space="preserve">Notación CIDR:</w:t>
-      </w:r>
-      <w:r>
-        <w:t xml:space="preserve"> </w:t>
-      </w:r>
-      <w:r>
-        <w:rPr>
-          <w:rStyle w:val="VerbatimChar"/>
-        </w:rPr>
-        <w:t xml:space="preserve">/n</w:t>
+        <w:t xml:space="preserve">¿De dónde sale el decimal de una máscara?</w:t>
       </w:r>
     </w:p>
     <w:p>
@@ -12263,7 +12221,20 @@
         <w:pStyle w:val="FirstParagraph"/>
       </w:pPr>
       <w:r>
-        <w:t xml:space="preserve">En vez de escribir los cuatro octetos, se cuenta cuántos bits a 1 tiene la máscara:</w:t>
+        <w:t xml:space="preserve">Cada octeto de la máscara solo puede ser (en notación de 8 bits) un grupo de</w:t>
+      </w:r>
+      <w:r>
+        <w:t xml:space="preserve"> </w:t>
+      </w:r>
+      <w:r>
+        <w:rPr>
+          <w:b/>
+          <w:bCs/>
+        </w:rPr>
+        <w:t xml:space="preserve">unos consecutivos seguidos de ceros</w:t>
+      </w:r>
+      <w:r>
+        <w:t xml:space="preserve">. Los valores posibles, del más sencillo al más denso:</w:t>
       </w:r>
     </w:p>
     <w:p>
@@ -12274,7 +12245,7 @@
         <w:rPr>
           <w:rStyle w:val="VerbatimChar"/>
         </w:rPr>
-        <w:t xml:space="preserve">255.255.255.0  = /24   (24 bits a 1)</w:t>
+        <w:t xml:space="preserve">00000000 = 0      · 10000000 = 128</w:t>
       </w:r>
       <w:r>
         <w:br/>
@@ -12283,7 +12254,7 @@
         <w:rPr>
           <w:rStyle w:val="VerbatimChar"/>
         </w:rPr>
-        <w:t xml:space="preserve">255.255.255.192 = /26  (26 bits a 1)</w:t>
+        <w:t xml:space="preserve">11000000 = 192    · 11100000 = 224</w:t>
       </w:r>
       <w:r>
         <w:br/>
@@ -12292,7 +12263,25 @@
         <w:rPr>
           <w:rStyle w:val="VerbatimChar"/>
         </w:rPr>
-        <w:t xml:space="preserve">255.255.0.0    = /16   (16 bits a 1)</w:t>
+        <w:t xml:space="preserve">11110000 = 240    · 11111000 = 248</w:t>
+      </w:r>
+      <w:r>
+        <w:br/>
+      </w:r>
+      <w:r>
+        <w:rPr>
+          <w:rStyle w:val="VerbatimChar"/>
+        </w:rPr>
+        <w:t xml:space="preserve">11111100 = 252    · 11111110 = 254</w:t>
+      </w:r>
+      <w:r>
+        <w:br/>
+      </w:r>
+      <w:r>
+        <w:rPr>
+          <w:rStyle w:val="VerbatimChar"/>
+        </w:rPr>
+        <w:t xml:space="preserve">11111111 = 255</w:t>
       </w:r>
     </w:p>
     <w:p>
@@ -12300,116 +12289,6 @@
         <w:pStyle w:val="FirstParagraph"/>
       </w:pPr>
       <w:r>
-        <w:rPr>
-          <w:rStyle w:val="VerbatimChar"/>
-        </w:rPr>
-        <w:t xml:space="preserve">/24</w:t>
-      </w:r>
-      <w:r>
-        <w:t xml:space="preserve"> </w:t>
-      </w:r>
-      <w:r>
-        <w:t xml:space="preserve">y</w:t>
-      </w:r>
-      <w:r>
-        <w:t xml:space="preserve"> </w:t>
-      </w:r>
-      <w:r>
-        <w:rPr>
-          <w:rStyle w:val="VerbatimChar"/>
-        </w:rPr>
-        <w:t xml:space="preserve">255.255.255.0</w:t>
-      </w:r>
-      <w:r>
-        <w:t xml:space="preserve"> </w:t>
-      </w:r>
-      <w:r>
-        <w:t xml:space="preserve">son exactamente lo mismo, dicho de dos formas.</w:t>
-      </w:r>
-    </w:p>
-    <w:bookmarkEnd w:id="89"/>
-    <w:bookmarkStart w:id="90" w:name="de-dónde-sale-el-decimal-de-una-máscara"/>
-    <w:p>
-      <w:pPr>
-        <w:pStyle w:val="Heading3"/>
-      </w:pPr>
-      <w:r>
-        <w:t xml:space="preserve">¿De dónde sale el decimal de una máscara?</w:t>
-      </w:r>
-    </w:p>
-    <w:p>
-      <w:pPr>
-        <w:pStyle w:val="FirstParagraph"/>
-      </w:pPr>
-      <w:r>
-        <w:t xml:space="preserve">Cada octeto de la máscara solo puede ser (en notación de 8 bits) un grupo de</w:t>
-      </w:r>
-      <w:r>
-        <w:t xml:space="preserve"> </w:t>
-      </w:r>
-      <w:r>
-        <w:rPr>
-          <w:b/>
-          <w:bCs/>
-        </w:rPr>
-        <w:t xml:space="preserve">unos consecutivos seguidos de ceros</w:t>
-      </w:r>
-      <w:r>
-        <w:t xml:space="preserve">. Los valores posibles, del más sencillo al más denso:</w:t>
-      </w:r>
-    </w:p>
-    <w:p>
-      <w:pPr>
-        <w:pStyle w:val="SourceCode"/>
-      </w:pPr>
-      <w:r>
-        <w:rPr>
-          <w:rStyle w:val="VerbatimChar"/>
-        </w:rPr>
-        <w:t xml:space="preserve">00000000 = 0      · 10000000 = 128</w:t>
-      </w:r>
-      <w:r>
-        <w:br/>
-      </w:r>
-      <w:r>
-        <w:rPr>
-          <w:rStyle w:val="VerbatimChar"/>
-        </w:rPr>
-        <w:t xml:space="preserve">11000000 = 192    · 11100000 = 224</w:t>
-      </w:r>
-      <w:r>
-        <w:br/>
-      </w:r>
-      <w:r>
-        <w:rPr>
-          <w:rStyle w:val="VerbatimChar"/>
-        </w:rPr>
-        <w:t xml:space="preserve">11110000 = 240    · 11111000 = 248</w:t>
-      </w:r>
-      <w:r>
-        <w:br/>
-      </w:r>
-      <w:r>
-        <w:rPr>
-          <w:rStyle w:val="VerbatimChar"/>
-        </w:rPr>
-        <w:t xml:space="preserve">11111100 = 252    · 11111110 = 254</w:t>
-      </w:r>
-      <w:r>
-        <w:br/>
-      </w:r>
-      <w:r>
-        <w:rPr>
-          <w:rStyle w:val="VerbatimChar"/>
-        </w:rPr>
-        <w:t xml:space="preserve">11111111 = 255</w:t>
-      </w:r>
-    </w:p>
-    <w:p>
-      <w:pPr>
-        <w:pStyle w:val="FirstParagraph"/>
-      </w:pPr>
-      <w:r>
         <w:t xml:space="preserve">Solo existen esos 9 valores por octeto. Si un día</w:t>
       </w:r>
       <w:r>
@@ -12425,8 +12304,8 @@
         <w:t xml:space="preserve">un octeto de máscara distinto (como 172, por ejemplo), es que algo está mal configurado: la máscara siempre es una racha de 1s y después 0s.</w:t>
       </w:r>
     </w:p>
-    <w:bookmarkEnd w:id="90"/>
-    <w:bookmarkStart w:id="91" w:name="cálculo-mental-sin-tabla"/>
+    <w:bookmarkEnd w:id="96"/>
+    <w:bookmarkStart w:id="97" w:name="cálculo-mental-sin-tabla"/>
     <w:p>
       <w:pPr>
         <w:pStyle w:val="Heading3"/>
@@ -12537,9 +12416,9 @@
         </w:pict>
       </w:r>
     </w:p>
-    <w:bookmarkEnd w:id="91"/>
-    <w:bookmarkEnd w:id="92"/>
-    <w:bookmarkStart w:id="94" w:name="tabla-rápida-de-máscaras"/>
+    <w:bookmarkEnd w:id="97"/>
+    <w:bookmarkEnd w:id="98"/>
+    <w:bookmarkStart w:id="100" w:name="tabla-rápida-de-máscaras"/>
     <w:p>
       <w:pPr>
         <w:pStyle w:val="Heading2"/>
@@ -13494,7 +13373,7 @@
         <w:t xml:space="preserve">).</w:t>
       </w:r>
     </w:p>
-    <w:bookmarkStart w:id="93" w:name="cómo-leer-la-tabla"/>
+    <w:bookmarkStart w:id="99" w:name="cómo-leer-la-tabla"/>
     <w:p>
       <w:pPr>
         <w:pStyle w:val="Heading3"/>
@@ -13610,9 +13489,9 @@
         </w:pict>
       </w:r>
     </w:p>
-    <w:bookmarkEnd w:id="93"/>
-    <w:bookmarkEnd w:id="94"/>
-    <w:bookmarkStart w:id="95" w:name="mini-chequeo-4"/>
+    <w:bookmarkEnd w:id="99"/>
+    <w:bookmarkEnd w:id="100"/>
+    <w:bookmarkStart w:id="101" w:name="mini-chequeo-4"/>
     <w:p>
       <w:pPr>
         <w:pStyle w:val="Heading2"/>
@@ -13833,8 +13712,8 @@
         </w:pict>
       </w:r>
     </w:p>
-    <w:bookmarkEnd w:id="95"/>
-    <w:bookmarkStart w:id="96" w:name="resumen-en-3-frases-4"/>
+    <w:bookmarkEnd w:id="101"/>
+    <w:bookmarkStart w:id="102" w:name="resumen-en-3-frases-4"/>
     <w:p>
       <w:pPr>
         <w:pStyle w:val="Heading2"/>
@@ -13936,8 +13815,8 @@
         <w:t xml:space="preserve">: se descuentan la red y el broadcast.</w:t>
       </w:r>
     </w:p>
-    <w:bookmarkEnd w:id="96"/>
-    <w:bookmarkStart w:id="97" w:name="vocabulario-rápido-4"/>
+    <w:bookmarkEnd w:id="102"/>
+    <w:bookmarkStart w:id="103" w:name="vocabulario-rápido-4"/>
     <w:p>
       <w:pPr>
         <w:pStyle w:val="Heading2"/>
@@ -14121,7 +14000,7 @@
       <w:r>
         <w:t xml:space="preserve"> </w:t>
       </w:r>
-      <w:hyperlink r:id="rId52">
+      <w:hyperlink r:id="rId55">
         <w:r>
           <w:rPr>
             <w:rStyle w:val="Hyperlink"/>
@@ -14184,9 +14063,9 @@
         </w:r>
       </w:hyperlink>
     </w:p>
-    <w:bookmarkEnd w:id="97"/>
-    <w:bookmarkEnd w:id="98"/>
-    <w:bookmarkStart w:id="107" w:name="subnetting-paso-a-paso"/>
+    <w:bookmarkEnd w:id="103"/>
+    <w:bookmarkEnd w:id="104"/>
+    <w:bookmarkStart w:id="116" w:name="subnetting-paso-a-paso"/>
     <w:p>
       <w:pPr>
         <w:pStyle w:val="Heading1"/>
@@ -14250,7 +14129,7 @@
         </w:pict>
       </w:r>
     </w:p>
-    <w:bookmarkStart w:id="99" w:name="la-idea-en-una-frase-5"/>
+    <w:bookmarkStart w:id="105" w:name="la-idea-en-una-frase-5"/>
     <w:p>
       <w:pPr>
         <w:pStyle w:val="Heading2"/>
@@ -14355,8 +14234,8 @@
         </w:pict>
       </w:r>
     </w:p>
-    <w:bookmarkEnd w:id="99"/>
-    <w:bookmarkStart w:id="101" w:name="las-fórmulas-clave"/>
+    <w:bookmarkEnd w:id="105"/>
+    <w:bookmarkStart w:id="107" w:name="las-fórmulas-clave"/>
     <w:p>
       <w:pPr>
         <w:pStyle w:val="Heading2"/>
@@ -14522,7 +14401,7 @@
         <w:t xml:space="preserve">divertida es el /31, pero no los veremos en clase: se usa en enlaces punto a punto de algunos ISP.)</w:t>
       </w:r>
     </w:p>
-    <w:bookmarkStart w:id="100" w:name="paso-a-paso-mental-4-pasos"/>
+    <w:bookmarkStart w:id="106" w:name="paso-a-paso-mental-4-pasos"/>
     <w:p>
       <w:pPr>
         <w:pStyle w:val="Heading3"/>
@@ -14680,9 +14559,9 @@
         </w:pict>
       </w:r>
     </w:p>
-    <w:bookmarkEnd w:id="100"/>
-    <w:bookmarkEnd w:id="101"/>
-    <w:bookmarkStart w:id="102" w:name="X04a7d0074236ee518f21cb1bf76c8812962ef90"/>
+    <w:bookmarkEnd w:id="106"/>
+    <w:bookmarkEnd w:id="107"/>
+    <w:bookmarkStart w:id="111" w:name="X04a7d0074236ee518f21cb1bf76c8812962ef90"/>
     <w:p>
       <w:pPr>
         <w:pStyle w:val="Heading2"/>
@@ -15187,6 +15066,70 @@
     </w:tbl>
     <w:p>
       <w:pPr>
+        <w:pStyle w:val="CaptionedFigure"/>
+      </w:pPr>
+      <w:r>
+        <w:drawing>
+          <wp:inline>
+            <wp:extent cx="5334000" cy="2580032"/>
+            <wp:effectExtent b="0" l="0" r="0" t="0"/>
+            <wp:docPr descr="Subnetting de 192.168.1.0/24 en cuatro subredes /26 con sus rangos de hosts y broadcast" title="" id="109" name="Picture"/>
+            <a:graphic>
+              <a:graphicData uri="http://schemas.openxmlformats.org/drawingml/2006/picture">
+                <pic:pic>
+                  <pic:nvPicPr>
+                    <pic:cNvPr descr="public/diagrams/u03-subnetting-bloque.svg" id="110" name="Picture"/>
+                    <pic:cNvPicPr>
+                      <a:picLocks noChangeArrowheads="1" noChangeAspect="1"/>
+                    </pic:cNvPicPr>
+                  </pic:nvPicPr>
+                  <pic:blipFill>
+                    <a:blip>
+                      <a:extLst>
+                        <a:ext uri="{28A0092B-C50C-407E-A947-70E740481C1C}">
+                          <a14:useLocalDpi xmlns:a14="http://schemas.microsoft.com/office/drawing/2010/main" val="0"/>
+                        </a:ext>
+                        <a:ext uri="{96DAC541-7B7A-43D3-8B79-37D633B846F1}">
+                          <asvg:svgBlip xmlns:asvg="http://schemas.microsoft.com/office/drawing/2016/SVG/main" r:embed="rId108"/>
+                        </a:ext>
+                      </a:extLst>
+                    </a:blip>
+                    <a:stretch>
+                      <a:fillRect/>
+                    </a:stretch>
+                  </pic:blipFill>
+                  <pic:spPr bwMode="auto">
+                    <a:xfrm>
+                      <a:off x="0" y="0"/>
+                      <a:ext cx="5334000" cy="2580032"/>
+                    </a:xfrm>
+                    <a:prstGeom prst="rect">
+                      <a:avLst/>
+                    </a:prstGeom>
+                    <a:noFill/>
+                    <a:ln w="9525">
+                      <a:noFill/>
+                      <a:headEnd/>
+                      <a:tailEnd/>
+                    </a:ln>
+                  </pic:spPr>
+                </pic:pic>
+              </a:graphicData>
+            </a:graphic>
+          </wp:inline>
+        </w:drawing>
+      </w:r>
+    </w:p>
+    <w:p>
+      <w:pPr>
+        <w:pStyle w:val="ImageCaption"/>
+      </w:pPr>
+      <w:r>
+        <w:t xml:space="preserve">Subnetting de 192.168.1.0/24 en cuatro subredes /26 con sus rangos de hosts y broadcast</w:t>
+      </w:r>
+    </w:p>
+    <w:p>
+      <w:pPr>
         <w:pStyle w:val="BlockText"/>
       </w:pPr>
       <w:r>
@@ -15261,8 +15204,8 @@
         </w:pict>
       </w:r>
     </w:p>
-    <w:bookmarkEnd w:id="102"/>
-    <w:bookmarkStart w:id="103" w:name="para-qué-sirve-realmente-subnetear"/>
+    <w:bookmarkEnd w:id="111"/>
+    <w:bookmarkStart w:id="112" w:name="para-qué-sirve-realmente-subnetear"/>
     <w:p>
       <w:pPr>
         <w:pStyle w:val="Heading2"/>
@@ -15421,8 +15364,8 @@
         </w:pict>
       </w:r>
     </w:p>
-    <w:bookmarkEnd w:id="103"/>
-    <w:bookmarkStart w:id="104" w:name="mini-chequeo-5"/>
+    <w:bookmarkEnd w:id="112"/>
+    <w:bookmarkStart w:id="113" w:name="mini-chequeo-5"/>
     <w:p>
       <w:pPr>
         <w:pStyle w:val="Heading2"/>
@@ -15663,8 +15606,8 @@
         </w:pict>
       </w:r>
     </w:p>
-    <w:bookmarkEnd w:id="104"/>
-    <w:bookmarkStart w:id="105" w:name="resumen-en-3-frases-5"/>
+    <w:bookmarkEnd w:id="113"/>
+    <w:bookmarkStart w:id="114" w:name="resumen-en-3-frases-5"/>
     <w:p>
       <w:pPr>
         <w:pStyle w:val="Heading2"/>
@@ -15770,8 +15713,8 @@
         <w:t xml:space="preserve">, y con él se construyen red, rangos de hosts y broadcast.</w:t>
       </w:r>
     </w:p>
-    <w:bookmarkEnd w:id="105"/>
-    <w:bookmarkStart w:id="106" w:name="vocabulario-rápido-5"/>
+    <w:bookmarkEnd w:id="114"/>
+    <w:bookmarkStart w:id="115" w:name="vocabulario-rápido-5"/>
     <w:p>
       <w:pPr>
         <w:pStyle w:val="Heading2"/>
@@ -15956,7 +15899,7 @@
       <w:r>
         <w:t xml:space="preserve"> </w:t>
       </w:r>
-      <w:hyperlink r:id="rId52">
+      <w:hyperlink r:id="rId55">
         <w:r>
           <w:rPr>
             <w:rStyle w:val="Hyperlink"/>
@@ -16019,9 +15962,9 @@
         </w:r>
       </w:hyperlink>
     </w:p>
-    <w:bookmarkEnd w:id="106"/>
-    <w:bookmarkEnd w:id="107"/>
-    <w:bookmarkStart w:id="119" w:name="vlsm"/>
+    <w:bookmarkEnd w:id="115"/>
+    <w:bookmarkEnd w:id="116"/>
+    <w:bookmarkStart w:id="128" w:name="vlsm"/>
     <w:p>
       <w:pPr>
         <w:pStyle w:val="Heading1"/>
@@ -16085,7 +16028,7 @@
         </w:pict>
       </w:r>
     </w:p>
-    <w:bookmarkStart w:id="108" w:name="la-idea-en-una-frase-6"/>
+    <w:bookmarkStart w:id="117" w:name="la-idea-en-una-frase-6"/>
     <w:p>
       <w:pPr>
         <w:pStyle w:val="Heading2"/>
@@ -16153,8 +16096,8 @@
         </w:pict>
       </w:r>
     </w:p>
-    <w:bookmarkEnd w:id="108"/>
-    <w:bookmarkStart w:id="109" w:name="la-regla-de-oro-del-vlsm"/>
+    <w:bookmarkEnd w:id="117"/>
+    <w:bookmarkStart w:id="118" w:name="la-regla-de-oro-del-vlsm"/>
     <w:p>
       <w:pPr>
         <w:pStyle w:val="Heading2"/>
@@ -16332,8 +16275,8 @@
         </w:pict>
       </w:r>
     </w:p>
-    <w:bookmarkEnd w:id="109"/>
-    <w:bookmarkStart w:id="114" w:name="ejemplo-resuelto-192.168.1.024"/>
+    <w:bookmarkEnd w:id="118"/>
+    <w:bookmarkStart w:id="123" w:name="ejemplo-resuelto-192.168.1.024"/>
     <w:p>
       <w:pPr>
         <w:pStyle w:val="Heading2"/>
@@ -16562,7 +16505,7 @@
         <w:t xml:space="preserve">Calcular cada subred, una detrás de la anterior.</w:t>
       </w:r>
     </w:p>
-    <w:bookmarkStart w:id="110" w:name="ventas-100-hosts"/>
+    <w:bookmarkStart w:id="119" w:name="ventas-100-hosts"/>
     <w:p>
       <w:pPr>
         <w:pStyle w:val="Heading3"/>
@@ -16650,8 +16593,8 @@
         <w:t xml:space="preserve">Hosts: 192.168.1.1 - 192.168.1.126 · Broadcast: 192.168.1.127</w:t>
       </w:r>
     </w:p>
-    <w:bookmarkEnd w:id="110"/>
-    <w:bookmarkStart w:id="111" w:name="rrhh-30-hosts"/>
+    <w:bookmarkEnd w:id="119"/>
+    <w:bookmarkStart w:id="120" w:name="rrhh-30-hosts"/>
     <w:p>
       <w:pPr>
         <w:pStyle w:val="Heading3"/>
@@ -16724,8 +16667,8 @@
         <w:t xml:space="preserve">Hosts: 192.168.1.129 - 192.168.1.158 · Broadcast: 192.168.1.159</w:t>
       </w:r>
     </w:p>
-    <w:bookmarkEnd w:id="111"/>
-    <w:bookmarkStart w:id="112" w:name="it-20-hosts"/>
+    <w:bookmarkEnd w:id="120"/>
+    <w:bookmarkStart w:id="121" w:name="it-20-hosts"/>
     <w:p>
       <w:pPr>
         <w:pStyle w:val="Heading3"/>
@@ -16798,8 +16741,8 @@
         <w:t xml:space="preserve">Hosts: 192.168.1.161 - 192.168.1.190 · Broadcast: 192.168.1.191</w:t>
       </w:r>
     </w:p>
-    <w:bookmarkEnd w:id="112"/>
-    <w:bookmarkStart w:id="113" w:name="dirección-5-hosts"/>
+    <w:bookmarkEnd w:id="121"/>
+    <w:bookmarkStart w:id="122" w:name="dirección-5-hosts"/>
     <w:p>
       <w:pPr>
         <w:pStyle w:val="Heading3"/>
@@ -17414,9 +17357,9 @@
         </w:pict>
       </w:r>
     </w:p>
-    <w:bookmarkEnd w:id="113"/>
-    <w:bookmarkEnd w:id="114"/>
-    <w:bookmarkStart w:id="115" w:name="X68b0f977d657e631dc72b1f03ebe6301f37c994"/>
+    <w:bookmarkEnd w:id="122"/>
+    <w:bookmarkEnd w:id="123"/>
+    <w:bookmarkStart w:id="124" w:name="X68b0f977d657e631dc72b1f03ebe6301f37c994"/>
     <w:p>
       <w:pPr>
         <w:pStyle w:val="Heading2"/>
@@ -17637,8 +17580,8 @@
         </w:pict>
       </w:r>
     </w:p>
-    <w:bookmarkEnd w:id="115"/>
-    <w:bookmarkStart w:id="116" w:name="mini-chequeo-6"/>
+    <w:bookmarkEnd w:id="124"/>
+    <w:bookmarkStart w:id="125" w:name="mini-chequeo-6"/>
     <w:p>
       <w:pPr>
         <w:pStyle w:val="Heading2"/>
@@ -17792,8 +17735,8 @@
         </w:pict>
       </w:r>
     </w:p>
-    <w:bookmarkEnd w:id="116"/>
-    <w:bookmarkStart w:id="117" w:name="resumen-en-3-frases-6"/>
+    <w:bookmarkEnd w:id="125"/>
+    <w:bookmarkStart w:id="126" w:name="resumen-en-3-frases-6"/>
     <w:p>
       <w:pPr>
         <w:pStyle w:val="Heading2"/>
@@ -17898,8 +17841,8 @@
         <w:t xml:space="preserve">En redes con tamaños desiguales, VLSM ahorra IPs y retrasa el agotamiento del bloque.</w:t>
       </w:r>
     </w:p>
-    <w:bookmarkEnd w:id="117"/>
-    <w:bookmarkStart w:id="118" w:name="vocabulario-rápido-6"/>
+    <w:bookmarkEnd w:id="126"/>
+    <w:bookmarkStart w:id="127" w:name="vocabulario-rápido-6"/>
     <w:p>
       <w:pPr>
         <w:pStyle w:val="Heading2"/>
@@ -18083,7 +18026,7 @@
       <w:r>
         <w:t xml:space="preserve"> </w:t>
       </w:r>
-      <w:hyperlink r:id="rId52">
+      <w:hyperlink r:id="rId55">
         <w:r>
           <w:rPr>
             <w:rStyle w:val="Hyperlink"/>
@@ -18146,9 +18089,9 @@
         </w:r>
       </w:hyperlink>
     </w:p>
-    <w:bookmarkEnd w:id="118"/>
-    <w:bookmarkEnd w:id="119"/>
-    <w:bookmarkStart w:id="133" w:name="dhcp"/>
+    <w:bookmarkEnd w:id="127"/>
+    <w:bookmarkEnd w:id="128"/>
+    <w:bookmarkStart w:id="142" w:name="dhcp"/>
     <w:p>
       <w:pPr>
         <w:pStyle w:val="Heading1"/>
@@ -18212,7 +18155,7 @@
         </w:pict>
       </w:r>
     </w:p>
-    <w:bookmarkStart w:id="120" w:name="la-idea-en-una-frase-7"/>
+    <w:bookmarkStart w:id="129" w:name="la-idea-en-una-frase-7"/>
     <w:p>
       <w:pPr>
         <w:pStyle w:val="Heading2"/>
@@ -18299,8 +18242,8 @@
         </w:pict>
       </w:r>
     </w:p>
-    <w:bookmarkEnd w:id="120"/>
-    <w:bookmarkStart w:id="125" w:name="el-proceso-dora"/>
+    <w:bookmarkEnd w:id="129"/>
+    <w:bookmarkStart w:id="134" w:name="el-proceso-dora"/>
     <w:p>
       <w:pPr>
         <w:pStyle w:val="Heading2"/>
@@ -18364,62 +18307,6 @@
       </w:r>
       <w:r>
         <w:t xml:space="preserve">.</w:t>
-      </w:r>
-    </w:p>
-    <w:p>
-      <w:pPr>
-        <w:pStyle w:val="SourceCode"/>
-      </w:pPr>
-      <w:r>
-        <w:rPr>
-          <w:rStyle w:val="VerbatimChar"/>
-        </w:rPr>
-        <w:t xml:space="preserve">PC                         Servidor DHCP</w:t>
-      </w:r>
-      <w:r>
-        <w:br/>
-      </w:r>
-      <w:r>
-        <w:rPr>
-          <w:rStyle w:val="VerbatimChar"/>
-        </w:rPr>
-        <w:t xml:space="preserve"> │                              │</w:t>
-      </w:r>
-      <w:r>
-        <w:br/>
-      </w:r>
-      <w:r>
-        <w:rPr>
-          <w:rStyle w:val="VerbatimChar"/>
-        </w:rPr>
-        <w:t xml:space="preserve"> ├──── DHCP DISCOVER ─────────►│  Búsqueda de servidor DHCP</w:t>
-      </w:r>
-      <w:r>
-        <w:br/>
-      </w:r>
-      <w:r>
-        <w:rPr>
-          <w:rStyle w:val="VerbatimChar"/>
-        </w:rPr>
-        <w:t xml:space="preserve"> │◄──── DHCP OFFER ────────────┤  Oferta: "Toma 192.168.1.20"</w:t>
-      </w:r>
-      <w:r>
-        <w:br/>
-      </w:r>
-      <w:r>
-        <w:rPr>
-          <w:rStyle w:val="VerbatimChar"/>
-        </w:rPr>
-        <w:t xml:space="preserve"> ├──── DHCP REQUEST ──────────►│  Aceptación: "Quiero esa IP"</w:t>
-      </w:r>
-      <w:r>
-        <w:br/>
-      </w:r>
-      <w:r>
-        <w:rPr>
-          <w:rStyle w:val="VerbatimChar"/>
-        </w:rPr>
-        <w:t xml:space="preserve"> │◄──── DHCP ACK ──────────────┤  Confirmación: "Es tuya"</w:t>
       </w:r>
     </w:p>
     <w:p>
@@ -18531,12 +18418,12 @@
           <wp:inline>
             <wp:extent cx="5334000" cy="3900889"/>
             <wp:effectExtent b="0" l="0" r="0" t="0"/>
-            <wp:docPr descr="Secuencia DORA: Discover, Offer, Request y ACK entre PC y servidor DHCP" title="" id="122" name="Picture"/>
+            <wp:docPr descr="Secuencia DORA: Discover, Offer, Request y ACK entre PC y servidor DHCP" title="" id="131" name="Picture"/>
             <a:graphic>
               <a:graphicData uri="http://schemas.openxmlformats.org/drawingml/2006/picture">
                 <pic:pic>
                   <pic:nvPicPr>
-                    <pic:cNvPr descr="public/diagrams/u03-dora.svg" id="123" name="Picture"/>
+                    <pic:cNvPr descr="public/diagrams/u03-dora.svg" id="132" name="Picture"/>
                     <pic:cNvPicPr>
                       <a:picLocks noChangeArrowheads="1" noChangeAspect="1"/>
                     </pic:cNvPicPr>
@@ -18548,7 +18435,7 @@
                           <a14:useLocalDpi xmlns:a14="http://schemas.microsoft.com/office/drawing/2010/main" val="0"/>
                         </a:ext>
                         <a:ext uri="{96DAC541-7B7A-43D3-8B79-37D633B846F1}">
-                          <asvg:svgBlip xmlns:asvg="http://schemas.microsoft.com/office/drawing/2016/SVG/main" r:embed="rId121"/>
+                          <asvg:svgBlip xmlns:asvg="http://schemas.microsoft.com/office/drawing/2016/SVG/main" r:embed="rId130"/>
                         </a:ext>
                       </a:extLst>
                     </a:blip>
@@ -18637,7 +18524,7 @@
       <w:r>
         <w:t xml:space="preserve"> </w:t>
       </w:r>
-      <w:hyperlink r:id="rId124">
+      <w:hyperlink r:id="rId133">
         <w:r>
           <w:rPr>
             <w:rStyle w:val="Hyperlink"/>
@@ -18656,8 +18543,8 @@
         </w:pict>
       </w:r>
     </w:p>
-    <w:bookmarkEnd w:id="125"/>
-    <w:bookmarkStart w:id="126" w:name="configuración-en-un-router-cisco"/>
+    <w:bookmarkEnd w:id="134"/>
+    <w:bookmarkStart w:id="135" w:name="configuración-en-un-router-cisco"/>
     <w:p>
       <w:pPr>
         <w:pStyle w:val="Heading2"/>
@@ -18874,8 +18761,8 @@
         </w:pict>
       </w:r>
     </w:p>
-    <w:bookmarkEnd w:id="126"/>
-    <w:bookmarkStart w:id="127" w:name="dhcp-en-packet-tracer"/>
+    <w:bookmarkEnd w:id="135"/>
+    <w:bookmarkStart w:id="136" w:name="dhcp-en-packet-tracer"/>
     <w:p>
       <w:pPr>
         <w:pStyle w:val="Heading2"/>
@@ -19017,8 +18904,8 @@
         </w:pict>
       </w:r>
     </w:p>
-    <w:bookmarkEnd w:id="127"/>
-    <w:bookmarkStart w:id="129" w:name="por-qué-excluir-las-ips-estáticas"/>
+    <w:bookmarkEnd w:id="136"/>
+    <w:bookmarkStart w:id="138" w:name="por-qué-excluir-las-ips-estáticas"/>
     <w:p>
       <w:pPr>
         <w:pStyle w:val="Heading2"/>
@@ -19112,7 +18999,7 @@
       <w:r>
         <w:t xml:space="preserve"> </w:t>
       </w:r>
-      <w:hyperlink r:id="rId128">
+      <w:hyperlink r:id="rId137">
         <w:r>
           <w:rPr>
             <w:rStyle w:val="Hyperlink"/>
@@ -19134,8 +19021,8 @@
         </w:pict>
       </w:r>
     </w:p>
-    <w:bookmarkEnd w:id="129"/>
-    <w:bookmarkStart w:id="130" w:name="mini-chequeo-7"/>
+    <w:bookmarkEnd w:id="138"/>
+    <w:bookmarkStart w:id="139" w:name="mini-chequeo-7"/>
     <w:p>
       <w:pPr>
         <w:pStyle w:val="Heading2"/>
@@ -19315,8 +19202,8 @@
         </w:pict>
       </w:r>
     </w:p>
-    <w:bookmarkEnd w:id="130"/>
-    <w:bookmarkStart w:id="131" w:name="resumen-en-3-frases-7"/>
+    <w:bookmarkEnd w:id="139"/>
+    <w:bookmarkStart w:id="140" w:name="resumen-en-3-frases-7"/>
     <w:p>
       <w:pPr>
         <w:pStyle w:val="Heading2"/>
@@ -19472,8 +19359,8 @@
         <w:t xml:space="preserve">) para evitar conflictos de IP.</w:t>
       </w:r>
     </w:p>
-    <w:bookmarkEnd w:id="131"/>
-    <w:bookmarkStart w:id="132" w:name="vocabulario-rápido-7"/>
+    <w:bookmarkEnd w:id="140"/>
+    <w:bookmarkStart w:id="141" w:name="vocabulario-rápido-7"/>
     <w:p>
       <w:pPr>
         <w:pStyle w:val="Heading2"/>
@@ -19681,7 +19568,7 @@
       <w:r>
         <w:t xml:space="preserve"> </w:t>
       </w:r>
-      <w:hyperlink r:id="rId52">
+      <w:hyperlink r:id="rId55">
         <w:r>
           <w:rPr>
             <w:rStyle w:val="Hyperlink"/>
@@ -19744,9 +19631,9 @@
         </w:r>
       </w:hyperlink>
     </w:p>
-    <w:bookmarkEnd w:id="132"/>
-    <w:bookmarkEnd w:id="133"/>
-    <w:bookmarkStart w:id="143" w:name="estructura-de-ipv6"/>
+    <w:bookmarkEnd w:id="141"/>
+    <w:bookmarkEnd w:id="142"/>
+    <w:bookmarkStart w:id="152" w:name="estructura-de-ipv6"/>
     <w:p>
       <w:pPr>
         <w:pStyle w:val="Heading1"/>
@@ -19810,7 +19697,7 @@
         </w:pict>
       </w:r>
     </w:p>
-    <w:bookmarkStart w:id="134" w:name="la-idea-en-una-frase-8"/>
+    <w:bookmarkStart w:id="143" w:name="la-idea-en-una-frase-8"/>
     <w:p>
       <w:pPr>
         <w:pStyle w:val="Heading2"/>
@@ -19961,8 +19848,8 @@
         </w:pict>
       </w:r>
     </w:p>
-    <w:bookmarkEnd w:id="134"/>
-    <w:bookmarkStart w:id="135" w:name="por-qué-existe-ipv6-el-agotamiento"/>
+    <w:bookmarkEnd w:id="143"/>
+    <w:bookmarkStart w:id="144" w:name="por-qué-existe-ipv6-el-agotamiento"/>
     <w:p>
       <w:pPr>
         <w:pStyle w:val="Heading2"/>
@@ -20122,8 +20009,8 @@
         </w:pict>
       </w:r>
     </w:p>
-    <w:bookmarkEnd w:id="135"/>
-    <w:bookmarkStart w:id="137" w:name="anatomía-los-8-grupos-hexadecimales"/>
+    <w:bookmarkEnd w:id="144"/>
+    <w:bookmarkStart w:id="146" w:name="anatomía-los-8-grupos-hexadecimales"/>
     <w:p>
       <w:pPr>
         <w:pStyle w:val="Heading2"/>
@@ -20321,7 +20208,7 @@
         <w:t xml:space="preserve">     ≈ 3,4 × 10³⁸  →  más de 300 sextillones</w:t>
       </w:r>
     </w:p>
-    <w:bookmarkStart w:id="136" w:name="la-notación-en-práctica"/>
+    <w:bookmarkStart w:id="145" w:name="la-notación-en-práctica"/>
     <w:p>
       <w:pPr>
         <w:pStyle w:val="Heading3"/>
@@ -20433,9 +20320,9 @@
         </w:pict>
       </w:r>
     </w:p>
-    <w:bookmarkEnd w:id="136"/>
-    <w:bookmarkEnd w:id="137"/>
-    <w:bookmarkStart w:id="138" w:name="de-la-teoría-a-tu-ipconfig"/>
+    <w:bookmarkEnd w:id="145"/>
+    <w:bookmarkEnd w:id="146"/>
+    <w:bookmarkStart w:id="147" w:name="de-la-teoría-a-tu-ipconfig"/>
     <w:p>
       <w:pPr>
         <w:pStyle w:val="Heading2"/>
@@ -20744,8 +20631,8 @@
         </w:pict>
       </w:r>
     </w:p>
-    <w:bookmarkEnd w:id="138"/>
-    <w:bookmarkStart w:id="139" w:name="para-qué-tanta-dirección"/>
+    <w:bookmarkEnd w:id="147"/>
+    <w:bookmarkStart w:id="148" w:name="para-qué-tanta-dirección"/>
     <w:p>
       <w:pPr>
         <w:pStyle w:val="Heading2"/>
@@ -20849,8 +20736,8 @@
         </w:pict>
       </w:r>
     </w:p>
-    <w:bookmarkEnd w:id="139"/>
-    <w:bookmarkStart w:id="140" w:name="mini-chequeo-8"/>
+    <w:bookmarkEnd w:id="148"/>
+    <w:bookmarkStart w:id="149" w:name="mini-chequeo-8"/>
     <w:p>
       <w:pPr>
         <w:pStyle w:val="Heading2"/>
@@ -21091,8 +20978,8 @@
         </w:pict>
       </w:r>
     </w:p>
-    <w:bookmarkEnd w:id="140"/>
-    <w:bookmarkStart w:id="141" w:name="resumen-en-3-frases-8"/>
+    <w:bookmarkEnd w:id="149"/>
+    <w:bookmarkStart w:id="150" w:name="resumen-en-3-frases-8"/>
     <w:p>
       <w:pPr>
         <w:pStyle w:val="Heading2"/>
@@ -21169,8 +21056,8 @@
         <w:t xml:space="preserve">Con 3,4 × 10³⁸ direcciones, termina el racionamiento: cada dispositivo puede tener la suya, pública y única.</w:t>
       </w:r>
     </w:p>
-    <w:bookmarkEnd w:id="141"/>
-    <w:bookmarkStart w:id="142" w:name="vocabulario-rápido-8"/>
+    <w:bookmarkEnd w:id="150"/>
+    <w:bookmarkStart w:id="151" w:name="vocabulario-rápido-8"/>
     <w:p>
       <w:pPr>
         <w:pStyle w:val="Heading2"/>
@@ -21354,7 +21241,7 @@
       <w:r>
         <w:t xml:space="preserve"> </w:t>
       </w:r>
-      <w:hyperlink r:id="rId52">
+      <w:hyperlink r:id="rId55">
         <w:r>
           <w:rPr>
             <w:rStyle w:val="Hyperlink"/>
@@ -21417,9 +21304,9 @@
         </w:r>
       </w:hyperlink>
     </w:p>
-    <w:bookmarkEnd w:id="142"/>
-    <w:bookmarkEnd w:id="143"/>
-    <w:bookmarkStart w:id="154" w:name="compresión-y-prefijos"/>
+    <w:bookmarkEnd w:id="151"/>
+    <w:bookmarkEnd w:id="152"/>
+    <w:bookmarkStart w:id="163" w:name="compresión-y-prefijos"/>
     <w:p>
       <w:pPr>
         <w:pStyle w:val="Heading1"/>
@@ -21483,7 +21370,7 @@
         </w:pict>
       </w:r>
     </w:p>
-    <w:bookmarkStart w:id="144" w:name="la-idea-en-una-frase-9"/>
+    <w:bookmarkStart w:id="153" w:name="la-idea-en-una-frase-9"/>
     <w:p>
       <w:pPr>
         <w:pStyle w:val="Heading2"/>
@@ -21592,8 +21479,8 @@
         </w:pict>
       </w:r>
     </w:p>
-    <w:bookmarkEnd w:id="144"/>
-    <w:bookmarkStart w:id="145" w:name="regla-1-omitir-ceros-a-la-izquierda"/>
+    <w:bookmarkEnd w:id="153"/>
+    <w:bookmarkStart w:id="154" w:name="regla-1-omitir-ceros-a-la-izquierda"/>
     <w:p>
       <w:pPr>
         <w:pStyle w:val="Heading2"/>
@@ -21918,8 +21805,8 @@
         </w:pict>
       </w:r>
     </w:p>
-    <w:bookmarkEnd w:id="145"/>
-    <w:bookmarkStart w:id="147" w:name="regla-2-el-doble-dos-puntos"/>
+    <w:bookmarkEnd w:id="154"/>
+    <w:bookmarkStart w:id="156" w:name="regla-2-el-doble-dos-puntos"/>
     <w:p>
       <w:pPr>
         <w:pStyle w:val="Heading2"/>
@@ -22128,7 +22015,7 @@
         <w:t xml:space="preserve">  Un segundo :: sería ilegal.</w:t>
       </w:r>
     </w:p>
-    <w:bookmarkStart w:id="146" w:name="ejemplos-famosos"/>
+    <w:bookmarkStart w:id="155" w:name="ejemplos-famosos"/>
     <w:p>
       <w:pPr>
         <w:pStyle w:val="Heading3"/>
@@ -22230,9 +22117,9 @@
         </w:pict>
       </w:r>
     </w:p>
-    <w:bookmarkEnd w:id="146"/>
-    <w:bookmarkEnd w:id="147"/>
-    <w:bookmarkStart w:id="148" w:name="comprimir-y-descomprimir-paso-a-paso"/>
+    <w:bookmarkEnd w:id="155"/>
+    <w:bookmarkEnd w:id="156"/>
+    <w:bookmarkStart w:id="157" w:name="comprimir-y-descomprimir-paso-a-paso"/>
     <w:p>
       <w:pPr>
         <w:pStyle w:val="Heading2"/>
@@ -22464,8 +22351,8 @@
         </w:pict>
       </w:r>
     </w:p>
-    <w:bookmarkEnd w:id="148"/>
-    <w:bookmarkStart w:id="149" w:name="prefijos-32-48-y-64"/>
+    <w:bookmarkEnd w:id="157"/>
+    <w:bookmarkStart w:id="158" w:name="prefijos-32-48-y-64"/>
     <w:p>
       <w:pPr>
         <w:pStyle w:val="Heading2"/>
@@ -22773,8 +22660,8 @@
         </w:pict>
       </w:r>
     </w:p>
-    <w:bookmarkEnd w:id="149"/>
-    <w:bookmarkStart w:id="150" w:name="por-qué-64-es-el-estándar"/>
+    <w:bookmarkEnd w:id="158"/>
+    <w:bookmarkStart w:id="159" w:name="por-qué-64-es-el-estándar"/>
     <w:p>
       <w:pPr>
         <w:pStyle w:val="Heading2"/>
@@ -22940,8 +22827,8 @@
         </w:pict>
       </w:r>
     </w:p>
-    <w:bookmarkEnd w:id="150"/>
-    <w:bookmarkStart w:id="151" w:name="mini-chequeo-9"/>
+    <w:bookmarkEnd w:id="159"/>
+    <w:bookmarkStart w:id="160" w:name="mini-chequeo-9"/>
     <w:p>
       <w:pPr>
         <w:pStyle w:val="Heading2"/>
@@ -23247,8 +23134,8 @@
         </w:pict>
       </w:r>
     </w:p>
-    <w:bookmarkEnd w:id="151"/>
-    <w:bookmarkStart w:id="152" w:name="resumen-en-3-frases-9"/>
+    <w:bookmarkEnd w:id="160"/>
+    <w:bookmarkStart w:id="161" w:name="resumen-en-3-frases-9"/>
     <w:p>
       <w:pPr>
         <w:pStyle w:val="Heading2"/>
@@ -23360,8 +23247,8 @@
         <w:t xml:space="preserve">de subred porque deja 64 bits para el identificador de interfaz, habilitando SLAAC y EUI-64.</w:t>
       </w:r>
     </w:p>
-    <w:bookmarkEnd w:id="152"/>
-    <w:bookmarkStart w:id="153" w:name="vocabulario-rápido-9"/>
+    <w:bookmarkEnd w:id="161"/>
+    <w:bookmarkStart w:id="162" w:name="vocabulario-rápido-9"/>
     <w:p>
       <w:pPr>
         <w:pStyle w:val="Heading2"/>
@@ -23573,7 +23460,7 @@
       <w:r>
         <w:t xml:space="preserve"> </w:t>
       </w:r>
-      <w:hyperlink r:id="rId52">
+      <w:hyperlink r:id="rId55">
         <w:r>
           <w:rPr>
             <w:rStyle w:val="Hyperlink"/>
@@ -23636,9 +23523,9 @@
         </w:r>
       </w:hyperlink>
     </w:p>
-    <w:bookmarkEnd w:id="153"/>
-    <w:bookmarkEnd w:id="154"/>
-    <w:bookmarkStart w:id="165" w:name="tipos-de-direcciones"/>
+    <w:bookmarkEnd w:id="162"/>
+    <w:bookmarkEnd w:id="163"/>
+    <w:bookmarkStart w:id="174" w:name="tipos-de-direcciones"/>
     <w:p>
       <w:pPr>
         <w:pStyle w:val="Heading1"/>
@@ -23702,7 +23589,7 @@
         </w:pict>
       </w:r>
     </w:p>
-    <w:bookmarkStart w:id="155" w:name="la-idea-en-una-frase-10"/>
+    <w:bookmarkStart w:id="164" w:name="la-idea-en-una-frase-10"/>
     <w:p>
       <w:pPr>
         <w:pStyle w:val="Heading2"/>
@@ -23865,8 +23752,8 @@
         </w:pict>
       </w:r>
     </w:p>
-    <w:bookmarkEnd w:id="155"/>
-    <w:bookmarkStart w:id="159" w:name="unicast-un-solo-destinatario"/>
+    <w:bookmarkEnd w:id="164"/>
+    <w:bookmarkStart w:id="168" w:name="unicast-un-solo-destinatario"/>
     <w:p>
       <w:pPr>
         <w:pStyle w:val="Heading2"/>
@@ -24174,7 +24061,7 @@
         </w:tc>
       </w:tr>
     </w:tbl>
-    <w:bookmarkStart w:id="156" w:name="cómo-leer-el-prefijo-de-un-vistazo"/>
+    <w:bookmarkStart w:id="165" w:name="cómo-leer-el-prefijo-de-un-vistazo"/>
     <w:p>
       <w:pPr>
         <w:pStyle w:val="Heading3"/>
@@ -24375,8 +24262,8 @@
         <w:t xml:space="preserve">.</w:t>
       </w:r>
     </w:p>
-    <w:bookmarkEnd w:id="156"/>
-    <w:bookmarkStart w:id="157" w:name="link-local-la-que-nunca-falta"/>
+    <w:bookmarkEnd w:id="165"/>
+    <w:bookmarkStart w:id="166" w:name="link-local-la-que-nunca-falta"/>
     <w:p>
       <w:pPr>
         <w:pStyle w:val="Heading3"/>
@@ -24446,8 +24333,8 @@
         <w:t xml:space="preserve">con sus LLA sin que nadie configure nada, pero no pueden llegar a Internet con ellas.</w:t>
       </w:r>
     </w:p>
-    <w:bookmarkEnd w:id="157"/>
-    <w:bookmarkStart w:id="158" w:name="lectura-de-un-ipconfig-real"/>
+    <w:bookmarkEnd w:id="166"/>
+    <w:bookmarkStart w:id="167" w:name="lectura-de-un-ipconfig-real"/>
     <w:p>
       <w:pPr>
         <w:pStyle w:val="Heading3"/>
@@ -24601,9 +24488,9 @@
         </w:pict>
       </w:r>
     </w:p>
-    <w:bookmarkEnd w:id="158"/>
-    <w:bookmarkEnd w:id="159"/>
-    <w:bookmarkStart w:id="160" w:name="multicast-uno-para-muchos"/>
+    <w:bookmarkEnd w:id="167"/>
+    <w:bookmarkEnd w:id="168"/>
+    <w:bookmarkStart w:id="169" w:name="multicast-uno-para-muchos"/>
     <w:p>
       <w:pPr>
         <w:pStyle w:val="Heading2"/>
@@ -25013,8 +24900,8 @@
         </w:pict>
       </w:r>
     </w:p>
-    <w:bookmarkEnd w:id="160"/>
-    <w:bookmarkStart w:id="161" w:name="anycast-el-más-cercano-gana"/>
+    <w:bookmarkEnd w:id="169"/>
+    <w:bookmarkStart w:id="170" w:name="anycast-el-más-cercano-gana"/>
     <w:p>
       <w:pPr>
         <w:pStyle w:val="Heading2"/>
@@ -25216,8 +25103,8 @@
         </w:pict>
       </w:r>
     </w:p>
-    <w:bookmarkEnd w:id="161"/>
-    <w:bookmarkStart w:id="162" w:name="mini-chequeo-10"/>
+    <w:bookmarkEnd w:id="170"/>
+    <w:bookmarkStart w:id="171" w:name="mini-chequeo-10"/>
     <w:p>
       <w:pPr>
         <w:pStyle w:val="Heading2"/>
@@ -25590,8 +25477,8 @@
         </w:pict>
       </w:r>
     </w:p>
-    <w:bookmarkEnd w:id="162"/>
-    <w:bookmarkStart w:id="163" w:name="resumen-en-3-frases-10"/>
+    <w:bookmarkEnd w:id="171"/>
+    <w:bookmarkStart w:id="172" w:name="resumen-en-3-frases-10"/>
     <w:p>
       <w:pPr>
         <w:pStyle w:val="Heading2"/>
@@ -25733,8 +25620,8 @@
         <w:t xml:space="preserve">: es lo que hace escalable al DNS.</w:t>
       </w:r>
     </w:p>
-    <w:bookmarkEnd w:id="163"/>
-    <w:bookmarkStart w:id="164" w:name="vocabulario-rápido-10"/>
+    <w:bookmarkEnd w:id="172"/>
+    <w:bookmarkStart w:id="173" w:name="vocabulario-rápido-10"/>
     <w:p>
       <w:pPr>
         <w:pStyle w:val="Heading2"/>
@@ -25973,7 +25860,7 @@
       <w:r>
         <w:t xml:space="preserve"> </w:t>
       </w:r>
-      <w:hyperlink r:id="rId52">
+      <w:hyperlink r:id="rId55">
         <w:r>
           <w:rPr>
             <w:rStyle w:val="Hyperlink"/>
@@ -26036,9 +25923,9 @@
         </w:r>
       </w:hyperlink>
     </w:p>
-    <w:bookmarkEnd w:id="164"/>
-    <w:bookmarkEnd w:id="165"/>
-    <w:bookmarkStart w:id="175" w:name="eui-64-y-slaac"/>
+    <w:bookmarkEnd w:id="173"/>
+    <w:bookmarkEnd w:id="174"/>
+    <w:bookmarkStart w:id="184" w:name="eui-64-y-slaac"/>
     <w:p>
       <w:pPr>
         <w:pStyle w:val="Heading1"/>
@@ -26102,7 +25989,7 @@
         </w:pict>
       </w:r>
     </w:p>
-    <w:bookmarkStart w:id="166" w:name="la-idea-en-una-frase-11"/>
+    <w:bookmarkStart w:id="175" w:name="la-idea-en-una-frase-11"/>
     <w:p>
       <w:pPr>
         <w:pStyle w:val="Heading2"/>
@@ -26202,8 +26089,8 @@
         </w:pict>
       </w:r>
     </w:p>
-    <w:bookmarkEnd w:id="166"/>
-    <w:bookmarkStart w:id="167" w:name="eui-64-paso-a-paso"/>
+    <w:bookmarkEnd w:id="175"/>
+    <w:bookmarkStart w:id="176" w:name="eui-64-paso-a-paso"/>
     <w:p>
       <w:pPr>
         <w:pStyle w:val="Heading2"/>
@@ -26591,8 +26478,8 @@
         </w:pict>
       </w:r>
     </w:p>
-    <w:bookmarkEnd w:id="167"/>
-    <w:bookmarkStart w:id="168" w:name="y-ahora-qué-el-iid-prefijo-dirección"/>
+    <w:bookmarkEnd w:id="176"/>
+    <w:bookmarkStart w:id="177" w:name="y-ahora-qué-el-iid-prefijo-dirección"/>
     <w:p>
       <w:pPr>
         <w:pStyle w:val="Heading2"/>
@@ -26681,8 +26568,8 @@
         </w:pict>
       </w:r>
     </w:p>
-    <w:bookmarkEnd w:id="168"/>
-    <w:bookmarkStart w:id="169" w:name="privacy-extensions-rfc-4941"/>
+    <w:bookmarkEnd w:id="177"/>
+    <w:bookmarkStart w:id="178" w:name="privacy-extensions-rfc-4941"/>
     <w:p>
       <w:pPr>
         <w:pStyle w:val="Heading2"/>
@@ -26847,8 +26734,8 @@
         </w:pict>
       </w:r>
     </w:p>
-    <w:bookmarkEnd w:id="169"/>
-    <w:bookmarkStart w:id="170" w:name="slaac-la-autoconfiguración-sin-servidor"/>
+    <w:bookmarkEnd w:id="178"/>
+    <w:bookmarkStart w:id="179" w:name="slaac-la-autoconfiguración-sin-servidor"/>
     <w:p>
       <w:pPr>
         <w:pStyle w:val="Heading2"/>
@@ -27114,8 +27001,8 @@
         </w:pict>
       </w:r>
     </w:p>
-    <w:bookmarkEnd w:id="170"/>
-    <w:bookmarkStart w:id="171" w:name="ventajas-y-desventajas-de-slaac"/>
+    <w:bookmarkEnd w:id="179"/>
+    <w:bookmarkStart w:id="180" w:name="ventajas-y-desventajas-de-slaac"/>
     <w:p>
       <w:pPr>
         <w:pStyle w:val="Heading2"/>
@@ -27310,8 +27197,8 @@
         </w:pict>
       </w:r>
     </w:p>
-    <w:bookmarkEnd w:id="171"/>
-    <w:bookmarkStart w:id="172" w:name="mini-chequeo-11"/>
+    <w:bookmarkEnd w:id="180"/>
+    <w:bookmarkStart w:id="181" w:name="mini-chequeo-11"/>
     <w:p>
       <w:pPr>
         <w:pStyle w:val="Heading2"/>
@@ -27559,8 +27446,8 @@
         </w:pict>
       </w:r>
     </w:p>
-    <w:bookmarkEnd w:id="172"/>
-    <w:bookmarkStart w:id="173" w:name="resumen-en-3-frases-11"/>
+    <w:bookmarkEnd w:id="181"/>
+    <w:bookmarkStart w:id="182" w:name="resumen-en-3-frases-11"/>
     <w:p>
       <w:pPr>
         <w:pStyle w:val="Heading2"/>
@@ -27665,8 +27552,8 @@
         <w:t xml:space="preserve">existen porque el EUI-64 es predecible y rastrable; las temporales rompen el tracking.</w:t>
       </w:r>
     </w:p>
-    <w:bookmarkEnd w:id="173"/>
-    <w:bookmarkStart w:id="174" w:name="vocabulario-rápido-11"/>
+    <w:bookmarkEnd w:id="182"/>
+    <w:bookmarkStart w:id="183" w:name="vocabulario-rápido-11"/>
     <w:p>
       <w:pPr>
         <w:pStyle w:val="Heading2"/>
@@ -27851,7 +27738,7 @@
       <w:r>
         <w:t xml:space="preserve"> </w:t>
       </w:r>
-      <w:hyperlink r:id="rId52">
+      <w:hyperlink r:id="rId55">
         <w:r>
           <w:rPr>
             <w:rStyle w:val="Hyperlink"/>
@@ -27914,9 +27801,9 @@
         </w:r>
       </w:hyperlink>
     </w:p>
-    <w:bookmarkEnd w:id="174"/>
-    <w:bookmarkEnd w:id="175"/>
-    <w:bookmarkStart w:id="184" w:name="dhcpv6"/>
+    <w:bookmarkEnd w:id="183"/>
+    <w:bookmarkEnd w:id="184"/>
+    <w:bookmarkStart w:id="193" w:name="dhcpv6"/>
     <w:p>
       <w:pPr>
         <w:pStyle w:val="Heading1"/>
@@ -27980,7 +27867,7 @@
         </w:pict>
       </w:r>
     </w:p>
-    <w:bookmarkStart w:id="176" w:name="la-idea-en-una-frase-12"/>
+    <w:bookmarkStart w:id="185" w:name="la-idea-en-una-frase-12"/>
     <w:p>
       <w:pPr>
         <w:pStyle w:val="Heading2"/>
@@ -28109,8 +27996,8 @@
         </w:pict>
       </w:r>
     </w:p>
-    <w:bookmarkEnd w:id="176"/>
-    <w:bookmarkStart w:id="177" w:name="slaac-y-dhcpv6-no-son-enemigos"/>
+    <w:bookmarkEnd w:id="185"/>
+    <w:bookmarkStart w:id="186" w:name="slaac-y-dhcpv6-no-son-enemigos"/>
     <w:p>
       <w:pPr>
         <w:pStyle w:val="Heading2"/>
@@ -28231,8 +28118,8 @@
         </w:pict>
       </w:r>
     </w:p>
-    <w:bookmarkEnd w:id="177"/>
-    <w:bookmarkStart w:id="178" w:name="stateless-vs-stateful"/>
+    <w:bookmarkEnd w:id="186"/>
+    <w:bookmarkStart w:id="187" w:name="stateless-vs-stateful"/>
     <w:p>
       <w:pPr>
         <w:pStyle w:val="Heading2"/>
@@ -28562,8 +28449,8 @@
         </w:pict>
       </w:r>
     </w:p>
-    <w:bookmarkEnd w:id="178"/>
-    <w:bookmarkStart w:id="179" w:name="X688fba4ed0b74ed660891ab8b218d20925ef06f"/>
+    <w:bookmarkEnd w:id="187"/>
+    <w:bookmarkStart w:id="188" w:name="X688fba4ed0b74ed660891ab8b218d20925ef06f"/>
     <w:p>
       <w:pPr>
         <w:pStyle w:val="Heading2"/>
@@ -28996,8 +28883,8 @@
         </w:pict>
       </w:r>
     </w:p>
-    <w:bookmarkEnd w:id="179"/>
-    <w:bookmarkStart w:id="180" w:name="cuándo-usar-cada-modo"/>
+    <w:bookmarkEnd w:id="188"/>
+    <w:bookmarkStart w:id="189" w:name="cuándo-usar-cada-modo"/>
     <w:p>
       <w:pPr>
         <w:pStyle w:val="Heading2"/>
@@ -29213,8 +29100,8 @@
         </w:pict>
       </w:r>
     </w:p>
-    <w:bookmarkEnd w:id="180"/>
-    <w:bookmarkStart w:id="181" w:name="mini-chequeo-12"/>
+    <w:bookmarkEnd w:id="189"/>
+    <w:bookmarkStart w:id="190" w:name="mini-chequeo-12"/>
     <w:p>
       <w:pPr>
         <w:pStyle w:val="Heading2"/>
@@ -29399,8 +29286,8 @@
         </w:pict>
       </w:r>
     </w:p>
-    <w:bookmarkEnd w:id="181"/>
-    <w:bookmarkStart w:id="182" w:name="resumen-en-3-frases-12"/>
+    <w:bookmarkEnd w:id="190"/>
+    <w:bookmarkStart w:id="191" w:name="resumen-en-3-frases-12"/>
     <w:p>
       <w:pPr>
         <w:pStyle w:val="Heading2"/>
@@ -29529,8 +29416,8 @@
         <w:t xml:space="preserve">para plug-and-play con DNS, el combo más usado hoy.</w:t>
       </w:r>
     </w:p>
-    <w:bookmarkEnd w:id="182"/>
-    <w:bookmarkStart w:id="183" w:name="vocabulario-rápido-12"/>
+    <w:bookmarkEnd w:id="191"/>
+    <w:bookmarkStart w:id="192" w:name="vocabulario-rápido-12"/>
     <w:p>
       <w:pPr>
         <w:pStyle w:val="Heading2"/>
@@ -29714,7 +29601,7 @@
       <w:r>
         <w:t xml:space="preserve"> </w:t>
       </w:r>
-      <w:hyperlink r:id="rId52">
+      <w:hyperlink r:id="rId55">
         <w:r>
           <w:rPr>
             <w:rStyle w:val="Hyperlink"/>
@@ -29777,9 +29664,9 @@
         </w:r>
       </w:hyperlink>
     </w:p>
-    <w:bookmarkEnd w:id="183"/>
-    <w:bookmarkEnd w:id="184"/>
-    <w:bookmarkStart w:id="193" w:name="icmpv6-y-ndp"/>
+    <w:bookmarkEnd w:id="192"/>
+    <w:bookmarkEnd w:id="193"/>
+    <w:bookmarkStart w:id="208" w:name="icmpv6-y-ndp"/>
     <w:p>
       <w:pPr>
         <w:pStyle w:val="Heading1"/>
@@ -29843,7 +29730,7 @@
         </w:pict>
       </w:r>
     </w:p>
-    <w:bookmarkStart w:id="185" w:name="la-idea-en-una-frase-13"/>
+    <w:bookmarkStart w:id="194" w:name="la-idea-en-una-frase-13"/>
     <w:p>
       <w:pPr>
         <w:pStyle w:val="Heading2"/>
@@ -29969,8 +29856,8 @@
         </w:pict>
       </w:r>
     </w:p>
-    <w:bookmarkEnd w:id="185"/>
-    <w:bookmarkStart w:id="186" w:name="la-tabla-de-traducción-ipv4-ipv6"/>
+    <w:bookmarkEnd w:id="194"/>
+    <w:bookmarkStart w:id="195" w:name="la-tabla-de-traducción-ipv4-ipv6"/>
     <w:p>
       <w:pPr>
         <w:pStyle w:val="Heading2"/>
@@ -30309,8 +30196,8 @@
         </w:pict>
       </w:r>
     </w:p>
-    <w:bookmarkEnd w:id="186"/>
-    <w:bookmarkStart w:id="187" w:name="ndp-ns-y-na-el-arp-nuevo"/>
+    <w:bookmarkEnd w:id="195"/>
+    <w:bookmarkStart w:id="199" w:name="ndp-ns-y-na-el-arp-nuevo"/>
     <w:p>
       <w:pPr>
         <w:pStyle w:val="Heading2"/>
@@ -30341,85 +30228,66 @@
     </w:p>
     <w:p>
       <w:pPr>
-        <w:pStyle w:val="SourceCode"/>
-      </w:pPr>
-      <w:r>
-        <w:rPr>
-          <w:rStyle w:val="VerbatimChar"/>
-        </w:rPr>
-        <w:t xml:space="preserve">PC-A (2001:DB8::10)                     PC-B (2001:DB8::20)</w:t>
-      </w:r>
-      <w:r>
-        <w:br/>
-      </w:r>
-      <w:r>
-        <w:rPr>
-          <w:rStyle w:val="VerbatimChar"/>
-        </w:rPr>
-        <w:t xml:space="preserve">        │ ① NS: "¿Quién tiene 2001:DB8::20?"      │</w:t>
-      </w:r>
-      <w:r>
-        <w:br/>
-      </w:r>
-      <w:r>
-        <w:rPr>
-          <w:rStyle w:val="VerbatimChar"/>
-        </w:rPr>
-        <w:t xml:space="preserve">        │      (multicast solicited-node)         │</w:t>
-      </w:r>
-      <w:r>
-        <w:br/>
-      </w:r>
-      <w:r>
-        <w:rPr>
-          <w:rStyle w:val="VerbatimChar"/>
-        </w:rPr>
-        <w:t xml:space="preserve">        │───────────────────────────────────────→  │</w:t>
-      </w:r>
-      <w:r>
-        <w:br/>
-      </w:r>
-      <w:r>
-        <w:rPr>
-          <w:rStyle w:val="VerbatimChar"/>
-        </w:rPr>
-        <w:t xml:space="preserve">        │                                         │</w:t>
-      </w:r>
-      <w:r>
-        <w:br/>
-      </w:r>
-      <w:r>
-        <w:rPr>
-          <w:rStyle w:val="VerbatimChar"/>
-        </w:rPr>
-        <w:t xml:space="preserve">        │ ② NA: "Yo, mi MAC es AA:BB:CC:DD:EE:FF" │</w:t>
-      </w:r>
-      <w:r>
-        <w:br/>
-      </w:r>
-      <w:r>
-        <w:rPr>
-          <w:rStyle w:val="VerbatimChar"/>
-        </w:rPr>
-        <w:t xml:space="preserve">        │      (unicast dirigido a PC-A)           │</w:t>
-      </w:r>
-      <w:r>
-        <w:br/>
-      </w:r>
-      <w:r>
-        <w:rPr>
-          <w:rStyle w:val="VerbatimChar"/>
-        </w:rPr>
-        <w:t xml:space="preserve">        │←───────────────────────────────────────  │</w:t>
-      </w:r>
-      <w:r>
-        <w:br/>
-      </w:r>
-      <w:r>
-        <w:rPr>
-          <w:rStyle w:val="VerbatimChar"/>
-        </w:rPr>
-        <w:t xml:space="preserve">        │   ¡Listo! Aprende la MAC y envía la IP   │</w:t>
+        <w:pStyle w:val="CaptionedFigure"/>
+      </w:pPr>
+      <w:r>
+        <w:drawing>
+          <wp:inline>
+            <wp:extent cx="5334000" cy="2661202"/>
+            <wp:effectExtent b="0" l="0" r="0" t="0"/>
+            <wp:docPr descr="Flujo NDP NS/NA: PC-A envía un Neighbor Solicitation a la multicast de nodo solicitado y PC-B responde con un Neighbor Advertisement en unicast con su MAC" title="" id="197" name="Picture"/>
+            <a:graphic>
+              <a:graphicData uri="http://schemas.openxmlformats.org/drawingml/2006/picture">
+                <pic:pic>
+                  <pic:nvPicPr>
+                    <pic:cNvPr descr="public/diagrams/u03-ndp-ns-na.svg" id="198" name="Picture"/>
+                    <pic:cNvPicPr>
+                      <a:picLocks noChangeArrowheads="1" noChangeAspect="1"/>
+                    </pic:cNvPicPr>
+                  </pic:nvPicPr>
+                  <pic:blipFill>
+                    <a:blip>
+                      <a:extLst>
+                        <a:ext uri="{28A0092B-C50C-407E-A947-70E740481C1C}">
+                          <a14:useLocalDpi xmlns:a14="http://schemas.microsoft.com/office/drawing/2010/main" val="0"/>
+                        </a:ext>
+                        <a:ext uri="{96DAC541-7B7A-43D3-8B79-37D633B846F1}">
+                          <asvg:svgBlip xmlns:asvg="http://schemas.microsoft.com/office/drawing/2016/SVG/main" r:embed="rId196"/>
+                        </a:ext>
+                      </a:extLst>
+                    </a:blip>
+                    <a:stretch>
+                      <a:fillRect/>
+                    </a:stretch>
+                  </pic:blipFill>
+                  <pic:spPr bwMode="auto">
+                    <a:xfrm>
+                      <a:off x="0" y="0"/>
+                      <a:ext cx="5334000" cy="2661202"/>
+                    </a:xfrm>
+                    <a:prstGeom prst="rect">
+                      <a:avLst/>
+                    </a:prstGeom>
+                    <a:noFill/>
+                    <a:ln w="9525">
+                      <a:noFill/>
+                      <a:headEnd/>
+                      <a:tailEnd/>
+                    </a:ln>
+                  </pic:spPr>
+                </pic:pic>
+              </a:graphicData>
+            </a:graphic>
+          </wp:inline>
+        </w:drawing>
+      </w:r>
+    </w:p>
+    <w:p>
+      <w:pPr>
+        <w:pStyle w:val="ImageCaption"/>
+      </w:pPr>
+      <w:r>
+        <w:t xml:space="preserve">Flujo NDP NS/NA: PC-A envía un Neighbor Solicitation a la multicast de nodo solicitado y PC-B responde con un Neighbor Advertisement en unicast con su MAC</w:t>
       </w:r>
     </w:p>
     <w:p>
@@ -30589,8 +30457,8 @@
         </w:pict>
       </w:r>
     </w:p>
-    <w:bookmarkEnd w:id="187"/>
-    <w:bookmarkStart w:id="188" w:name="rs-y-ra-descubrir-routers"/>
+    <w:bookmarkEnd w:id="199"/>
+    <w:bookmarkStart w:id="203" w:name="rs-y-ra-descubrir-routers"/>
     <w:p>
       <w:pPr>
         <w:pStyle w:val="Heading2"/>
@@ -30718,54 +30586,71 @@
     </w:p>
     <w:p>
       <w:pPr>
-        <w:pStyle w:val="SourceCode"/>
-      </w:pPr>
-      <w:r>
-        <w:rPr>
-          <w:rStyle w:val="VerbatimChar"/>
-        </w:rPr>
-        <w:t xml:space="preserve">PC al encenderse:</w:t>
-      </w:r>
-      <w:r>
-        <w:br/>
-      </w:r>
-      <w:r>
-        <w:rPr>
-          <w:rStyle w:val="VerbatimChar"/>
-        </w:rPr>
-        <w:t xml:space="preserve">  ① RS → "¿Hay algún router?"            (a FF02::2)</w:t>
-      </w:r>
-      <w:r>
-        <w:br/>
-      </w:r>
-      <w:r>
-        <w:rPr>
-          <w:rStyle w:val="VerbatimChar"/>
-        </w:rPr>
-        <w:t xml:space="preserve">  ② RA ← "Sí, prefijo 2001:DB8:1:2::/64,</w:t>
-      </w:r>
-      <w:r>
-        <w:br/>
-      </w:r>
-      <w:r>
-        <w:rPr>
-          <w:rStyle w:val="VerbatimChar"/>
-        </w:rPr>
-        <w:t xml:space="preserve">          M=0, O=1, RDNSS=2001:4860:4860::8888"</w:t>
-      </w:r>
-      <w:r>
-        <w:br/>
-      </w:r>
-      <w:r>
-        <w:rPr>
-          <w:rStyle w:val="VerbatimChar"/>
-        </w:rPr>
-        <w:t xml:space="preserve">  ③ PC configura GUA por SLAAC y gateway = FE80 del router</w:t>
-      </w:r>
-    </w:p>
-    <w:p>
-      <w:pPr>
-        <w:pStyle w:val="FirstParagraph"/>
+        <w:pStyle w:val="CaptionedFigure"/>
+      </w:pPr>
+      <w:r>
+        <w:drawing>
+          <wp:inline>
+            <wp:extent cx="5334000" cy="2951093"/>
+            <wp:effectExtent b="0" l="0" r="0" t="0"/>
+            <wp:docPr descr="Secuencia RS/RA: el PC recién encendido manda un Router Solicitation a FF02::2, el router responde con un Router Advertisement que lleva el prefijo y los flags, y el PC configura su GUA por SLAAC" title="" id="201" name="Picture"/>
+            <a:graphic>
+              <a:graphicData uri="http://schemas.openxmlformats.org/drawingml/2006/picture">
+                <pic:pic>
+                  <pic:nvPicPr>
+                    <pic:cNvPr descr="public/diagrams/u03-ndp-rs-ra.svg" id="202" name="Picture"/>
+                    <pic:cNvPicPr>
+                      <a:picLocks noChangeArrowheads="1" noChangeAspect="1"/>
+                    </pic:cNvPicPr>
+                  </pic:nvPicPr>
+                  <pic:blipFill>
+                    <a:blip>
+                      <a:extLst>
+                        <a:ext uri="{28A0092B-C50C-407E-A947-70E740481C1C}">
+                          <a14:useLocalDpi xmlns:a14="http://schemas.microsoft.com/office/drawing/2010/main" val="0"/>
+                        </a:ext>
+                        <a:ext uri="{96DAC541-7B7A-43D3-8B79-37D633B846F1}">
+                          <asvg:svgBlip xmlns:asvg="http://schemas.microsoft.com/office/drawing/2016/SVG/main" r:embed="rId200"/>
+                        </a:ext>
+                      </a:extLst>
+                    </a:blip>
+                    <a:stretch>
+                      <a:fillRect/>
+                    </a:stretch>
+                  </pic:blipFill>
+                  <pic:spPr bwMode="auto">
+                    <a:xfrm>
+                      <a:off x="0" y="0"/>
+                      <a:ext cx="5334000" cy="2951093"/>
+                    </a:xfrm>
+                    <a:prstGeom prst="rect">
+                      <a:avLst/>
+                    </a:prstGeom>
+                    <a:noFill/>
+                    <a:ln w="9525">
+                      <a:noFill/>
+                      <a:headEnd/>
+                      <a:tailEnd/>
+                    </a:ln>
+                  </pic:spPr>
+                </pic:pic>
+              </a:graphicData>
+            </a:graphic>
+          </wp:inline>
+        </w:drawing>
+      </w:r>
+    </w:p>
+    <w:p>
+      <w:pPr>
+        <w:pStyle w:val="ImageCaption"/>
+      </w:pPr>
+      <w:r>
+        <w:t xml:space="preserve">Secuencia RS/RA: el PC recién encendido manda un Router Solicitation a FF02::2, el router responde con un Router Advertisement que lleva el prefijo y los flags, y el PC configura su GUA por SLAAC</w:t>
+      </w:r>
+    </w:p>
+    <w:p>
+      <w:pPr>
+        <w:pStyle w:val="BodyText"/>
       </w:pPr>
       <w:r>
         <w:t xml:space="preserve">Este RA es el que vimos en</w:t>
@@ -30809,8 +30694,8 @@
         </w:pict>
       </w:r>
     </w:p>
-    <w:bookmarkEnd w:id="188"/>
-    <w:bookmarkStart w:id="189" w:name="multicast-sobre-broadcast-por-qué-gana"/>
+    <w:bookmarkEnd w:id="203"/>
+    <w:bookmarkStart w:id="204" w:name="multicast-sobre-broadcast-por-qué-gana"/>
     <w:p>
       <w:pPr>
         <w:pStyle w:val="Heading2"/>
@@ -30980,8 +30865,8 @@
         </w:pict>
       </w:r>
     </w:p>
-    <w:bookmarkEnd w:id="189"/>
-    <w:bookmarkStart w:id="190" w:name="mini-chequeo-13"/>
+    <w:bookmarkEnd w:id="204"/>
+    <w:bookmarkStart w:id="205" w:name="mini-chequeo-13"/>
     <w:p>
       <w:pPr>
         <w:pStyle w:val="Heading2"/>
@@ -31226,8 +31111,8 @@
         </w:pict>
       </w:r>
     </w:p>
-    <w:bookmarkEnd w:id="190"/>
-    <w:bookmarkStart w:id="191" w:name="resumen-en-3-frases-13"/>
+    <w:bookmarkEnd w:id="205"/>
+    <w:bookmarkStart w:id="206" w:name="resumen-en-3-frases-13"/>
     <w:p>
       <w:pPr>
         <w:pStyle w:val="Heading2"/>
@@ -31353,8 +31238,8 @@
         <w:t xml:space="preserve">hace el descubrimiento quirúrgico: solo responde quien corresponde.</w:t>
       </w:r>
     </w:p>
-    <w:bookmarkEnd w:id="191"/>
-    <w:bookmarkStart w:id="192" w:name="vocabulario-rápido-13"/>
+    <w:bookmarkEnd w:id="206"/>
+    <w:bookmarkStart w:id="207" w:name="vocabulario-rápido-13"/>
     <w:p>
       <w:pPr>
         <w:pStyle w:val="Heading2"/>
@@ -31584,7 +31469,7 @@
       <w:r>
         <w:t xml:space="preserve"> </w:t>
       </w:r>
-      <w:hyperlink r:id="rId52">
+      <w:hyperlink r:id="rId55">
         <w:r>
           <w:rPr>
             <w:rStyle w:val="Hyperlink"/>
@@ -31647,9 +31532,9 @@
         </w:r>
       </w:hyperlink>
     </w:p>
-    <w:bookmarkEnd w:id="192"/>
-    <w:bookmarkEnd w:id="193"/>
-    <w:bookmarkStart w:id="202" w:name="mecanismos-de-transición"/>
+    <w:bookmarkEnd w:id="207"/>
+    <w:bookmarkEnd w:id="208"/>
+    <w:bookmarkStart w:id="220" w:name="mecanismos-de-transición"/>
     <w:p>
       <w:pPr>
         <w:pStyle w:val="Heading1"/>
@@ -31713,7 +31598,7 @@
         </w:pict>
       </w:r>
     </w:p>
-    <w:bookmarkStart w:id="194" w:name="la-idea-en-una-frase-14"/>
+    <w:bookmarkStart w:id="212" w:name="la-idea-en-una-frase-14"/>
     <w:p>
       <w:pPr>
         <w:pStyle w:val="Heading2"/>
@@ -31784,6 +31669,70 @@
       </w:pPr>
       <w:r>
         <w:t xml:space="preserve">No hay un interruptor que apague IPv4. Los tres mecanismos conviven mientras la Internet entera migra poco a poco.</w:t>
+      </w:r>
+    </w:p>
+    <w:p>
+      <w:pPr>
+        <w:pStyle w:val="CaptionedFigure"/>
+      </w:pPr>
+      <w:r>
+        <w:drawing>
+          <wp:inline>
+            <wp:extent cx="5334000" cy="2053590"/>
+            <wp:effectExtent b="0" l="0" r="0" t="0"/>
+            <wp:docPr descr="Los tres mecanismos de transición IPv4 a IPv6: Dual Stack (las dos pilas a la vez), túnel (IPv6 dentro de IPv4) y NAT64/DNS64 (traducción entre familias)" title="" id="210" name="Picture"/>
+            <a:graphic>
+              <a:graphicData uri="http://schemas.openxmlformats.org/drawingml/2006/picture">
+                <pic:pic>
+                  <pic:nvPicPr>
+                    <pic:cNvPr descr="public/diagrams/u03-transicion.svg" id="211" name="Picture"/>
+                    <pic:cNvPicPr>
+                      <a:picLocks noChangeArrowheads="1" noChangeAspect="1"/>
+                    </pic:cNvPicPr>
+                  </pic:nvPicPr>
+                  <pic:blipFill>
+                    <a:blip>
+                      <a:extLst>
+                        <a:ext uri="{28A0092B-C50C-407E-A947-70E740481C1C}">
+                          <a14:useLocalDpi xmlns:a14="http://schemas.microsoft.com/office/drawing/2010/main" val="0"/>
+                        </a:ext>
+                        <a:ext uri="{96DAC541-7B7A-43D3-8B79-37D633B846F1}">
+                          <asvg:svgBlip xmlns:asvg="http://schemas.microsoft.com/office/drawing/2016/SVG/main" r:embed="rId209"/>
+                        </a:ext>
+                      </a:extLst>
+                    </a:blip>
+                    <a:stretch>
+                      <a:fillRect/>
+                    </a:stretch>
+                  </pic:blipFill>
+                  <pic:spPr bwMode="auto">
+                    <a:xfrm>
+                      <a:off x="0" y="0"/>
+                      <a:ext cx="5334000" cy="2053590"/>
+                    </a:xfrm>
+                    <a:prstGeom prst="rect">
+                      <a:avLst/>
+                    </a:prstGeom>
+                    <a:noFill/>
+                    <a:ln w="9525">
+                      <a:noFill/>
+                      <a:headEnd/>
+                      <a:tailEnd/>
+                    </a:ln>
+                  </pic:spPr>
+                </pic:pic>
+              </a:graphicData>
+            </a:graphic>
+          </wp:inline>
+        </w:drawing>
+      </w:r>
+    </w:p>
+    <w:p>
+      <w:pPr>
+        <w:pStyle w:val="ImageCaption"/>
+      </w:pPr>
+      <w:r>
+        <w:t xml:space="preserve">Los tres mecanismos de transición IPv4 a IPv6: Dual Stack (las dos pilas a la vez), túnel (IPv6 dentro de IPv4) y NAT64/DNS64 (traducción entre familias)</w:t>
       </w:r>
     </w:p>
     <w:p>
@@ -31793,8 +31742,8 @@
         </w:pict>
       </w:r>
     </w:p>
-    <w:bookmarkEnd w:id="194"/>
-    <w:bookmarkStart w:id="196" w:name="X2cba674a07035b2edd1988ff52869d9c7bbd986"/>
+    <w:bookmarkEnd w:id="212"/>
+    <w:bookmarkStart w:id="214" w:name="X2cba674a07035b2edd1988ff52869d9c7bbd986"/>
     <w:p>
       <w:pPr>
         <w:pStyle w:val="Heading2"/>
@@ -32055,7 +32004,7 @@
       <w:r>
         <w:t xml:space="preserve"> </w:t>
       </w:r>
-      <w:hyperlink r:id="rId195">
+      <w:hyperlink r:id="rId213">
         <w:r>
           <w:rPr>
             <w:rStyle w:val="Hyperlink"/>
@@ -32077,8 +32026,8 @@
         </w:pict>
       </w:r>
     </w:p>
-    <w:bookmarkEnd w:id="196"/>
-    <w:bookmarkStart w:id="197" w:name="túneles-ipv6-dentro-de-ipv4"/>
+    <w:bookmarkEnd w:id="214"/>
+    <w:bookmarkStart w:id="215" w:name="túneles-ipv6-dentro-de-ipv4"/>
     <w:p>
       <w:pPr>
         <w:pStyle w:val="Heading2"/>
@@ -32417,8 +32366,8 @@
         </w:pict>
       </w:r>
     </w:p>
-    <w:bookmarkEnd w:id="197"/>
-    <w:bookmarkStart w:id="198" w:name="nat64-dns64-el-puente-para-solo-ipv6"/>
+    <w:bookmarkEnd w:id="215"/>
+    <w:bookmarkStart w:id="216" w:name="nat64-dns64-el-puente-para-solo-ipv6"/>
     <w:p>
       <w:pPr>
         <w:pStyle w:val="Heading2"/>
@@ -32665,8 +32614,8 @@
         </w:pict>
       </w:r>
     </w:p>
-    <w:bookmarkEnd w:id="198"/>
-    <w:bookmarkStart w:id="199" w:name="mini-chequeo-14"/>
+    <w:bookmarkEnd w:id="216"/>
+    <w:bookmarkStart w:id="217" w:name="mini-chequeo-14"/>
     <w:p>
       <w:pPr>
         <w:pStyle w:val="Heading2"/>
@@ -32852,8 +32801,8 @@
         </w:pict>
       </w:r>
     </w:p>
-    <w:bookmarkEnd w:id="199"/>
-    <w:bookmarkStart w:id="200" w:name="resumen-en-3-frases-14"/>
+    <w:bookmarkEnd w:id="217"/>
+    <w:bookmarkStart w:id="218" w:name="resumen-en-3-frases-14"/>
     <w:p>
       <w:pPr>
         <w:pStyle w:val="Heading2"/>
@@ -32934,8 +32883,8 @@
         <w:t xml:space="preserve">permiten que una red solo-IPv6 acceda a servicios solo-IPv4 traduciendo el tráfico.</w:t>
       </w:r>
     </w:p>
-    <w:bookmarkEnd w:id="200"/>
-    <w:bookmarkStart w:id="201" w:name="vocabulario-rápido-14"/>
+    <w:bookmarkEnd w:id="218"/>
+    <w:bookmarkStart w:id="219" w:name="vocabulario-rápido-14"/>
     <w:p>
       <w:pPr>
         <w:pStyle w:val="Heading2"/>
@@ -33144,7 +33093,7 @@
       <w:r>
         <w:t xml:space="preserve"> </w:t>
       </w:r>
-      <w:hyperlink r:id="rId52">
+      <w:hyperlink r:id="rId55">
         <w:r>
           <w:rPr>
             <w:rStyle w:val="Hyperlink"/>
@@ -33207,9 +33156,9 @@
         </w:r>
       </w:hyperlink>
     </w:p>
-    <w:bookmarkEnd w:id="201"/>
-    <w:bookmarkEnd w:id="202"/>
-    <w:bookmarkStart w:id="211" w:name="configuración-ipv6"/>
+    <w:bookmarkEnd w:id="219"/>
+    <w:bookmarkEnd w:id="220"/>
+    <w:bookmarkStart w:id="229" w:name="configuración-ipv6"/>
     <w:p>
       <w:pPr>
         <w:pStyle w:val="Heading1"/>
@@ -33273,7 +33222,7 @@
         </w:pict>
       </w:r>
     </w:p>
-    <w:bookmarkStart w:id="203" w:name="la-idea-en-una-frase-15"/>
+    <w:bookmarkStart w:id="221" w:name="la-idea-en-una-frase-15"/>
     <w:p>
       <w:pPr>
         <w:pStyle w:val="Heading2"/>
@@ -33391,8 +33340,8 @@
         </w:pict>
       </w:r>
     </w:p>
-    <w:bookmarkEnd w:id="203"/>
-    <w:bookmarkStart w:id="204" w:name="configurar-un-pc-con-ipv6-estático"/>
+    <w:bookmarkEnd w:id="221"/>
+    <w:bookmarkStart w:id="222" w:name="configurar-un-pc-con-ipv6-estático"/>
     <w:p>
       <w:pPr>
         <w:pStyle w:val="Heading2"/>
@@ -33650,8 +33599,8 @@
         </w:pict>
       </w:r>
     </w:p>
-    <w:bookmarkEnd w:id="204"/>
-    <w:bookmarkStart w:id="205" w:name="configurar-un-router-cisco-con-ipv6"/>
+    <w:bookmarkEnd w:id="222"/>
+    <w:bookmarkStart w:id="223" w:name="configurar-un-router-cisco-con-ipv6"/>
     <w:p>
       <w:pPr>
         <w:pStyle w:val="Heading2"/>
@@ -33899,8 +33848,8 @@
         </w:pict>
       </w:r>
     </w:p>
-    <w:bookmarkEnd w:id="205"/>
-    <w:bookmarkStart w:id="206" w:name="verificación-los-comandos-que-dan-vida"/>
+    <w:bookmarkEnd w:id="223"/>
+    <w:bookmarkStart w:id="224" w:name="verificación-los-comandos-que-dan-vida"/>
     <w:p>
       <w:pPr>
         <w:pStyle w:val="Heading2"/>
@@ -34190,8 +34139,8 @@
         </w:pict>
       </w:r>
     </w:p>
-    <w:bookmarkEnd w:id="206"/>
-    <w:bookmarkStart w:id="207" w:name="y-en-packet-tracer"/>
+    <w:bookmarkEnd w:id="224"/>
+    <w:bookmarkStart w:id="225" w:name="y-en-packet-tracer"/>
     <w:p>
       <w:pPr>
         <w:pStyle w:val="Heading2"/>
@@ -34399,8 +34348,8 @@
         </w:pict>
       </w:r>
     </w:p>
-    <w:bookmarkEnd w:id="207"/>
-    <w:bookmarkStart w:id="208" w:name="mini-chequeo-15"/>
+    <w:bookmarkEnd w:id="225"/>
+    <w:bookmarkStart w:id="226" w:name="mini-chequeo-15"/>
     <w:p>
       <w:pPr>
         <w:pStyle w:val="Heading2"/>
@@ -34611,8 +34560,8 @@
         </w:pict>
       </w:r>
     </w:p>
-    <w:bookmarkEnd w:id="208"/>
-    <w:bookmarkStart w:id="209" w:name="resumen-en-3-frases-15"/>
+    <w:bookmarkEnd w:id="226"/>
+    <w:bookmarkStart w:id="227" w:name="resumen-en-3-frases-15"/>
     <w:p>
       <w:pPr>
         <w:pStyle w:val="Heading2"/>
@@ -34785,8 +34734,8 @@
         <w:t xml:space="preserve">; en Packet Tracer el flujo es idéntico.</w:t>
       </w:r>
     </w:p>
-    <w:bookmarkEnd w:id="209"/>
-    <w:bookmarkStart w:id="210" w:name="vocabulario-rápido-15"/>
+    <w:bookmarkEnd w:id="227"/>
+    <w:bookmarkStart w:id="228" w:name="vocabulario-rápido-15"/>
     <w:p>
       <w:pPr>
         <w:pStyle w:val="Heading2"/>
@@ -34998,7 +34947,7 @@
       <w:r>
         <w:t xml:space="preserve"> </w:t>
       </w:r>
-      <w:hyperlink r:id="rId52">
+      <w:hyperlink r:id="rId55">
         <w:r>
           <w:rPr>
             <w:rStyle w:val="Hyperlink"/>
@@ -35061,9 +35010,9 @@
         </w:r>
       </w:hyperlink>
     </w:p>
-    <w:bookmarkEnd w:id="210"/>
-    <w:bookmarkEnd w:id="211"/>
-    <w:bookmarkStart w:id="222" w:name="ipv8-la-propuesta-sin-rfc"/>
+    <w:bookmarkEnd w:id="228"/>
+    <w:bookmarkEnd w:id="229"/>
+    <w:bookmarkStart w:id="240" w:name="ipv8-la-propuesta-sin-rfc"/>
     <w:p>
       <w:pPr>
         <w:pStyle w:val="Heading1"/>
@@ -35127,7 +35076,7 @@
         </w:pict>
       </w:r>
     </w:p>
-    <w:bookmarkStart w:id="212" w:name="la-idea-en-una-frase-16"/>
+    <w:bookmarkStart w:id="230" w:name="la-idea-en-una-frase-16"/>
     <w:p>
       <w:pPr>
         <w:pStyle w:val="Heading2"/>
@@ -35322,8 +35271,8 @@
         </w:pict>
       </w:r>
     </w:p>
-    <w:bookmarkEnd w:id="212"/>
-    <w:bookmarkStart w:id="215" w:name="X02d22b18de6f52a5159db65d11a30636d2ee054"/>
+    <w:bookmarkEnd w:id="230"/>
+    <w:bookmarkStart w:id="233" w:name="X02d22b18de6f52a5159db65d11a30636d2ee054"/>
     <w:p>
       <w:pPr>
         <w:pStyle w:val="Heading2"/>
@@ -35970,7 +35919,7 @@
       <w:r>
         <w:t xml:space="preserve"> </w:t>
       </w:r>
-      <w:hyperlink r:id="rId213">
+      <w:hyperlink r:id="rId231">
         <w:r>
           <w:rPr>
             <w:rStyle w:val="Hyperlink"/>
@@ -35987,7 +35936,7 @@
       <w:r>
         <w:t xml:space="preserve"> </w:t>
       </w:r>
-      <w:hyperlink r:id="rId214">
+      <w:hyperlink r:id="rId232">
         <w:r>
           <w:rPr>
             <w:rStyle w:val="Hyperlink"/>
@@ -36006,8 +35955,8 @@
         </w:pict>
       </w:r>
     </w:p>
-    <w:bookmarkEnd w:id="215"/>
-    <w:bookmarkStart w:id="216" w:name="cómo-se-construye-una-dirección-ipv8"/>
+    <w:bookmarkEnd w:id="233"/>
+    <w:bookmarkStart w:id="234" w:name="cómo-se-construye-una-dirección-ipv8"/>
     <w:p>
       <w:pPr>
         <w:pStyle w:val="Heading2"/>
@@ -36326,8 +36275,8 @@
         </w:pict>
       </w:r>
     </w:p>
-    <w:bookmarkEnd w:id="216"/>
-    <w:bookmarkStart w:id="217" w:name="la-transición-que-propone-arp8-y-el-8to4"/>
+    <w:bookmarkEnd w:id="234"/>
+    <w:bookmarkStart w:id="235" w:name="la-transición-que-propone-arp8-y-el-8to4"/>
     <w:p>
       <w:pPr>
         <w:pStyle w:val="Heading2"/>
@@ -36641,8 +36590,8 @@
         </w:pict>
       </w:r>
     </w:p>
-    <w:bookmarkEnd w:id="217"/>
-    <w:bookmarkStart w:id="218" w:name="Xb1bc8e2ca78b3633ae315ab370b1f1ec88cb01f"/>
+    <w:bookmarkEnd w:id="235"/>
+    <w:bookmarkStart w:id="236" w:name="Xb1bc8e2ca78b3633ae315ab370b1f1ec88cb01f"/>
     <w:p>
       <w:pPr>
         <w:pStyle w:val="Heading2"/>
@@ -36917,8 +36866,8 @@
         </w:pict>
       </w:r>
     </w:p>
-    <w:bookmarkEnd w:id="218"/>
-    <w:bookmarkStart w:id="219" w:name="mini-chequeo-16"/>
+    <w:bookmarkEnd w:id="236"/>
+    <w:bookmarkStart w:id="237" w:name="mini-chequeo-16"/>
     <w:p>
       <w:pPr>
         <w:pStyle w:val="Heading2"/>
@@ -37114,8 +37063,8 @@
         </w:pict>
       </w:r>
     </w:p>
-    <w:bookmarkEnd w:id="219"/>
-    <w:bookmarkStart w:id="220" w:name="resumen-en-3-frases-16"/>
+    <w:bookmarkEnd w:id="237"/>
+    <w:bookmarkStart w:id="238" w:name="resumen-en-3-frases-16"/>
     <w:p>
       <w:pPr>
         <w:pStyle w:val="Heading2"/>
@@ -37205,8 +37154,8 @@
         <w:t xml:space="preserve">, individual y caducable; leerlo con criterio es parte del oficio.</w:t>
       </w:r>
     </w:p>
-    <w:bookmarkEnd w:id="220"/>
-    <w:bookmarkStart w:id="221" w:name="vocabulario-rápido-16"/>
+    <w:bookmarkEnd w:id="238"/>
+    <w:bookmarkStart w:id="239" w:name="vocabulario-rápido-16"/>
     <w:p>
       <w:pPr>
         <w:pStyle w:val="Heading2"/>
@@ -37432,7 +37381,7 @@
       <w:r>
         <w:t xml:space="preserve"> </w:t>
       </w:r>
-      <w:hyperlink r:id="rId52">
+      <w:hyperlink r:id="rId55">
         <w:r>
           <w:rPr>
             <w:rStyle w:val="Hyperlink"/>
@@ -37495,9 +37444,9 @@
         </w:r>
       </w:hyperlink>
     </w:p>
-    <w:bookmarkEnd w:id="221"/>
-    <w:bookmarkEnd w:id="222"/>
-    <w:bookmarkStart w:id="235" w:name="cierre-consolida-lo-aprendido"/>
+    <w:bookmarkEnd w:id="239"/>
+    <w:bookmarkEnd w:id="240"/>
+    <w:bookmarkStart w:id="253" w:name="cierre-consolida-lo-aprendido"/>
     <w:p>
       <w:pPr>
         <w:pStyle w:val="Heading1"/>
@@ -37593,7 +37542,7 @@
         </w:pict>
       </w:r>
     </w:p>
-    <w:bookmarkStart w:id="223" w:name="sé-el-paquete"/>
+    <w:bookmarkStart w:id="241" w:name="sé-el-paquete"/>
     <w:p>
       <w:pPr>
         <w:pStyle w:val="Heading2"/>
@@ -37818,8 +37767,8 @@
         </w:pict>
       </w:r>
     </w:p>
-    <w:bookmarkEnd w:id="223"/>
-    <w:bookmarkStart w:id="224" w:name="fireside-chat-ip-pública-vs-ip-privada"/>
+    <w:bookmarkEnd w:id="241"/>
+    <w:bookmarkStart w:id="242" w:name="fireside-chat-ip-pública-vs-ip-privada"/>
     <w:p>
       <w:pPr>
         <w:pStyle w:val="Heading2"/>
@@ -38066,8 +38015,8 @@
         </w:pict>
       </w:r>
     </w:p>
-    <w:bookmarkEnd w:id="224"/>
-    <w:bookmarkStart w:id="225" w:name="quién-soy"/>
+    <w:bookmarkEnd w:id="242"/>
+    <w:bookmarkStart w:id="243" w:name="quién-soy"/>
     <w:p>
       <w:pPr>
         <w:pStyle w:val="Heading2"/>
@@ -38304,8 +38253,8 @@
         </w:pict>
       </w:r>
     </w:p>
-    <w:bookmarkEnd w:id="225"/>
-    <w:bookmarkStart w:id="226" w:name="conrad-vs-el-mundo-subnetting"/>
+    <w:bookmarkEnd w:id="243"/>
+    <w:bookmarkStart w:id="244" w:name="conrad-vs-el-mundo-subnetting"/>
     <w:p>
       <w:pPr>
         <w:pStyle w:val="Heading2"/>
@@ -38456,8 +38405,8 @@
         </w:pict>
       </w:r>
     </w:p>
-    <w:bookmarkEnd w:id="226"/>
-    <w:bookmarkStart w:id="227" w:name="X6dec93b1bd1cbbdc10676eb2e26d811f01544ae"/>
+    <w:bookmarkEnd w:id="244"/>
+    <w:bookmarkStart w:id="245" w:name="X6dec93b1bd1cbbdc10676eb2e26d811f01544ae"/>
     <w:p>
       <w:pPr>
         <w:pStyle w:val="Heading2"/>
@@ -39326,8 +39275,8 @@
         </w:pict>
       </w:r>
     </w:p>
-    <w:bookmarkEnd w:id="227"/>
-    <w:bookmarkStart w:id="228" w:name="logros-de-esta-unidad"/>
+    <w:bookmarkEnd w:id="245"/>
+    <w:bookmarkStart w:id="246" w:name="logros-de-esta-unidad"/>
     <w:p>
       <w:pPr>
         <w:pStyle w:val="Heading2"/>
@@ -39518,8 +39467,8 @@
         </w:pict>
       </w:r>
     </w:p>
-    <w:bookmarkEnd w:id="228"/>
-    <w:bookmarkStart w:id="229" w:name="atrévete-a-pensar"/>
+    <w:bookmarkEnd w:id="246"/>
+    <w:bookmarkStart w:id="247" w:name="atrévete-a-pensar"/>
     <w:p>
       <w:pPr>
         <w:pStyle w:val="Heading2"/>
@@ -39857,8 +39806,8 @@
         </w:pict>
       </w:r>
     </w:p>
-    <w:bookmarkEnd w:id="229"/>
-    <w:bookmarkStart w:id="230" w:name="crucigrama-de-bits"/>
+    <w:bookmarkEnd w:id="247"/>
+    <w:bookmarkStart w:id="248" w:name="crucigrama-de-bits"/>
     <w:p>
       <w:pPr>
         <w:pStyle w:val="Heading2"/>
@@ -40011,8 +39960,8 @@
         </w:pict>
       </w:r>
     </w:p>
-    <w:bookmarkEnd w:id="230"/>
-    <w:bookmarkStart w:id="231" w:name="preguntas-de-entrevista-de-trabajo"/>
+    <w:bookmarkEnd w:id="248"/>
+    <w:bookmarkStart w:id="249" w:name="preguntas-de-entrevista-de-trabajo"/>
     <w:p>
       <w:pPr>
         <w:pStyle w:val="Heading2"/>
@@ -40160,8 +40109,8 @@
         </w:pict>
       </w:r>
     </w:p>
-    <w:bookmarkEnd w:id="231"/>
-    <w:bookmarkStart w:id="232" w:name="no-hay-preguntas-tontas"/>
+    <w:bookmarkEnd w:id="249"/>
+    <w:bookmarkStart w:id="250" w:name="no-hay-preguntas-tontas"/>
     <w:p>
       <w:pPr>
         <w:pStyle w:val="Heading2"/>
@@ -40325,8 +40274,8 @@
         </w:pict>
       </w:r>
     </w:p>
-    <w:bookmarkEnd w:id="232"/>
-    <w:bookmarkStart w:id="233" w:name="poscréditos"/>
+    <w:bookmarkEnd w:id="250"/>
+    <w:bookmarkStart w:id="251" w:name="poscréditos"/>
     <w:p>
       <w:pPr>
         <w:pStyle w:val="Heading2"/>
@@ -40384,8 +40333,8 @@
         </w:pict>
       </w:r>
     </w:p>
-    <w:bookmarkEnd w:id="233"/>
-    <w:bookmarkStart w:id="234" w:name="X13c4304ac1b63119c8abde198862dc2c71c987c"/>
+    <w:bookmarkEnd w:id="251"/>
+    <w:bookmarkStart w:id="252" w:name="X13c4304ac1b63119c8abde198862dc2c71c987c"/>
     <w:p>
       <w:pPr>
         <w:pStyle w:val="Heading2"/>
@@ -40649,7 +40598,7 @@
       <w:r>
         <w:t xml:space="preserve"> </w:t>
       </w:r>
-      <w:hyperlink r:id="rId52">
+      <w:hyperlink r:id="rId55">
         <w:r>
           <w:rPr>
             <w:rStyle w:val="Hyperlink"/>
@@ -40712,8 +40661,8 @@
         </w:r>
       </w:hyperlink>
     </w:p>
-    <w:bookmarkEnd w:id="234"/>
-    <w:bookmarkEnd w:id="235"/>
+    <w:bookmarkEnd w:id="252"/>
+    <w:bookmarkEnd w:id="253"/>
     <w:sectPr>
       <w:footnotePr>
         <w:numRestart w:val="eachSect"/>

</xml_diff>